<commit_message>
Atualização no guia de usuario
</commit_message>
<xml_diff>
--- a/docs/Guia-Usuario/Guia-do-Usuario.docx
+++ b/docs/Guia-Usuario/Guia-do-Usuario.docx
@@ -624,25 +624,7 @@
           <w:kern w:val="0"/>
           <w14:ligatures w14:val="none"/>
         </w:rPr>
-        <w:t xml:space="preserve"> as </w:t>
-      </w:r>
-      <w:r>
-        <w:rPr>
-          <w:rFonts w:ascii="Arial" w:eastAsia="Times New Roman" w:hAnsi="Arial" w:cs="Arial"/>
-          <w:color w:val="000000"/>
-          <w:kern w:val="0"/>
-          <w14:ligatures w14:val="none"/>
-        </w:rPr>
-        <w:t xml:space="preserve">informações </w:t>
-      </w:r>
-      <w:r>
-        <w:rPr>
-          <w:rFonts w:ascii="Arial" w:eastAsia="Times New Roman" w:hAnsi="Arial" w:cs="Arial"/>
-          <w:color w:val="000000"/>
-          <w:kern w:val="0"/>
-          <w14:ligatures w14:val="none"/>
-        </w:rPr>
-        <w:t>técnicas necessárias para seu bom uso</w:t>
+        <w:t xml:space="preserve"> as informações técnicas necessárias para seu bom uso</w:t>
       </w:r>
       <w:r>
         <w:rPr>
@@ -1031,19 +1013,331 @@
         </w:rPr>
         <w:t xml:space="preserve">Dessa forma, </w:t>
       </w:r>
+      <w:r>
+        <w:rPr>
+          <w:rFonts w:ascii="Arial" w:eastAsia="Times New Roman" w:hAnsi="Arial" w:cs="Arial"/>
+          <w:color w:val="000000"/>
+          <w:kern w:val="0"/>
+          <w14:ligatures w14:val="none"/>
+        </w:rPr>
+        <w:t>a solução proposta busca resolver o problema</w:t>
+      </w:r>
+      <w:r>
+        <w:rPr>
+          <w:rFonts w:ascii="Arial" w:eastAsia="Times New Roman" w:hAnsi="Arial" w:cs="Arial"/>
+          <w:color w:val="000000"/>
+          <w:kern w:val="0"/>
+          <w14:ligatures w14:val="none"/>
+        </w:rPr>
+        <w:t xml:space="preserve"> enfrentado pelos alunos e gestores ao proporcionar um novo canal </w:t>
+      </w:r>
+      <w:r>
+        <w:rPr>
+          <w:rFonts w:ascii="Arial" w:eastAsia="Times New Roman" w:hAnsi="Arial" w:cs="Arial"/>
+          <w:color w:val="000000"/>
+          <w:kern w:val="0"/>
+          <w14:ligatures w14:val="none"/>
+        </w:rPr>
+        <w:t xml:space="preserve">de comunicação </w:t>
+      </w:r>
+      <w:r>
+        <w:rPr>
+          <w:rFonts w:ascii="Arial" w:eastAsia="Times New Roman" w:hAnsi="Arial" w:cs="Arial"/>
+          <w:color w:val="000000"/>
+          <w:kern w:val="0"/>
+          <w14:ligatures w14:val="none"/>
+        </w:rPr>
+        <w:t xml:space="preserve">que é rápido, intuitivo e moderno para a escola. Trazendo assim, mais eficiência, comodidade e bem-estar para </w:t>
+      </w:r>
+      <w:r>
+        <w:rPr>
+          <w:rFonts w:ascii="Arial" w:eastAsia="Times New Roman" w:hAnsi="Arial" w:cs="Arial"/>
+          <w:color w:val="000000"/>
+          <w:kern w:val="0"/>
+          <w14:ligatures w14:val="none"/>
+        </w:rPr>
+        <w:t xml:space="preserve">todas as </w:t>
+      </w:r>
+      <w:r>
+        <w:rPr>
+          <w:rFonts w:ascii="Arial" w:eastAsia="Times New Roman" w:hAnsi="Arial" w:cs="Arial"/>
+          <w:color w:val="000000"/>
+          <w:kern w:val="0"/>
+          <w14:ligatures w14:val="none"/>
+        </w:rPr>
+        <w:t>partes envolvidas.</w:t>
+      </w:r>
     </w:p>
     <w:p>
       <w:pPr>
         <w:spacing w:after="0" w:line="360" w:lineRule="auto"/>
         <w:ind w:firstLine="709"/>
-        <w:jc w:val="both"/>
-        <w:rPr>
-          <w:rFonts w:ascii="Arial" w:eastAsia="Times New Roman" w:hAnsi="Arial" w:cs="Arial"/>
-          <w:color w:val="000000"/>
-          <w:kern w:val="0"/>
-          <w14:ligatures w14:val="none"/>
-        </w:rPr>
-      </w:pPr>
+        <w:rPr>
+          <w:rFonts w:ascii="Arial" w:eastAsia="Times New Roman" w:hAnsi="Arial" w:cs="Arial"/>
+          <w:color w:val="000000"/>
+          <w:kern w:val="0"/>
+          <w14:ligatures w14:val="none"/>
+        </w:rPr>
+      </w:pPr>
+      <w:r>
+        <w:rPr>
+          <w:rFonts w:ascii="Arial" w:eastAsia="Times New Roman" w:hAnsi="Arial" w:cs="Arial"/>
+          <w:color w:val="000000"/>
+          <w:kern w:val="0"/>
+          <w14:ligatures w14:val="none"/>
+        </w:rPr>
+        <w:br w:type="page"/>
+      </w:r>
+    </w:p>
+    <w:p>
+      <w:pPr>
+        <w:spacing w:after="0" w:line="360" w:lineRule="auto"/>
+        <w:jc w:val="both"/>
+        <w:rPr>
+          <w:rFonts w:ascii="Arial" w:eastAsia="Times New Roman" w:hAnsi="Arial" w:cs="Arial"/>
+          <w:b/>
+          <w:bCs/>
+          <w:color w:val="000000"/>
+          <w:kern w:val="0"/>
+          <w14:ligatures w14:val="none"/>
+        </w:rPr>
+      </w:pPr>
+      <w:r>
+        <w:rPr>
+          <w:rFonts w:ascii="Arial" w:eastAsia="Times New Roman" w:hAnsi="Arial" w:cs="Arial"/>
+          <w:b/>
+          <w:bCs/>
+          <w:color w:val="000000"/>
+          <w:kern w:val="0"/>
+          <w14:ligatures w14:val="none"/>
+        </w:rPr>
+        <w:lastRenderedPageBreak/>
+        <w:t xml:space="preserve">CAPÍTULO </w:t>
+      </w:r>
+      <w:r>
+        <w:rPr>
+          <w:rFonts w:ascii="Arial" w:eastAsia="Times New Roman" w:hAnsi="Arial" w:cs="Arial"/>
+          <w:b/>
+          <w:bCs/>
+          <w:color w:val="000000"/>
+          <w:kern w:val="0"/>
+          <w14:ligatures w14:val="none"/>
+        </w:rPr>
+        <w:t>2</w:t>
+      </w:r>
+      <w:r>
+        <w:rPr>
+          <w:rFonts w:ascii="Arial" w:eastAsia="Times New Roman" w:hAnsi="Arial" w:cs="Arial"/>
+          <w:b/>
+          <w:bCs/>
+          <w:color w:val="000000"/>
+          <w:kern w:val="0"/>
+          <w14:ligatures w14:val="none"/>
+        </w:rPr>
+        <w:t xml:space="preserve"> – </w:t>
+      </w:r>
+      <w:r>
+        <w:rPr>
+          <w:rFonts w:ascii="Arial" w:eastAsia="Times New Roman" w:hAnsi="Arial" w:cs="Arial"/>
+          <w:b/>
+          <w:bCs/>
+          <w:color w:val="000000"/>
+          <w:kern w:val="0"/>
+          <w14:ligatures w14:val="none"/>
+        </w:rPr>
+        <w:t>PRIMEIROS PASSOS</w:t>
+      </w:r>
+    </w:p>
+    <w:p>
+      <w:pPr>
+        <w:spacing w:after="0" w:line="360" w:lineRule="auto"/>
+        <w:jc w:val="both"/>
+        <w:rPr>
+          <w:rFonts w:ascii="Arial" w:eastAsia="Times New Roman" w:hAnsi="Arial" w:cs="Arial"/>
+          <w:b/>
+          <w:bCs/>
+          <w:color w:val="000000"/>
+          <w:kern w:val="0"/>
+          <w14:ligatures w14:val="none"/>
+        </w:rPr>
+      </w:pPr>
+    </w:p>
+    <w:p>
+      <w:pPr>
+        <w:rPr>
+          <w:rFonts w:ascii="Arial" w:eastAsia="Times New Roman" w:hAnsi="Arial" w:cs="Arial"/>
+          <w:b/>
+          <w:bCs/>
+          <w:color w:val="000000"/>
+          <w:kern w:val="0"/>
+          <w14:ligatures w14:val="none"/>
+        </w:rPr>
+      </w:pPr>
+      <w:r>
+        <w:rPr>
+          <w:rFonts w:ascii="Arial" w:eastAsia="Times New Roman" w:hAnsi="Arial" w:cs="Arial"/>
+          <w:b/>
+          <w:bCs/>
+          <w:color w:val="000000"/>
+          <w:kern w:val="0"/>
+          <w14:ligatures w14:val="none"/>
+        </w:rPr>
+        <w:br w:type="page"/>
+      </w:r>
+    </w:p>
+    <w:p>
+      <w:pPr>
+        <w:spacing w:after="0" w:line="360" w:lineRule="auto"/>
+        <w:jc w:val="both"/>
+        <w:rPr>
+          <w:rFonts w:ascii="Arial" w:eastAsia="Times New Roman" w:hAnsi="Arial" w:cs="Arial"/>
+          <w:b/>
+          <w:bCs/>
+          <w:color w:val="000000"/>
+          <w:kern w:val="0"/>
+          <w14:ligatures w14:val="none"/>
+        </w:rPr>
+      </w:pPr>
+      <w:r>
+        <w:rPr>
+          <w:rFonts w:ascii="Arial" w:eastAsia="Times New Roman" w:hAnsi="Arial" w:cs="Arial"/>
+          <w:b/>
+          <w:bCs/>
+          <w:color w:val="000000"/>
+          <w:kern w:val="0"/>
+          <w14:ligatures w14:val="none"/>
+        </w:rPr>
+        <w:lastRenderedPageBreak/>
+        <w:t xml:space="preserve">CAPÍTULO </w:t>
+      </w:r>
+      <w:r>
+        <w:rPr>
+          <w:rFonts w:ascii="Arial" w:eastAsia="Times New Roman" w:hAnsi="Arial" w:cs="Arial"/>
+          <w:b/>
+          <w:bCs/>
+          <w:color w:val="000000"/>
+          <w:kern w:val="0"/>
+          <w14:ligatures w14:val="none"/>
+        </w:rPr>
+        <w:t>3 – CONHECENDO A INTERFACE</w:t>
+      </w:r>
+    </w:p>
+    <w:p>
+      <w:pPr>
+        <w:spacing w:after="0" w:line="360" w:lineRule="auto"/>
+        <w:jc w:val="both"/>
+        <w:rPr>
+          <w:rFonts w:ascii="Arial" w:eastAsia="Times New Roman" w:hAnsi="Arial" w:cs="Arial"/>
+          <w:b/>
+          <w:bCs/>
+          <w:color w:val="000000"/>
+          <w:kern w:val="0"/>
+          <w14:ligatures w14:val="none"/>
+        </w:rPr>
+      </w:pPr>
+    </w:p>
+    <w:p>
+      <w:pPr>
+        <w:spacing w:after="0" w:line="360" w:lineRule="auto"/>
+        <w:ind w:firstLine="709"/>
+        <w:jc w:val="both"/>
+        <w:rPr>
+          <w:rFonts w:ascii="Arial" w:eastAsia="Times New Roman" w:hAnsi="Arial" w:cs="Arial"/>
+          <w:color w:val="000000"/>
+          <w:kern w:val="0"/>
+          <w14:ligatures w14:val="none"/>
+        </w:rPr>
+      </w:pPr>
+      <w:r>
+        <w:rPr>
+          <w:rFonts w:ascii="Arial" w:eastAsia="Times New Roman" w:hAnsi="Arial" w:cs="Arial"/>
+          <w:color w:val="000000"/>
+          <w:kern w:val="0"/>
+          <w14:ligatures w14:val="none"/>
+        </w:rPr>
+        <w:t xml:space="preserve">O sistema do totem conta com um conjunto de páginas que </w:t>
+      </w:r>
+      <w:r>
+        <w:rPr>
+          <w:rFonts w:ascii="Arial" w:eastAsia="Times New Roman" w:hAnsi="Arial" w:cs="Arial"/>
+          <w:color w:val="000000"/>
+          <w:kern w:val="0"/>
+          <w14:ligatures w14:val="none"/>
+        </w:rPr>
+        <w:t xml:space="preserve">variam de acordo com </w:t>
+      </w:r>
+      <w:r>
+        <w:rPr>
+          <w:rFonts w:ascii="Arial" w:eastAsia="Times New Roman" w:hAnsi="Arial" w:cs="Arial"/>
+          <w:color w:val="000000"/>
+          <w:kern w:val="0"/>
+          <w14:ligatures w14:val="none"/>
+        </w:rPr>
+        <w:t xml:space="preserve">a função </w:t>
+      </w:r>
+      <w:r>
+        <w:rPr>
+          <w:rFonts w:ascii="Arial" w:eastAsia="Times New Roman" w:hAnsi="Arial" w:cs="Arial"/>
+          <w:color w:val="000000"/>
+          <w:kern w:val="0"/>
+          <w14:ligatures w14:val="none"/>
+        </w:rPr>
+        <w:t xml:space="preserve">e </w:t>
+      </w:r>
+      <w:r>
+        <w:rPr>
+          <w:rFonts w:ascii="Arial" w:eastAsia="Times New Roman" w:hAnsi="Arial" w:cs="Arial"/>
+          <w:color w:val="000000"/>
+          <w:kern w:val="0"/>
+          <w14:ligatures w14:val="none"/>
+        </w:rPr>
+        <w:t>permissões</w:t>
+      </w:r>
+      <w:r>
+        <w:rPr>
+          <w:rFonts w:ascii="Arial" w:eastAsia="Times New Roman" w:hAnsi="Arial" w:cs="Arial"/>
+          <w:color w:val="000000"/>
+          <w:kern w:val="0"/>
+          <w14:ligatures w14:val="none"/>
+        </w:rPr>
+        <w:t xml:space="preserve"> do usuário que acessa o sistema</w:t>
+      </w:r>
+      <w:r>
+        <w:rPr>
+          <w:rFonts w:ascii="Arial" w:eastAsia="Times New Roman" w:hAnsi="Arial" w:cs="Arial"/>
+          <w:color w:val="000000"/>
+          <w:kern w:val="0"/>
+          <w14:ligatures w14:val="none"/>
+        </w:rPr>
+        <w:t xml:space="preserve">. </w:t>
+      </w:r>
+      <w:r>
+        <w:rPr>
+          <w:rFonts w:ascii="Arial" w:eastAsia="Times New Roman" w:hAnsi="Arial" w:cs="Arial"/>
+          <w:color w:val="000000"/>
+          <w:kern w:val="0"/>
+          <w14:ligatures w14:val="none"/>
+        </w:rPr>
+        <w:t xml:space="preserve">O fluxo tem início na </w:t>
+      </w:r>
+      <w:r>
+        <w:rPr>
+          <w:rFonts w:ascii="Arial" w:eastAsia="Times New Roman" w:hAnsi="Arial" w:cs="Arial"/>
+          <w:color w:val="000000"/>
+          <w:kern w:val="0"/>
+          <w14:ligatures w14:val="none"/>
+        </w:rPr>
+        <w:t xml:space="preserve">página de descanso que é a primeira </w:t>
+      </w:r>
+      <w:r>
+        <w:rPr>
+          <w:rFonts w:ascii="Arial" w:eastAsia="Times New Roman" w:hAnsi="Arial" w:cs="Arial"/>
+          <w:color w:val="000000"/>
+          <w:kern w:val="0"/>
+          <w14:ligatures w14:val="none"/>
+        </w:rPr>
+        <w:t>tela</w:t>
+      </w:r>
       <w:r>
         <w:rPr>
           <w:rFonts w:ascii="Arial" w:eastAsia="Times New Roman" w:hAnsi="Arial" w:cs="Arial"/>
@@ -1053,6 +1347,1340 @@
         </w:rPr>
         <w:t xml:space="preserve"> </w:t>
       </w:r>
+      <w:r>
+        <w:rPr>
+          <w:rFonts w:ascii="Arial" w:eastAsia="Times New Roman" w:hAnsi="Arial" w:cs="Arial"/>
+          <w:color w:val="000000"/>
+          <w:kern w:val="0"/>
+          <w14:ligatures w14:val="none"/>
+        </w:rPr>
+        <w:t xml:space="preserve">apresentada ao </w:t>
+      </w:r>
+      <w:r>
+        <w:rPr>
+          <w:rFonts w:ascii="Arial" w:eastAsia="Times New Roman" w:hAnsi="Arial" w:cs="Arial"/>
+          <w:color w:val="000000"/>
+          <w:kern w:val="0"/>
+          <w14:ligatures w14:val="none"/>
+        </w:rPr>
+        <w:t xml:space="preserve">usuário </w:t>
+      </w:r>
+      <w:r>
+        <w:rPr>
+          <w:rFonts w:ascii="Arial" w:eastAsia="Times New Roman" w:hAnsi="Arial" w:cs="Arial"/>
+          <w:color w:val="000000"/>
+          <w:kern w:val="0"/>
+          <w14:ligatures w14:val="none"/>
+        </w:rPr>
+        <w:t>quando ele acessa o sistema.</w:t>
+      </w:r>
+      <w:r>
+        <w:rPr>
+          <w:rFonts w:ascii="Arial" w:eastAsia="Times New Roman" w:hAnsi="Arial" w:cs="Arial"/>
+          <w:color w:val="000000"/>
+          <w:kern w:val="0"/>
+          <w14:ligatures w14:val="none"/>
+        </w:rPr>
+        <w:t xml:space="preserve"> </w:t>
+      </w:r>
+      <w:r>
+        <w:rPr>
+          <w:rFonts w:ascii="Arial" w:eastAsia="Times New Roman" w:hAnsi="Arial" w:cs="Arial"/>
+          <w:color w:val="000000"/>
+          <w:kern w:val="0"/>
+          <w14:ligatures w14:val="none"/>
+        </w:rPr>
+        <w:t>A partir</w:t>
+      </w:r>
+      <w:r>
+        <w:rPr>
+          <w:rFonts w:ascii="Arial" w:eastAsia="Times New Roman" w:hAnsi="Arial" w:cs="Arial"/>
+          <w:color w:val="000000"/>
+          <w:kern w:val="0"/>
+          <w14:ligatures w14:val="none"/>
+        </w:rPr>
+        <w:t xml:space="preserve"> de um clique em qualquer </w:t>
+      </w:r>
+      <w:r>
+        <w:rPr>
+          <w:rFonts w:ascii="Arial" w:eastAsia="Times New Roman" w:hAnsi="Arial" w:cs="Arial"/>
+          <w:color w:val="000000"/>
+          <w:kern w:val="0"/>
+          <w14:ligatures w14:val="none"/>
+        </w:rPr>
+        <w:t xml:space="preserve">área da tela </w:t>
+      </w:r>
+      <w:r>
+        <w:rPr>
+          <w:rFonts w:ascii="Arial" w:eastAsia="Times New Roman" w:hAnsi="Arial" w:cs="Arial"/>
+          <w:color w:val="000000"/>
+          <w:kern w:val="0"/>
+          <w14:ligatures w14:val="none"/>
+        </w:rPr>
+        <w:t xml:space="preserve">o usuário será </w:t>
+      </w:r>
+      <w:r>
+        <w:rPr>
+          <w:rFonts w:ascii="Arial" w:eastAsia="Times New Roman" w:hAnsi="Arial" w:cs="Arial"/>
+          <w:color w:val="000000"/>
+          <w:kern w:val="0"/>
+          <w14:ligatures w14:val="none"/>
+        </w:rPr>
+        <w:t xml:space="preserve">direcionado </w:t>
+      </w:r>
+      <w:r>
+        <w:rPr>
+          <w:rFonts w:ascii="Arial" w:eastAsia="Times New Roman" w:hAnsi="Arial" w:cs="Arial"/>
+          <w:color w:val="000000"/>
+          <w:kern w:val="0"/>
+          <w14:ligatures w14:val="none"/>
+        </w:rPr>
+        <w:t xml:space="preserve">para a </w:t>
+      </w:r>
+      <w:r>
+        <w:rPr>
+          <w:rFonts w:ascii="Arial" w:eastAsia="Times New Roman" w:hAnsi="Arial" w:cs="Arial"/>
+          <w:color w:val="000000"/>
+          <w:kern w:val="0"/>
+          <w14:ligatures w14:val="none"/>
+        </w:rPr>
+        <w:t xml:space="preserve">página </w:t>
+      </w:r>
+      <w:r>
+        <w:rPr>
+          <w:rFonts w:ascii="Arial" w:eastAsia="Times New Roman" w:hAnsi="Arial" w:cs="Arial"/>
+          <w:color w:val="000000"/>
+          <w:kern w:val="0"/>
+          <w14:ligatures w14:val="none"/>
+        </w:rPr>
+        <w:t>de login</w:t>
+      </w:r>
+      <w:r>
+        <w:rPr>
+          <w:rFonts w:ascii="Arial" w:eastAsia="Times New Roman" w:hAnsi="Arial" w:cs="Arial"/>
+          <w:color w:val="000000"/>
+          <w:kern w:val="0"/>
+          <w14:ligatures w14:val="none"/>
+        </w:rPr>
+        <w:t>,</w:t>
+      </w:r>
+      <w:r>
+        <w:rPr>
+          <w:rFonts w:ascii="Arial" w:eastAsia="Times New Roman" w:hAnsi="Arial" w:cs="Arial"/>
+          <w:color w:val="000000"/>
+          <w:kern w:val="0"/>
+          <w14:ligatures w14:val="none"/>
+        </w:rPr>
+        <w:t xml:space="preserve"> </w:t>
+      </w:r>
+      <w:r>
+        <w:rPr>
+          <w:rFonts w:ascii="Arial" w:eastAsia="Times New Roman" w:hAnsi="Arial" w:cs="Arial"/>
+          <w:color w:val="000000"/>
+          <w:kern w:val="0"/>
+          <w14:ligatures w14:val="none"/>
+        </w:rPr>
+        <w:t xml:space="preserve">na qual deverá </w:t>
+      </w:r>
+      <w:r>
+        <w:rPr>
+          <w:rFonts w:ascii="Arial" w:eastAsia="Times New Roman" w:hAnsi="Arial" w:cs="Arial"/>
+          <w:color w:val="000000"/>
+          <w:kern w:val="0"/>
+          <w14:ligatures w14:val="none"/>
+        </w:rPr>
+        <w:t xml:space="preserve">informar </w:t>
+      </w:r>
+      <w:r>
+        <w:rPr>
+          <w:rFonts w:ascii="Arial" w:eastAsia="Times New Roman" w:hAnsi="Arial" w:cs="Arial"/>
+          <w:color w:val="000000"/>
+          <w:kern w:val="0"/>
+          <w14:ligatures w14:val="none"/>
+        </w:rPr>
+        <w:t>seu e-mail</w:t>
+      </w:r>
+      <w:r>
+        <w:rPr>
+          <w:rFonts w:ascii="Arial" w:eastAsia="Times New Roman" w:hAnsi="Arial" w:cs="Arial"/>
+          <w:color w:val="000000"/>
+          <w:kern w:val="0"/>
+          <w14:ligatures w14:val="none"/>
+        </w:rPr>
+        <w:t xml:space="preserve"> e senha</w:t>
+      </w:r>
+      <w:r>
+        <w:rPr>
+          <w:rFonts w:ascii="Arial" w:eastAsia="Times New Roman" w:hAnsi="Arial" w:cs="Arial"/>
+          <w:color w:val="000000"/>
+          <w:kern w:val="0"/>
+          <w14:ligatures w14:val="none"/>
+        </w:rPr>
+        <w:t xml:space="preserve">. Após a autenticação, </w:t>
+      </w:r>
+      <w:r>
+        <w:rPr>
+          <w:rFonts w:ascii="Arial" w:eastAsia="Times New Roman" w:hAnsi="Arial" w:cs="Arial"/>
+          <w:color w:val="000000"/>
+          <w:kern w:val="0"/>
+          <w14:ligatures w14:val="none"/>
+        </w:rPr>
+        <w:t xml:space="preserve">o sistema verifica o tipo do usuário </w:t>
+      </w:r>
+      <w:r>
+        <w:rPr>
+          <w:rFonts w:ascii="Arial" w:eastAsia="Times New Roman" w:hAnsi="Arial" w:cs="Arial"/>
+          <w:color w:val="000000"/>
+          <w:kern w:val="0"/>
+          <w14:ligatures w14:val="none"/>
+        </w:rPr>
+        <w:t xml:space="preserve">e direciona </w:t>
+      </w:r>
+      <w:r>
+        <w:rPr>
+          <w:rFonts w:ascii="Arial" w:eastAsia="Times New Roman" w:hAnsi="Arial" w:cs="Arial"/>
+          <w:color w:val="000000"/>
+          <w:kern w:val="0"/>
+          <w14:ligatures w14:val="none"/>
+        </w:rPr>
+        <w:t>ele</w:t>
+      </w:r>
+      <w:r>
+        <w:rPr>
+          <w:rFonts w:ascii="Arial" w:eastAsia="Times New Roman" w:hAnsi="Arial" w:cs="Arial"/>
+          <w:color w:val="000000"/>
+          <w:kern w:val="0"/>
+          <w14:ligatures w14:val="none"/>
+        </w:rPr>
+        <w:t xml:space="preserve"> para as páginas de visitante ou administrador</w:t>
+      </w:r>
+      <w:r>
+        <w:rPr>
+          <w:rFonts w:ascii="Arial" w:eastAsia="Times New Roman" w:hAnsi="Arial" w:cs="Arial"/>
+          <w:color w:val="000000"/>
+          <w:kern w:val="0"/>
+          <w14:ligatures w14:val="none"/>
+        </w:rPr>
+        <w:t xml:space="preserve">. A </w:t>
+      </w:r>
+      <w:r>
+        <w:rPr>
+          <w:rFonts w:ascii="Arial" w:eastAsia="Times New Roman" w:hAnsi="Arial" w:cs="Arial"/>
+          <w:color w:val="000000"/>
+          <w:kern w:val="0"/>
+          <w14:ligatures w14:val="none"/>
+        </w:rPr>
+        <w:t>figura a seguir representa esse fluxo:</w:t>
+      </w:r>
+    </w:p>
+    <w:p>
+      <w:pPr>
+        <w:spacing w:after="0" w:line="360" w:lineRule="auto"/>
+        <w:jc w:val="both"/>
+        <w:rPr>
+          <w:rFonts w:ascii="Arial" w:eastAsia="Times New Roman" w:hAnsi="Arial" w:cs="Arial"/>
+          <w:color w:val="000000"/>
+          <w:kern w:val="0"/>
+          <w14:ligatures w14:val="none"/>
+        </w:rPr>
+      </w:pPr>
+      <w:r>
+        <w:rPr>
+          <w:rFonts w:ascii="Arial" w:eastAsia="Times New Roman" w:hAnsi="Arial" w:cs="Arial"/>
+          <w:noProof/>
+          <w:color w:val="000000"/>
+          <w:kern w:val="0"/>
+        </w:rPr>
+        <w:drawing>
+          <wp:inline distT="0" distB="0" distL="0" distR="0" wp14:anchorId="1A26D565" wp14:editId="5198A193">
+            <wp:extent cx="6013014" cy="4248350"/>
+            <wp:effectExtent l="0" t="0" r="6985" b="0"/>
+            <wp:docPr id="4728309" name="Imagem 1" descr="Diagrama&#10;&#10;O conteúdo gerado por IA pode estar incorreto."/>
+            <wp:cNvGraphicFramePr>
+              <a:graphicFrameLocks xmlns:a="http://schemas.openxmlformats.org/drawingml/2006/main" noChangeAspect="1"/>
+            </wp:cNvGraphicFramePr>
+            <a:graphic xmlns:a="http://schemas.openxmlformats.org/drawingml/2006/main">
+              <a:graphicData uri="http://schemas.openxmlformats.org/drawingml/2006/picture">
+                <pic:pic xmlns:pic="http://schemas.openxmlformats.org/drawingml/2006/picture">
+                  <pic:nvPicPr>
+                    <pic:cNvPr id="4728309" name="Imagem 1" descr="Diagrama&#10;&#10;O conteúdo gerado por IA pode estar incorreto."/>
+                    <pic:cNvPicPr/>
+                  </pic:nvPicPr>
+                  <pic:blipFill rotWithShape="1">
+                    <a:blip r:embed="rId5" cstate="print">
+                      <a:extLst>
+                        <a:ext uri="{28A0092B-C50C-407E-A947-70E740481C1C}">
+                          <a14:useLocalDpi xmlns:a14="http://schemas.microsoft.com/office/drawing/2010/main" val="0"/>
+                        </a:ext>
+                      </a:extLst>
+                    </a:blip>
+                    <a:srcRect l="11260" t="-2297" r="11398" b="5143"/>
+                    <a:stretch>
+                      <a:fillRect/>
+                    </a:stretch>
+                  </pic:blipFill>
+                  <pic:spPr bwMode="auto">
+                    <a:xfrm>
+                      <a:off x="0" y="0"/>
+                      <a:ext cx="6048159" cy="4273181"/>
+                    </a:xfrm>
+                    <a:prstGeom prst="rect">
+                      <a:avLst/>
+                    </a:prstGeom>
+                    <a:ln>
+                      <a:noFill/>
+                    </a:ln>
+                    <a:extLst>
+                      <a:ext uri="{53640926-AAD7-44D8-BBD7-CCE9431645EC}">
+                        <a14:shadowObscured xmlns:a14="http://schemas.microsoft.com/office/drawing/2010/main"/>
+                      </a:ext>
+                    </a:extLst>
+                  </pic:spPr>
+                </pic:pic>
+              </a:graphicData>
+            </a:graphic>
+          </wp:inline>
+        </w:drawing>
+      </w:r>
+    </w:p>
+    <w:p>
+      <w:pPr>
+        <w:spacing w:after="0" w:line="360" w:lineRule="auto"/>
+        <w:jc w:val="both"/>
+        <w:rPr>
+          <w:rFonts w:ascii="Arial" w:eastAsia="Times New Roman" w:hAnsi="Arial" w:cs="Arial"/>
+          <w:color w:val="000000"/>
+          <w:kern w:val="0"/>
+          <w14:ligatures w14:val="none"/>
+        </w:rPr>
+      </w:pPr>
+    </w:p>
+    <w:p>
+      <w:pPr>
+        <w:spacing w:after="0" w:line="360" w:lineRule="auto"/>
+        <w:jc w:val="both"/>
+        <w:rPr>
+          <w:rFonts w:ascii="Arial" w:eastAsia="Times New Roman" w:hAnsi="Arial" w:cs="Arial"/>
+          <w:b/>
+          <w:bCs/>
+          <w:color w:val="000000"/>
+          <w:kern w:val="0"/>
+          <w14:ligatures w14:val="none"/>
+        </w:rPr>
+      </w:pPr>
+    </w:p>
+    <w:p>
+      <w:pPr>
+        <w:rPr>
+          <w:rFonts w:ascii="Arial" w:eastAsia="Times New Roman" w:hAnsi="Arial" w:cs="Arial"/>
+          <w:b/>
+          <w:bCs/>
+          <w:color w:val="000000"/>
+          <w:kern w:val="0"/>
+          <w14:ligatures w14:val="none"/>
+        </w:rPr>
+      </w:pPr>
+      <w:r>
+        <w:rPr>
+          <w:rFonts w:ascii="Arial" w:eastAsia="Times New Roman" w:hAnsi="Arial" w:cs="Arial"/>
+          <w:b/>
+          <w:bCs/>
+          <w:color w:val="000000"/>
+          <w:kern w:val="0"/>
+          <w14:ligatures w14:val="none"/>
+        </w:rPr>
+        <w:br w:type="page"/>
+      </w:r>
+    </w:p>
+    <w:p>
+      <w:pPr>
+        <w:spacing w:after="0" w:line="360" w:lineRule="auto"/>
+        <w:jc w:val="both"/>
+        <w:rPr>
+          <w:rFonts w:ascii="Arial" w:eastAsia="Times New Roman" w:hAnsi="Arial" w:cs="Arial"/>
+          <w:b/>
+          <w:bCs/>
+          <w:color w:val="000000"/>
+          <w:kern w:val="0"/>
+          <w14:ligatures w14:val="none"/>
+        </w:rPr>
+      </w:pPr>
+      <w:r>
+        <w:rPr>
+          <w:rFonts w:ascii="Arial" w:eastAsia="Times New Roman" w:hAnsi="Arial" w:cs="Arial"/>
+          <w:b/>
+          <w:bCs/>
+          <w:color w:val="000000"/>
+          <w:kern w:val="0"/>
+          <w14:ligatures w14:val="none"/>
+        </w:rPr>
+        <w:lastRenderedPageBreak/>
+        <w:t xml:space="preserve">CAPÍTULO </w:t>
+      </w:r>
+      <w:r>
+        <w:rPr>
+          <w:rFonts w:ascii="Arial" w:eastAsia="Times New Roman" w:hAnsi="Arial" w:cs="Arial"/>
+          <w:b/>
+          <w:bCs/>
+          <w:color w:val="000000"/>
+          <w:kern w:val="0"/>
+          <w14:ligatures w14:val="none"/>
+        </w:rPr>
+        <w:t>4</w:t>
+      </w:r>
+      <w:r>
+        <w:rPr>
+          <w:rFonts w:ascii="Arial" w:eastAsia="Times New Roman" w:hAnsi="Arial" w:cs="Arial"/>
+          <w:b/>
+          <w:bCs/>
+          <w:color w:val="000000"/>
+          <w:kern w:val="0"/>
+          <w14:ligatures w14:val="none"/>
+        </w:rPr>
+        <w:t xml:space="preserve"> </w:t>
+      </w:r>
+      <w:r>
+        <w:rPr>
+          <w:rFonts w:ascii="Arial" w:eastAsia="Times New Roman" w:hAnsi="Arial" w:cs="Arial"/>
+          <w:b/>
+          <w:bCs/>
+          <w:color w:val="000000"/>
+          <w:kern w:val="0"/>
+          <w14:ligatures w14:val="none"/>
+        </w:rPr>
+        <w:t>-</w:t>
+      </w:r>
+      <w:r>
+        <w:rPr>
+          <w:rFonts w:ascii="Arial" w:eastAsia="Times New Roman" w:hAnsi="Arial" w:cs="Arial"/>
+          <w:b/>
+          <w:bCs/>
+          <w:color w:val="000000"/>
+          <w:kern w:val="0"/>
+          <w14:ligatures w14:val="none"/>
+        </w:rPr>
+        <w:t xml:space="preserve"> </w:t>
+      </w:r>
+      <w:r>
+        <w:rPr>
+          <w:rFonts w:ascii="Arial" w:eastAsia="Times New Roman" w:hAnsi="Arial" w:cs="Arial"/>
+          <w:b/>
+          <w:bCs/>
+          <w:color w:val="000000"/>
+          <w:kern w:val="0"/>
+          <w14:ligatures w14:val="none"/>
+        </w:rPr>
+        <w:t>GUIA RÁPIDO</w:t>
+      </w:r>
+    </w:p>
+    <w:p>
+      <w:pPr>
+        <w:rPr>
+          <w:rFonts w:ascii="Arial" w:eastAsia="Times New Roman" w:hAnsi="Arial" w:cs="Arial"/>
+          <w:b/>
+          <w:bCs/>
+          <w:color w:val="000000"/>
+          <w:kern w:val="0"/>
+          <w14:ligatures w14:val="none"/>
+        </w:rPr>
+      </w:pPr>
+      <w:r>
+        <w:rPr>
+          <w:rFonts w:ascii="Arial" w:eastAsia="Times New Roman" w:hAnsi="Arial" w:cs="Arial"/>
+          <w:b/>
+          <w:bCs/>
+          <w:color w:val="000000"/>
+          <w:kern w:val="0"/>
+          <w14:ligatures w14:val="none"/>
+        </w:rPr>
+        <w:br w:type="page"/>
+      </w:r>
+    </w:p>
+    <w:p>
+      <w:pPr>
+        <w:spacing w:after="0" w:line="360" w:lineRule="auto"/>
+        <w:jc w:val="both"/>
+        <w:rPr>
+          <w:rFonts w:ascii="Arial" w:eastAsia="Times New Roman" w:hAnsi="Arial" w:cs="Arial"/>
+          <w:b/>
+          <w:bCs/>
+          <w:color w:val="000000"/>
+          <w:kern w:val="0"/>
+          <w14:ligatures w14:val="none"/>
+        </w:rPr>
+      </w:pPr>
+      <w:r>
+        <w:rPr>
+          <w:rFonts w:ascii="Arial" w:eastAsia="Times New Roman" w:hAnsi="Arial" w:cs="Arial"/>
+          <w:b/>
+          <w:bCs/>
+          <w:color w:val="000000"/>
+          <w:kern w:val="0"/>
+          <w14:ligatures w14:val="none"/>
+        </w:rPr>
+        <w:lastRenderedPageBreak/>
+        <w:t xml:space="preserve">CAPÍTULO </w:t>
+      </w:r>
+      <w:r>
+        <w:rPr>
+          <w:rFonts w:ascii="Arial" w:eastAsia="Times New Roman" w:hAnsi="Arial" w:cs="Arial"/>
+          <w:b/>
+          <w:bCs/>
+          <w:color w:val="000000"/>
+          <w:kern w:val="0"/>
+          <w14:ligatures w14:val="none"/>
+        </w:rPr>
+        <w:t>5 – COMO REALIZAR TAREFAS</w:t>
+      </w:r>
+    </w:p>
+    <w:p>
+      <w:pPr>
+        <w:rPr>
+          <w:rFonts w:ascii="Arial" w:eastAsia="Times New Roman" w:hAnsi="Arial" w:cs="Arial"/>
+          <w:b/>
+          <w:bCs/>
+          <w:color w:val="000000"/>
+          <w:kern w:val="0"/>
+          <w14:ligatures w14:val="none"/>
+        </w:rPr>
+      </w:pPr>
+      <w:r>
+        <w:rPr>
+          <w:rFonts w:ascii="Arial" w:eastAsia="Times New Roman" w:hAnsi="Arial" w:cs="Arial"/>
+          <w:b/>
+          <w:bCs/>
+          <w:color w:val="000000"/>
+          <w:kern w:val="0"/>
+          <w14:ligatures w14:val="none"/>
+        </w:rPr>
+        <w:br w:type="page"/>
+      </w:r>
+    </w:p>
+    <w:p>
+      <w:pPr>
+        <w:spacing w:after="0" w:line="360" w:lineRule="auto"/>
+        <w:jc w:val="both"/>
+        <w:rPr>
+          <w:rFonts w:ascii="Arial" w:eastAsia="Times New Roman" w:hAnsi="Arial" w:cs="Arial"/>
+          <w:b/>
+          <w:bCs/>
+          <w:color w:val="000000"/>
+          <w:kern w:val="0"/>
+          <w14:ligatures w14:val="none"/>
+        </w:rPr>
+      </w:pPr>
+      <w:r>
+        <w:rPr>
+          <w:rFonts w:ascii="Arial" w:eastAsia="Times New Roman" w:hAnsi="Arial" w:cs="Arial"/>
+          <w:b/>
+          <w:bCs/>
+          <w:color w:val="000000"/>
+          <w:kern w:val="0"/>
+          <w14:ligatures w14:val="none"/>
+        </w:rPr>
+        <w:lastRenderedPageBreak/>
+        <w:t xml:space="preserve">CAPÍTULO </w:t>
+      </w:r>
+      <w:r>
+        <w:rPr>
+          <w:rFonts w:ascii="Arial" w:eastAsia="Times New Roman" w:hAnsi="Arial" w:cs="Arial"/>
+          <w:b/>
+          <w:bCs/>
+          <w:color w:val="000000"/>
+          <w:kern w:val="0"/>
+          <w14:ligatures w14:val="none"/>
+        </w:rPr>
+        <w:t>6 – RECURSOS DO SISTEMA</w:t>
+      </w:r>
+    </w:p>
+    <w:p>
+      <w:pPr>
+        <w:rPr>
+          <w:rFonts w:ascii="Arial" w:eastAsia="Times New Roman" w:hAnsi="Arial" w:cs="Arial"/>
+          <w:b/>
+          <w:bCs/>
+          <w:color w:val="000000"/>
+          <w:kern w:val="0"/>
+          <w14:ligatures w14:val="none"/>
+        </w:rPr>
+      </w:pPr>
+      <w:r>
+        <w:rPr>
+          <w:rFonts w:ascii="Arial" w:eastAsia="Times New Roman" w:hAnsi="Arial" w:cs="Arial"/>
+          <w:b/>
+          <w:bCs/>
+          <w:color w:val="000000"/>
+          <w:kern w:val="0"/>
+          <w14:ligatures w14:val="none"/>
+        </w:rPr>
+        <w:br w:type="page"/>
+      </w:r>
+    </w:p>
+    <w:p>
+      <w:pPr>
+        <w:spacing w:after="0" w:line="360" w:lineRule="auto"/>
+        <w:jc w:val="both"/>
+        <w:rPr>
+          <w:rFonts w:ascii="Arial" w:eastAsia="Times New Roman" w:hAnsi="Arial" w:cs="Arial"/>
+          <w:b/>
+          <w:bCs/>
+          <w:color w:val="000000"/>
+          <w:kern w:val="0"/>
+          <w14:ligatures w14:val="none"/>
+        </w:rPr>
+      </w:pPr>
+      <w:r>
+        <w:rPr>
+          <w:rFonts w:ascii="Arial" w:eastAsia="Times New Roman" w:hAnsi="Arial" w:cs="Arial"/>
+          <w:b/>
+          <w:bCs/>
+          <w:color w:val="000000"/>
+          <w:kern w:val="0"/>
+          <w14:ligatures w14:val="none"/>
+        </w:rPr>
+        <w:lastRenderedPageBreak/>
+        <w:t xml:space="preserve">CAPÍTULO </w:t>
+      </w:r>
+      <w:r>
+        <w:rPr>
+          <w:rFonts w:ascii="Arial" w:eastAsia="Times New Roman" w:hAnsi="Arial" w:cs="Arial"/>
+          <w:b/>
+          <w:bCs/>
+          <w:color w:val="000000"/>
+          <w:kern w:val="0"/>
+          <w14:ligatures w14:val="none"/>
+        </w:rPr>
+        <w:t>7 – FLUXOS DE TRABALAHO</w:t>
+      </w:r>
+    </w:p>
+    <w:p>
+      <w:pPr>
+        <w:rPr>
+          <w:rFonts w:ascii="Arial" w:eastAsia="Times New Roman" w:hAnsi="Arial" w:cs="Arial"/>
+          <w:b/>
+          <w:bCs/>
+          <w:color w:val="000000"/>
+          <w:kern w:val="0"/>
+          <w14:ligatures w14:val="none"/>
+        </w:rPr>
+      </w:pPr>
+      <w:r>
+        <w:rPr>
+          <w:rFonts w:ascii="Arial" w:eastAsia="Times New Roman" w:hAnsi="Arial" w:cs="Arial"/>
+          <w:b/>
+          <w:bCs/>
+          <w:color w:val="000000"/>
+          <w:kern w:val="0"/>
+          <w14:ligatures w14:val="none"/>
+        </w:rPr>
+        <w:br w:type="page"/>
+      </w:r>
+    </w:p>
+    <w:p>
+      <w:pPr>
+        <w:spacing w:after="0" w:line="360" w:lineRule="auto"/>
+        <w:jc w:val="both"/>
+        <w:rPr>
+          <w:rFonts w:ascii="Arial" w:eastAsia="Times New Roman" w:hAnsi="Arial" w:cs="Arial"/>
+          <w:b/>
+          <w:bCs/>
+          <w:color w:val="000000"/>
+          <w:kern w:val="0"/>
+          <w14:ligatures w14:val="none"/>
+        </w:rPr>
+      </w:pPr>
+      <w:r>
+        <w:rPr>
+          <w:rFonts w:ascii="Arial" w:eastAsia="Times New Roman" w:hAnsi="Arial" w:cs="Arial"/>
+          <w:b/>
+          <w:bCs/>
+          <w:color w:val="000000"/>
+          <w:kern w:val="0"/>
+          <w14:ligatures w14:val="none"/>
+        </w:rPr>
+        <w:lastRenderedPageBreak/>
+        <w:t xml:space="preserve">CAPÍTULO </w:t>
+      </w:r>
+      <w:r>
+        <w:rPr>
+          <w:rFonts w:ascii="Arial" w:eastAsia="Times New Roman" w:hAnsi="Arial" w:cs="Arial"/>
+          <w:b/>
+          <w:bCs/>
+          <w:color w:val="000000"/>
+          <w:kern w:val="0"/>
+          <w14:ligatures w14:val="none"/>
+        </w:rPr>
+        <w:t>8 – SOLUÇÃO DE PROBLEMAS</w:t>
+      </w:r>
+    </w:p>
+    <w:p>
+      <w:pPr>
+        <w:rPr>
+          <w:rFonts w:ascii="Arial" w:eastAsia="Times New Roman" w:hAnsi="Arial" w:cs="Arial"/>
+          <w:b/>
+          <w:bCs/>
+          <w:color w:val="000000"/>
+          <w:kern w:val="0"/>
+          <w14:ligatures w14:val="none"/>
+        </w:rPr>
+      </w:pPr>
+      <w:r>
+        <w:rPr>
+          <w:rFonts w:ascii="Arial" w:eastAsia="Times New Roman" w:hAnsi="Arial" w:cs="Arial"/>
+          <w:b/>
+          <w:bCs/>
+          <w:color w:val="000000"/>
+          <w:kern w:val="0"/>
+          <w14:ligatures w14:val="none"/>
+        </w:rPr>
+        <w:br w:type="page"/>
+      </w:r>
+    </w:p>
+    <w:p>
+      <w:pPr>
+        <w:spacing w:after="0" w:line="360" w:lineRule="auto"/>
+        <w:jc w:val="both"/>
+        <w:rPr>
+          <w:rFonts w:ascii="Arial" w:eastAsia="Times New Roman" w:hAnsi="Arial" w:cs="Arial"/>
+          <w:b/>
+          <w:bCs/>
+          <w:color w:val="000000"/>
+          <w:kern w:val="0"/>
+          <w14:ligatures w14:val="none"/>
+        </w:rPr>
+      </w:pPr>
+      <w:r>
+        <w:rPr>
+          <w:rFonts w:ascii="Arial" w:eastAsia="Times New Roman" w:hAnsi="Arial" w:cs="Arial"/>
+          <w:b/>
+          <w:bCs/>
+          <w:color w:val="000000"/>
+          <w:kern w:val="0"/>
+          <w14:ligatures w14:val="none"/>
+        </w:rPr>
+        <w:lastRenderedPageBreak/>
+        <w:t xml:space="preserve">CAPÍTULO </w:t>
+      </w:r>
+      <w:r>
+        <w:rPr>
+          <w:rFonts w:ascii="Arial" w:eastAsia="Times New Roman" w:hAnsi="Arial" w:cs="Arial"/>
+          <w:b/>
+          <w:bCs/>
+          <w:color w:val="000000"/>
+          <w:kern w:val="0"/>
+          <w14:ligatures w14:val="none"/>
+        </w:rPr>
+        <w:t>9</w:t>
+      </w:r>
+      <w:r>
+        <w:rPr>
+          <w:rFonts w:ascii="Arial" w:eastAsia="Times New Roman" w:hAnsi="Arial" w:cs="Arial"/>
+          <w:b/>
+          <w:bCs/>
+          <w:color w:val="000000"/>
+          <w:kern w:val="0"/>
+          <w14:ligatures w14:val="none"/>
+        </w:rPr>
+        <w:t xml:space="preserve"> – </w:t>
+      </w:r>
+      <w:r>
+        <w:rPr>
+          <w:rFonts w:ascii="Arial" w:eastAsia="Times New Roman" w:hAnsi="Arial" w:cs="Arial"/>
+          <w:b/>
+          <w:bCs/>
+          <w:color w:val="000000"/>
+          <w:kern w:val="0"/>
+          <w14:ligatures w14:val="none"/>
+        </w:rPr>
+        <w:t>PERGUNTAS FREQUENTES</w:t>
+      </w:r>
+    </w:p>
+    <w:p>
+      <w:pPr>
+        <w:rPr>
+          <w:rFonts w:ascii="Arial" w:eastAsia="Times New Roman" w:hAnsi="Arial" w:cs="Arial"/>
+          <w:b/>
+          <w:bCs/>
+          <w:color w:val="000000"/>
+          <w:kern w:val="0"/>
+          <w14:ligatures w14:val="none"/>
+        </w:rPr>
+      </w:pPr>
+      <w:r>
+        <w:rPr>
+          <w:rFonts w:ascii="Arial" w:eastAsia="Times New Roman" w:hAnsi="Arial" w:cs="Arial"/>
+          <w:b/>
+          <w:bCs/>
+          <w:color w:val="000000"/>
+          <w:kern w:val="0"/>
+          <w14:ligatures w14:val="none"/>
+        </w:rPr>
+        <w:br w:type="page"/>
+      </w:r>
+    </w:p>
+    <w:p>
+      <w:pPr>
+        <w:spacing w:after="0" w:line="360" w:lineRule="auto"/>
+        <w:jc w:val="both"/>
+        <w:rPr>
+          <w:rFonts w:ascii="Arial" w:eastAsia="Times New Roman" w:hAnsi="Arial" w:cs="Arial"/>
+          <w:b/>
+          <w:bCs/>
+          <w:color w:val="000000"/>
+          <w:kern w:val="0"/>
+          <w14:ligatures w14:val="none"/>
+        </w:rPr>
+      </w:pPr>
+      <w:r>
+        <w:rPr>
+          <w:rFonts w:ascii="Arial" w:eastAsia="Times New Roman" w:hAnsi="Arial" w:cs="Arial"/>
+          <w:b/>
+          <w:bCs/>
+          <w:color w:val="000000"/>
+          <w:kern w:val="0"/>
+          <w14:ligatures w14:val="none"/>
+        </w:rPr>
+        <w:lastRenderedPageBreak/>
+        <w:t>CAPÍTULO 1</w:t>
+      </w:r>
+      <w:r>
+        <w:rPr>
+          <w:rFonts w:ascii="Arial" w:eastAsia="Times New Roman" w:hAnsi="Arial" w:cs="Arial"/>
+          <w:b/>
+          <w:bCs/>
+          <w:color w:val="000000"/>
+          <w:kern w:val="0"/>
+          <w14:ligatures w14:val="none"/>
+        </w:rPr>
+        <w:t>0</w:t>
+      </w:r>
+      <w:r>
+        <w:rPr>
+          <w:rFonts w:ascii="Arial" w:eastAsia="Times New Roman" w:hAnsi="Arial" w:cs="Arial"/>
+          <w:b/>
+          <w:bCs/>
+          <w:color w:val="000000"/>
+          <w:kern w:val="0"/>
+          <w14:ligatures w14:val="none"/>
+        </w:rPr>
+        <w:t xml:space="preserve"> – </w:t>
+      </w:r>
+      <w:r>
+        <w:rPr>
+          <w:rFonts w:ascii="Arial" w:eastAsia="Times New Roman" w:hAnsi="Arial" w:cs="Arial"/>
+          <w:b/>
+          <w:bCs/>
+          <w:color w:val="000000"/>
+          <w:kern w:val="0"/>
+          <w14:ligatures w14:val="none"/>
+        </w:rPr>
+        <w:t>SEGURANÇA</w:t>
+      </w:r>
+    </w:p>
+    <w:p>
+      <w:pPr>
+        <w:rPr>
+          <w:rFonts w:ascii="Arial" w:eastAsia="Times New Roman" w:hAnsi="Arial" w:cs="Arial"/>
+          <w:b/>
+          <w:bCs/>
+          <w:color w:val="000000"/>
+          <w:kern w:val="0"/>
+          <w14:ligatures w14:val="none"/>
+        </w:rPr>
+      </w:pPr>
+      <w:r>
+        <w:rPr>
+          <w:rFonts w:ascii="Arial" w:eastAsia="Times New Roman" w:hAnsi="Arial" w:cs="Arial"/>
+          <w:b/>
+          <w:bCs/>
+          <w:color w:val="000000"/>
+          <w:kern w:val="0"/>
+          <w14:ligatures w14:val="none"/>
+        </w:rPr>
+        <w:br w:type="page"/>
+      </w:r>
+    </w:p>
+    <w:p>
+      <w:pPr>
+        <w:spacing w:after="0" w:line="360" w:lineRule="auto"/>
+        <w:jc w:val="both"/>
+        <w:rPr>
+          <w:rFonts w:ascii="Arial" w:eastAsia="Times New Roman" w:hAnsi="Arial" w:cs="Arial"/>
+          <w:b/>
+          <w:bCs/>
+          <w:color w:val="000000"/>
+          <w:kern w:val="0"/>
+          <w14:ligatures w14:val="none"/>
+        </w:rPr>
+      </w:pPr>
+      <w:r>
+        <w:rPr>
+          <w:rFonts w:ascii="Arial" w:eastAsia="Times New Roman" w:hAnsi="Arial" w:cs="Arial"/>
+          <w:b/>
+          <w:bCs/>
+          <w:color w:val="000000"/>
+          <w:kern w:val="0"/>
+          <w14:ligatures w14:val="none"/>
+        </w:rPr>
+        <w:lastRenderedPageBreak/>
+        <w:t>CAPÍTULO 1</w:t>
+      </w:r>
+      <w:r>
+        <w:rPr>
+          <w:rFonts w:ascii="Arial" w:eastAsia="Times New Roman" w:hAnsi="Arial" w:cs="Arial"/>
+          <w:b/>
+          <w:bCs/>
+          <w:color w:val="000000"/>
+          <w:kern w:val="0"/>
+          <w14:ligatures w14:val="none"/>
+        </w:rPr>
+        <w:t>1 – GLOSSÁRIO</w:t>
+      </w:r>
+    </w:p>
+    <w:p>
+      <w:pPr>
+        <w:rPr>
+          <w:rFonts w:ascii="Arial" w:eastAsia="Times New Roman" w:hAnsi="Arial" w:cs="Arial"/>
+          <w:b/>
+          <w:bCs/>
+          <w:color w:val="000000"/>
+          <w:kern w:val="0"/>
+          <w14:ligatures w14:val="none"/>
+        </w:rPr>
+      </w:pPr>
+      <w:r>
+        <w:rPr>
+          <w:rFonts w:ascii="Arial" w:eastAsia="Times New Roman" w:hAnsi="Arial" w:cs="Arial"/>
+          <w:b/>
+          <w:bCs/>
+          <w:color w:val="000000"/>
+          <w:kern w:val="0"/>
+          <w14:ligatures w14:val="none"/>
+        </w:rPr>
+        <w:br w:type="page"/>
+      </w:r>
+    </w:p>
+    <w:p>
+      <w:pPr>
+        <w:spacing w:after="0" w:line="360" w:lineRule="auto"/>
+        <w:jc w:val="both"/>
+        <w:rPr>
+          <w:rFonts w:ascii="Arial" w:eastAsia="Times New Roman" w:hAnsi="Arial" w:cs="Arial"/>
+          <w:b/>
+          <w:bCs/>
+          <w:color w:val="000000"/>
+          <w:kern w:val="0"/>
+          <w14:ligatures w14:val="none"/>
+        </w:rPr>
+      </w:pPr>
+      <w:r>
+        <w:rPr>
+          <w:rFonts w:ascii="Arial" w:eastAsia="Times New Roman" w:hAnsi="Arial" w:cs="Arial"/>
+          <w:b/>
+          <w:bCs/>
+          <w:color w:val="000000"/>
+          <w:kern w:val="0"/>
+          <w14:ligatures w14:val="none"/>
+        </w:rPr>
+        <w:lastRenderedPageBreak/>
+        <w:t>CAPÍTULO 1</w:t>
+      </w:r>
+      <w:r>
+        <w:rPr>
+          <w:rFonts w:ascii="Arial" w:eastAsia="Times New Roman" w:hAnsi="Arial" w:cs="Arial"/>
+          <w:b/>
+          <w:bCs/>
+          <w:color w:val="000000"/>
+          <w:kern w:val="0"/>
+          <w14:ligatures w14:val="none"/>
+        </w:rPr>
+        <w:t>2</w:t>
+      </w:r>
+      <w:r>
+        <w:rPr>
+          <w:rFonts w:ascii="Arial" w:eastAsia="Times New Roman" w:hAnsi="Arial" w:cs="Arial"/>
+          <w:b/>
+          <w:bCs/>
+          <w:color w:val="000000"/>
+          <w:kern w:val="0"/>
+          <w14:ligatures w14:val="none"/>
+        </w:rPr>
+        <w:t xml:space="preserve"> </w:t>
+      </w:r>
+      <w:r>
+        <w:rPr>
+          <w:rFonts w:ascii="Arial" w:eastAsia="Times New Roman" w:hAnsi="Arial" w:cs="Arial"/>
+          <w:b/>
+          <w:bCs/>
+          <w:color w:val="000000"/>
+          <w:kern w:val="0"/>
+          <w14:ligatures w14:val="none"/>
+        </w:rPr>
+        <w:t>– ATALHOS</w:t>
+      </w:r>
+    </w:p>
+    <w:p>
+      <w:pPr>
+        <w:rPr>
+          <w:rFonts w:ascii="Arial" w:eastAsia="Times New Roman" w:hAnsi="Arial" w:cs="Arial"/>
+          <w:b/>
+          <w:bCs/>
+          <w:color w:val="000000"/>
+          <w:kern w:val="0"/>
+          <w14:ligatures w14:val="none"/>
+        </w:rPr>
+      </w:pPr>
+      <w:r>
+        <w:rPr>
+          <w:rFonts w:ascii="Arial" w:eastAsia="Times New Roman" w:hAnsi="Arial" w:cs="Arial"/>
+          <w:b/>
+          <w:bCs/>
+          <w:color w:val="000000"/>
+          <w:kern w:val="0"/>
+          <w14:ligatures w14:val="none"/>
+        </w:rPr>
+        <w:br w:type="page"/>
+      </w:r>
+    </w:p>
+    <w:p>
+      <w:pPr>
+        <w:spacing w:after="0" w:line="360" w:lineRule="auto"/>
+        <w:jc w:val="both"/>
+        <w:rPr>
+          <w:rFonts w:ascii="Arial" w:eastAsia="Times New Roman" w:hAnsi="Arial" w:cs="Arial"/>
+          <w:b/>
+          <w:bCs/>
+          <w:color w:val="000000"/>
+          <w:kern w:val="0"/>
+          <w14:ligatures w14:val="none"/>
+        </w:rPr>
+      </w:pPr>
+      <w:r>
+        <w:rPr>
+          <w:rFonts w:ascii="Arial" w:eastAsia="Times New Roman" w:hAnsi="Arial" w:cs="Arial"/>
+          <w:b/>
+          <w:bCs/>
+          <w:color w:val="000000"/>
+          <w:kern w:val="0"/>
+          <w14:ligatures w14:val="none"/>
+        </w:rPr>
+        <w:lastRenderedPageBreak/>
+        <w:t xml:space="preserve">CAPÍTULO </w:t>
+      </w:r>
+      <w:r>
+        <w:rPr>
+          <w:rFonts w:ascii="Arial" w:eastAsia="Times New Roman" w:hAnsi="Arial" w:cs="Arial"/>
+          <w:b/>
+          <w:bCs/>
+          <w:color w:val="000000"/>
+          <w:kern w:val="0"/>
+          <w14:ligatures w14:val="none"/>
+        </w:rPr>
+        <w:t>13 – HISTÓRICO DE ATUALIZAÇÕES</w:t>
+      </w:r>
+    </w:p>
+    <w:p>
+      <w:pPr>
+        <w:rPr>
+          <w:rFonts w:ascii="Arial" w:eastAsia="Times New Roman" w:hAnsi="Arial" w:cs="Arial"/>
+          <w:b/>
+          <w:bCs/>
+          <w:color w:val="000000"/>
+          <w:kern w:val="0"/>
+          <w14:ligatures w14:val="none"/>
+        </w:rPr>
+      </w:pPr>
+      <w:r>
+        <w:rPr>
+          <w:rFonts w:ascii="Arial" w:eastAsia="Times New Roman" w:hAnsi="Arial" w:cs="Arial"/>
+          <w:b/>
+          <w:bCs/>
+          <w:color w:val="000000"/>
+          <w:kern w:val="0"/>
+          <w14:ligatures w14:val="none"/>
+        </w:rPr>
+        <w:br w:type="page"/>
+      </w:r>
+    </w:p>
+    <w:p>
+      <w:pPr>
+        <w:spacing w:after="0" w:line="360" w:lineRule="auto"/>
+        <w:jc w:val="both"/>
+        <w:rPr>
+          <w:rFonts w:ascii="Arial" w:eastAsia="Times New Roman" w:hAnsi="Arial" w:cs="Arial"/>
+          <w:b/>
+          <w:bCs/>
+          <w:color w:val="000000"/>
+          <w:kern w:val="0"/>
+          <w14:ligatures w14:val="none"/>
+        </w:rPr>
+      </w:pPr>
+      <w:r>
+        <w:rPr>
+          <w:rFonts w:ascii="Arial" w:eastAsia="Times New Roman" w:hAnsi="Arial" w:cs="Arial"/>
+          <w:b/>
+          <w:bCs/>
+          <w:color w:val="000000"/>
+          <w:kern w:val="0"/>
+          <w14:ligatures w14:val="none"/>
+        </w:rPr>
+        <w:lastRenderedPageBreak/>
+        <w:t xml:space="preserve">CAPÍTULO </w:t>
+      </w:r>
+      <w:r>
+        <w:rPr>
+          <w:rFonts w:ascii="Arial" w:eastAsia="Times New Roman" w:hAnsi="Arial" w:cs="Arial"/>
+          <w:b/>
+          <w:bCs/>
+          <w:color w:val="000000"/>
+          <w:kern w:val="0"/>
+          <w14:ligatures w14:val="none"/>
+        </w:rPr>
+        <w:t>14 – SUPORTE</w:t>
+      </w:r>
+    </w:p>
+    <w:p>
+      <w:pPr>
+        <w:rPr>
+          <w:rFonts w:ascii="Arial" w:eastAsia="Times New Roman" w:hAnsi="Arial" w:cs="Arial"/>
+          <w:b/>
+          <w:bCs/>
+          <w:color w:val="000000"/>
+          <w:kern w:val="0"/>
+          <w14:ligatures w14:val="none"/>
+        </w:rPr>
+      </w:pPr>
+      <w:r>
+        <w:rPr>
+          <w:rFonts w:ascii="Arial" w:eastAsia="Times New Roman" w:hAnsi="Arial" w:cs="Arial"/>
+          <w:b/>
+          <w:bCs/>
+          <w:color w:val="000000"/>
+          <w:kern w:val="0"/>
+          <w14:ligatures w14:val="none"/>
+        </w:rPr>
+        <w:br w:type="page"/>
+      </w:r>
+    </w:p>
+    <w:p>
+      <w:pPr>
+        <w:spacing w:after="0" w:line="360" w:lineRule="auto"/>
+        <w:jc w:val="both"/>
+        <w:rPr>
+          <w:rFonts w:ascii="Arial" w:eastAsia="Times New Roman" w:hAnsi="Arial" w:cs="Arial"/>
+          <w:b/>
+          <w:bCs/>
+          <w:color w:val="000000"/>
+          <w:kern w:val="0"/>
+          <w14:ligatures w14:val="none"/>
+        </w:rPr>
+      </w:pPr>
+      <w:r>
+        <w:rPr>
+          <w:rFonts w:ascii="Arial" w:eastAsia="Times New Roman" w:hAnsi="Arial" w:cs="Arial"/>
+          <w:b/>
+          <w:bCs/>
+          <w:color w:val="000000"/>
+          <w:kern w:val="0"/>
+          <w14:ligatures w14:val="none"/>
+        </w:rPr>
+        <w:lastRenderedPageBreak/>
+        <w:t>CAPÍTULO 15 – ÍNDICE DE FUNCIONALIDADES</w:t>
+      </w:r>
+    </w:p>
+    <w:p>
+      <w:pPr>
+        <w:spacing w:after="0" w:line="360" w:lineRule="auto"/>
+        <w:jc w:val="both"/>
+        <w:rPr>
+          <w:rFonts w:ascii="Arial" w:eastAsia="Times New Roman" w:hAnsi="Arial" w:cs="Arial"/>
+          <w:b/>
+          <w:bCs/>
+          <w:color w:val="000000"/>
+          <w:kern w:val="0"/>
+          <w14:ligatures w14:val="none"/>
+        </w:rPr>
+      </w:pPr>
+    </w:p>
+    <w:p>
+      <w:pPr>
+        <w:spacing w:after="0" w:line="360" w:lineRule="auto"/>
+        <w:jc w:val="both"/>
+        <w:rPr>
+          <w:rFonts w:ascii="Arial" w:eastAsia="Times New Roman" w:hAnsi="Arial" w:cs="Arial"/>
+          <w:b/>
+          <w:bCs/>
+          <w:color w:val="000000"/>
+          <w:kern w:val="0"/>
+          <w14:ligatures w14:val="none"/>
+        </w:rPr>
+      </w:pPr>
+    </w:p>
+    <w:p>
+      <w:pPr>
+        <w:spacing w:after="0" w:line="360" w:lineRule="auto"/>
+        <w:jc w:val="both"/>
+        <w:rPr>
+          <w:rFonts w:ascii="Arial" w:eastAsia="Times New Roman" w:hAnsi="Arial" w:cs="Arial"/>
+          <w:b/>
+          <w:bCs/>
+          <w:color w:val="000000"/>
+          <w:kern w:val="0"/>
+          <w14:ligatures w14:val="none"/>
+        </w:rPr>
+      </w:pPr>
+    </w:p>
+    <w:p>
+      <w:pPr>
+        <w:spacing w:after="0" w:line="360" w:lineRule="auto"/>
+        <w:jc w:val="both"/>
+        <w:rPr>
+          <w:rFonts w:ascii="Arial" w:eastAsia="Times New Roman" w:hAnsi="Arial" w:cs="Arial"/>
+          <w:b/>
+          <w:bCs/>
+          <w:color w:val="000000"/>
+          <w:kern w:val="0"/>
+          <w14:ligatures w14:val="none"/>
+        </w:rPr>
+      </w:pPr>
+    </w:p>
+    <w:p>
+      <w:pPr>
+        <w:spacing w:after="0" w:line="360" w:lineRule="auto"/>
+        <w:jc w:val="both"/>
+        <w:rPr>
+          <w:rFonts w:ascii="Arial" w:eastAsia="Times New Roman" w:hAnsi="Arial" w:cs="Arial"/>
+          <w:b/>
+          <w:bCs/>
+          <w:color w:val="000000"/>
+          <w:kern w:val="0"/>
+          <w14:ligatures w14:val="none"/>
+        </w:rPr>
+      </w:pPr>
+    </w:p>
+    <w:p>
+      <w:pPr>
+        <w:spacing w:after="0" w:line="360" w:lineRule="auto"/>
+        <w:jc w:val="both"/>
+        <w:rPr>
+          <w:rFonts w:ascii="Arial" w:eastAsia="Times New Roman" w:hAnsi="Arial" w:cs="Arial"/>
+          <w:b/>
+          <w:bCs/>
+          <w:color w:val="000000"/>
+          <w:kern w:val="0"/>
+          <w14:ligatures w14:val="none"/>
+        </w:rPr>
+      </w:pPr>
+    </w:p>
+    <w:p>
+      <w:pPr>
+        <w:spacing w:after="0" w:line="360" w:lineRule="auto"/>
+        <w:jc w:val="both"/>
+        <w:rPr>
+          <w:rFonts w:ascii="Arial" w:eastAsia="Times New Roman" w:hAnsi="Arial" w:cs="Arial"/>
+          <w:b/>
+          <w:bCs/>
+          <w:color w:val="000000"/>
+          <w:kern w:val="0"/>
+          <w14:ligatures w14:val="none"/>
+        </w:rPr>
+      </w:pPr>
+    </w:p>
+    <w:p>
+      <w:pPr>
+        <w:spacing w:after="0" w:line="360" w:lineRule="auto"/>
+        <w:jc w:val="both"/>
+        <w:rPr>
+          <w:rFonts w:ascii="Arial" w:eastAsia="Times New Roman" w:hAnsi="Arial" w:cs="Arial"/>
+          <w:b/>
+          <w:bCs/>
+          <w:color w:val="000000"/>
+          <w:kern w:val="0"/>
+          <w14:ligatures w14:val="none"/>
+        </w:rPr>
+      </w:pPr>
+    </w:p>
+    <w:p>
+      <w:pPr>
+        <w:spacing w:after="0" w:line="360" w:lineRule="auto"/>
+        <w:jc w:val="both"/>
+        <w:rPr>
+          <w:rFonts w:ascii="Arial" w:eastAsia="Times New Roman" w:hAnsi="Arial" w:cs="Arial"/>
+          <w:b/>
+          <w:bCs/>
+          <w:color w:val="000000"/>
+          <w:kern w:val="0"/>
+          <w14:ligatures w14:val="none"/>
+        </w:rPr>
+      </w:pPr>
+    </w:p>
+    <w:p>
+      <w:pPr>
+        <w:spacing w:after="0" w:line="360" w:lineRule="auto"/>
+        <w:jc w:val="both"/>
+        <w:rPr>
+          <w:rFonts w:ascii="Arial" w:eastAsia="Times New Roman" w:hAnsi="Arial" w:cs="Arial"/>
+          <w:b/>
+          <w:bCs/>
+          <w:color w:val="000000"/>
+          <w:kern w:val="0"/>
+          <w14:ligatures w14:val="none"/>
+        </w:rPr>
+      </w:pPr>
+    </w:p>
+    <w:p>
+      <w:pPr>
+        <w:spacing w:after="0" w:line="360" w:lineRule="auto"/>
+        <w:jc w:val="both"/>
+        <w:rPr>
+          <w:rFonts w:ascii="Arial" w:eastAsia="Times New Roman" w:hAnsi="Arial" w:cs="Arial"/>
+          <w:b/>
+          <w:bCs/>
+          <w:color w:val="000000"/>
+          <w:kern w:val="0"/>
+          <w14:ligatures w14:val="none"/>
+        </w:rPr>
+      </w:pPr>
+    </w:p>
+    <w:p>
+      <w:pPr>
+        <w:spacing w:after="0" w:line="360" w:lineRule="auto"/>
+        <w:jc w:val="both"/>
+        <w:rPr>
+          <w:rFonts w:ascii="Arial" w:eastAsia="Times New Roman" w:hAnsi="Arial" w:cs="Arial"/>
+          <w:b/>
+          <w:bCs/>
+          <w:color w:val="000000"/>
+          <w:kern w:val="0"/>
+          <w14:ligatures w14:val="none"/>
+        </w:rPr>
+      </w:pPr>
+    </w:p>
+    <w:p>
+      <w:pPr>
+        <w:spacing w:after="0" w:line="360" w:lineRule="auto"/>
+        <w:ind w:firstLine="709"/>
+        <w:jc w:val="both"/>
+        <w:rPr>
+          <w:rFonts w:ascii="Arial" w:eastAsia="Times New Roman" w:hAnsi="Arial" w:cs="Arial"/>
+          <w:color w:val="000000"/>
+          <w:kern w:val="0"/>
+          <w14:ligatures w14:val="none"/>
+        </w:rPr>
+      </w:pPr>
+    </w:p>
+    <w:p>
+      <w:pPr>
+        <w:spacing w:after="0" w:line="360" w:lineRule="auto"/>
+        <w:ind w:firstLine="709"/>
+        <w:jc w:val="both"/>
+        <w:rPr>
+          <w:rFonts w:ascii="Arial" w:eastAsia="Times New Roman" w:hAnsi="Arial" w:cs="Arial"/>
+          <w:color w:val="000000"/>
+          <w:kern w:val="0"/>
+          <w14:ligatures w14:val="none"/>
+        </w:rPr>
+      </w:pPr>
     </w:p>
     <w:p>
       <w:pPr>
@@ -1748,6 +3376,7 @@
   <w:style w:type="character" w:default="1" w:styleId="Fontepargpadro">
     <w:name w:val="Default Paragraph Font"/>
     <w:uiPriority w:val="1"/>
+    <w:semiHidden/>
     <w:unhideWhenUsed/>
   </w:style>
   <w:style w:type="table" w:default="1" w:styleId="Tabelanormal">

</xml_diff>

<commit_message>
Add sobre a pagina Homepage
</commit_message>
<xml_diff>
--- a/docs/Guia-Usuario/Guia-do-Usuario.docx
+++ b/docs/Guia-Usuario/Guia-do-Usuario.docx
@@ -1123,29 +1123,7 @@
           <w:kern w:val="0"/>
           <w14:ligatures w14:val="none"/>
         </w:rPr>
-        <w:t>2</w:t>
-      </w:r>
-      <w:r>
-        <w:rPr>
-          <w:rFonts w:ascii="Arial" w:eastAsia="Times New Roman" w:hAnsi="Arial" w:cs="Arial"/>
-          <w:b/>
-          <w:bCs/>
-          <w:color w:val="000000"/>
-          <w:kern w:val="0"/>
-          <w14:ligatures w14:val="none"/>
-        </w:rPr>
-        <w:t xml:space="preserve"> – </w:t>
-      </w:r>
-      <w:r>
-        <w:rPr>
-          <w:rFonts w:ascii="Arial" w:eastAsia="Times New Roman" w:hAnsi="Arial" w:cs="Arial"/>
-          <w:b/>
-          <w:bCs/>
-          <w:color w:val="000000"/>
-          <w:kern w:val="0"/>
-          <w14:ligatures w14:val="none"/>
-        </w:rPr>
-        <w:t>PRIMEIROS PASSOS</w:t>
+        <w:t>2 – PRIMEIROS PASSOS</w:t>
       </w:r>
     </w:p>
     <w:p>
@@ -1592,7 +1570,7 @@
           <w:kern w:val="0"/>
         </w:rPr>
         <w:drawing>
-          <wp:inline distT="0" distB="0" distL="0" distR="0" wp14:anchorId="1A26D565" wp14:editId="5198A193">
+          <wp:inline distT="0" distB="0" distL="0" distR="0" wp14:anchorId="1A26D565" wp14:editId="6E4C758B">
             <wp:extent cx="6013014" cy="4248350"/>
             <wp:effectExtent l="0" t="0" r="6985" b="0"/>
             <wp:docPr id="4728309" name="Imagem 1" descr="Diagrama&#10;&#10;O conteúdo gerado por IA pode estar incorreto."/>
@@ -1658,16 +1636,787 @@
     <w:p>
       <w:pPr>
         <w:spacing w:after="0" w:line="360" w:lineRule="auto"/>
-        <w:jc w:val="both"/>
-        <w:rPr>
-          <w:rFonts w:ascii="Arial" w:eastAsia="Times New Roman" w:hAnsi="Arial" w:cs="Arial"/>
-          <w:b/>
-          <w:bCs/>
-          <w:color w:val="000000"/>
-          <w:kern w:val="0"/>
-          <w14:ligatures w14:val="none"/>
-        </w:rPr>
-      </w:pPr>
+        <w:ind w:firstLine="709"/>
+        <w:jc w:val="both"/>
+        <w:rPr>
+          <w:rFonts w:ascii="Arial" w:eastAsia="Times New Roman" w:hAnsi="Arial" w:cs="Arial"/>
+          <w:color w:val="000000"/>
+          <w:kern w:val="0"/>
+          <w14:ligatures w14:val="none"/>
+        </w:rPr>
+      </w:pPr>
+      <w:r>
+        <w:rPr>
+          <w:rFonts w:ascii="Arial" w:eastAsia="Times New Roman" w:hAnsi="Arial" w:cs="Arial"/>
+          <w:color w:val="000000"/>
+          <w:kern w:val="0"/>
+          <w14:ligatures w14:val="none"/>
+        </w:rPr>
+        <w:t xml:space="preserve">Como pode ser visto na imagem a seguir, a página de login conta com dois campos para o usuário preencher com seu e-mail e senha, além disso existe as opções de </w:t>
+      </w:r>
+      <w:r>
+        <w:rPr>
+          <w:rFonts w:ascii="Arial" w:eastAsia="Times New Roman" w:hAnsi="Arial" w:cs="Arial"/>
+          <w:b/>
+          <w:bCs/>
+          <w:color w:val="000000"/>
+          <w:kern w:val="0"/>
+          <w14:ligatures w14:val="none"/>
+        </w:rPr>
+        <w:t>“Criar uma conta”</w:t>
+      </w:r>
+      <w:r>
+        <w:rPr>
+          <w:rFonts w:ascii="Arial" w:eastAsia="Times New Roman" w:hAnsi="Arial" w:cs="Arial"/>
+          <w:color w:val="000000"/>
+          <w:kern w:val="0"/>
+          <w14:ligatures w14:val="none"/>
+        </w:rPr>
+        <w:t xml:space="preserve"> caso o usuário ainda não tenha uma e </w:t>
+      </w:r>
+      <w:r>
+        <w:rPr>
+          <w:rFonts w:ascii="Arial" w:eastAsia="Times New Roman" w:hAnsi="Arial" w:cs="Arial"/>
+          <w:b/>
+          <w:bCs/>
+          <w:color w:val="000000"/>
+          <w:kern w:val="0"/>
+          <w14:ligatures w14:val="none"/>
+        </w:rPr>
+        <w:t>“Recuperar senha”</w:t>
+      </w:r>
+      <w:r>
+        <w:rPr>
+          <w:rFonts w:ascii="Arial" w:eastAsia="Times New Roman" w:hAnsi="Arial" w:cs="Arial"/>
+          <w:color w:val="000000"/>
+          <w:kern w:val="0"/>
+          <w14:ligatures w14:val="none"/>
+        </w:rPr>
+        <w:t xml:space="preserve"> caso ele a tenha esquecido. Na parte esquerda existe uma foto d</w:t>
+      </w:r>
+      <w:r>
+        <w:rPr>
+          <w:rFonts w:ascii="Arial" w:eastAsia="Times New Roman" w:hAnsi="Arial" w:cs="Arial"/>
+          <w:color w:val="000000"/>
+          <w:kern w:val="0"/>
+          <w14:ligatures w14:val="none"/>
+        </w:rPr>
+        <w:t>a unidade SENAI Mariano Ferraz</w:t>
+      </w:r>
+      <w:r>
+        <w:rPr>
+          <w:rFonts w:ascii="Arial" w:eastAsia="Times New Roman" w:hAnsi="Arial" w:cs="Arial"/>
+          <w:color w:val="000000"/>
+          <w:kern w:val="0"/>
+          <w14:ligatures w14:val="none"/>
+        </w:rPr>
+        <w:t xml:space="preserve"> e abaixo há o rodapé com o nome da equipe que criou o projeto e cada integrante dela.</w:t>
+      </w:r>
+    </w:p>
+    <w:p>
+      <w:pPr>
+        <w:spacing w:after="0" w:line="360" w:lineRule="auto"/>
+        <w:jc w:val="both"/>
+        <w:rPr>
+          <w:rFonts w:ascii="Arial" w:eastAsia="Times New Roman" w:hAnsi="Arial" w:cs="Arial"/>
+          <w:b/>
+          <w:bCs/>
+          <w:color w:val="000000"/>
+          <w:kern w:val="0"/>
+          <w14:ligatures w14:val="none"/>
+        </w:rPr>
+      </w:pPr>
+      <w:r>
+        <w:rPr>
+          <w:rFonts w:ascii="Arial" w:eastAsia="Times New Roman" w:hAnsi="Arial" w:cs="Arial"/>
+          <w:b/>
+          <w:bCs/>
+          <w:color w:val="000000"/>
+          <w:kern w:val="0"/>
+          <w14:ligatures w14:val="none"/>
+        </w:rPr>
+        <w:lastRenderedPageBreak/>
+        <w:drawing>
+          <wp:inline distT="0" distB="0" distL="0" distR="0" wp14:anchorId="673AB8B4" wp14:editId="625D2263">
+            <wp:extent cx="5760085" cy="2851150"/>
+            <wp:effectExtent l="0" t="0" r="0" b="6350"/>
+            <wp:docPr id="1599566000" name="Imagem 1" descr="Peixe com a boca aberta&#10;&#10;O conteúdo gerado por IA pode estar incorreto."/>
+            <wp:cNvGraphicFramePr>
+              <a:graphicFrameLocks xmlns:a="http://schemas.openxmlformats.org/drawingml/2006/main" noChangeAspect="1"/>
+            </wp:cNvGraphicFramePr>
+            <a:graphic xmlns:a="http://schemas.openxmlformats.org/drawingml/2006/main">
+              <a:graphicData uri="http://schemas.openxmlformats.org/drawingml/2006/picture">
+                <pic:pic xmlns:pic="http://schemas.openxmlformats.org/drawingml/2006/picture">
+                  <pic:nvPicPr>
+                    <pic:cNvPr id="1599566000" name="Imagem 1" descr="Peixe com a boca aberta&#10;&#10;O conteúdo gerado por IA pode estar incorreto."/>
+                    <pic:cNvPicPr/>
+                  </pic:nvPicPr>
+                  <pic:blipFill>
+                    <a:blip r:embed="rId6"/>
+                    <a:stretch>
+                      <a:fillRect/>
+                    </a:stretch>
+                  </pic:blipFill>
+                  <pic:spPr>
+                    <a:xfrm>
+                      <a:off x="0" y="0"/>
+                      <a:ext cx="5760085" cy="2851150"/>
+                    </a:xfrm>
+                    <a:prstGeom prst="rect">
+                      <a:avLst/>
+                    </a:prstGeom>
+                  </pic:spPr>
+                </pic:pic>
+              </a:graphicData>
+            </a:graphic>
+          </wp:inline>
+        </w:drawing>
+      </w:r>
+    </w:p>
+    <w:p>
+      <w:pPr>
+        <w:rPr>
+          <w:rFonts w:ascii="Arial" w:eastAsia="Times New Roman" w:hAnsi="Arial" w:cs="Arial"/>
+          <w:b/>
+          <w:bCs/>
+          <w:color w:val="000000"/>
+          <w:kern w:val="0"/>
+          <w14:ligatures w14:val="none"/>
+        </w:rPr>
+      </w:pPr>
+    </w:p>
+    <w:p>
+      <w:pPr>
+        <w:spacing w:after="0" w:line="360" w:lineRule="auto"/>
+        <w:ind w:firstLine="709"/>
+        <w:jc w:val="both"/>
+        <w:rPr>
+          <w:rFonts w:ascii="Arial" w:eastAsia="Times New Roman" w:hAnsi="Arial" w:cs="Arial"/>
+          <w:color w:val="000000"/>
+          <w:kern w:val="0"/>
+          <w14:ligatures w14:val="none"/>
+        </w:rPr>
+      </w:pPr>
+      <w:r>
+        <w:rPr>
+          <w:rFonts w:ascii="Arial" w:eastAsia="Times New Roman" w:hAnsi="Arial" w:cs="Arial"/>
+          <w:color w:val="000000"/>
+          <w:kern w:val="0"/>
+          <w14:ligatures w14:val="none"/>
+        </w:rPr>
+        <w:t xml:space="preserve">Assim que a autenticação for realizada, o usuário será </w:t>
+      </w:r>
+      <w:r>
+        <w:rPr>
+          <w:rFonts w:ascii="Arial" w:eastAsia="Times New Roman" w:hAnsi="Arial" w:cs="Arial"/>
+          <w:color w:val="000000"/>
+          <w:kern w:val="0"/>
+          <w14:ligatures w14:val="none"/>
+        </w:rPr>
+        <w:t xml:space="preserve">direcionado </w:t>
+      </w:r>
+      <w:r>
+        <w:rPr>
+          <w:rFonts w:ascii="Arial" w:eastAsia="Times New Roman" w:hAnsi="Arial" w:cs="Arial"/>
+          <w:color w:val="000000"/>
+          <w:kern w:val="0"/>
+          <w14:ligatures w14:val="none"/>
+        </w:rPr>
+        <w:t>para a tela “</w:t>
+      </w:r>
+      <w:r>
+        <w:rPr>
+          <w:rFonts w:ascii="Arial" w:eastAsia="Times New Roman" w:hAnsi="Arial" w:cs="Arial"/>
+          <w:b/>
+          <w:bCs/>
+          <w:color w:val="000000"/>
+          <w:kern w:val="0"/>
+          <w14:ligatures w14:val="none"/>
+        </w:rPr>
+        <w:t>Homepage</w:t>
+      </w:r>
+      <w:r>
+        <w:rPr>
+          <w:rFonts w:ascii="Arial" w:eastAsia="Times New Roman" w:hAnsi="Arial" w:cs="Arial"/>
+          <w:color w:val="000000"/>
+          <w:kern w:val="0"/>
+          <w14:ligatures w14:val="none"/>
+        </w:rPr>
+        <w:t>”. O cabeça</w:t>
+      </w:r>
+      <w:r>
+        <w:rPr>
+          <w:rFonts w:ascii="Arial" w:eastAsia="Times New Roman" w:hAnsi="Arial" w:cs="Arial"/>
+          <w:color w:val="000000"/>
+          <w:kern w:val="0"/>
+          <w14:ligatures w14:val="none"/>
+        </w:rPr>
+        <w:t>lho</w:t>
+      </w:r>
+      <w:r>
+        <w:rPr>
+          <w:rFonts w:ascii="Arial" w:eastAsia="Times New Roman" w:hAnsi="Arial" w:cs="Arial"/>
+          <w:color w:val="000000"/>
+          <w:kern w:val="0"/>
+          <w14:ligatures w14:val="none"/>
+        </w:rPr>
+        <w:t xml:space="preserve"> </w:t>
+      </w:r>
+      <w:r>
+        <w:rPr>
+          <w:rFonts w:ascii="Arial" w:eastAsia="Times New Roman" w:hAnsi="Arial" w:cs="Arial"/>
+          <w:color w:val="000000"/>
+          <w:kern w:val="0"/>
+          <w14:ligatures w14:val="none"/>
+        </w:rPr>
+        <w:t>da tela</w:t>
+      </w:r>
+      <w:r>
+        <w:rPr>
+          <w:rFonts w:ascii="Arial" w:eastAsia="Times New Roman" w:hAnsi="Arial" w:cs="Arial"/>
+          <w:color w:val="000000"/>
+          <w:kern w:val="0"/>
+          <w14:ligatures w14:val="none"/>
+        </w:rPr>
+        <w:t xml:space="preserve"> contém a</w:t>
+      </w:r>
+      <w:r>
+        <w:rPr>
+          <w:rFonts w:ascii="Arial" w:eastAsia="Times New Roman" w:hAnsi="Arial" w:cs="Arial"/>
+          <w:color w:val="000000"/>
+          <w:kern w:val="0"/>
+          <w14:ligatures w14:val="none"/>
+        </w:rPr>
+        <w:t>s</w:t>
+      </w:r>
+      <w:r>
+        <w:rPr>
+          <w:rFonts w:ascii="Arial" w:eastAsia="Times New Roman" w:hAnsi="Arial" w:cs="Arial"/>
+          <w:color w:val="000000"/>
+          <w:kern w:val="0"/>
+          <w14:ligatures w14:val="none"/>
+        </w:rPr>
+        <w:t xml:space="preserve"> logo</w:t>
+      </w:r>
+      <w:r>
+        <w:rPr>
+          <w:rFonts w:ascii="Arial" w:eastAsia="Times New Roman" w:hAnsi="Arial" w:cs="Arial"/>
+          <w:color w:val="000000"/>
+          <w:kern w:val="0"/>
+          <w14:ligatures w14:val="none"/>
+        </w:rPr>
+        <w:t>marcas</w:t>
+      </w:r>
+      <w:r>
+        <w:rPr>
+          <w:rFonts w:ascii="Arial" w:eastAsia="Times New Roman" w:hAnsi="Arial" w:cs="Arial"/>
+          <w:color w:val="000000"/>
+          <w:kern w:val="0"/>
+          <w14:ligatures w14:val="none"/>
+        </w:rPr>
+        <w:t xml:space="preserve"> de todas as organizações </w:t>
+      </w:r>
+      <w:r>
+        <w:rPr>
+          <w:rFonts w:ascii="Arial" w:eastAsia="Times New Roman" w:hAnsi="Arial" w:cs="Arial"/>
+          <w:color w:val="000000"/>
+          <w:kern w:val="0"/>
+          <w14:ligatures w14:val="none"/>
+        </w:rPr>
+        <w:t>que compõem o</w:t>
+      </w:r>
+      <w:r>
+        <w:rPr>
+          <w:rFonts w:ascii="Arial" w:eastAsia="Times New Roman" w:hAnsi="Arial" w:cs="Arial"/>
+          <w:color w:val="000000"/>
+          <w:kern w:val="0"/>
+          <w14:ligatures w14:val="none"/>
+        </w:rPr>
+        <w:t xml:space="preserve"> </w:t>
+      </w:r>
+      <w:r>
+        <w:rPr>
+          <w:rFonts w:ascii="Arial" w:eastAsia="Times New Roman" w:hAnsi="Arial" w:cs="Arial"/>
+          <w:color w:val="000000"/>
+          <w:kern w:val="0"/>
+          <w14:ligatures w14:val="none"/>
+        </w:rPr>
+        <w:t>“</w:t>
+      </w:r>
+      <w:r>
+        <w:rPr>
+          <w:rFonts w:ascii="Arial" w:eastAsia="Times New Roman" w:hAnsi="Arial" w:cs="Arial"/>
+          <w:b/>
+          <w:bCs/>
+          <w:color w:val="000000"/>
+          <w:kern w:val="0"/>
+          <w14:ligatures w14:val="none"/>
+        </w:rPr>
+        <w:t>Sistema S</w:t>
+      </w:r>
+      <w:r>
+        <w:rPr>
+          <w:rFonts w:ascii="Arial" w:eastAsia="Times New Roman" w:hAnsi="Arial" w:cs="Arial"/>
+          <w:color w:val="000000"/>
+          <w:kern w:val="0"/>
+          <w14:ligatures w14:val="none"/>
+        </w:rPr>
+        <w:t>”</w:t>
+      </w:r>
+      <w:r>
+        <w:rPr>
+          <w:rFonts w:ascii="Arial" w:eastAsia="Times New Roman" w:hAnsi="Arial" w:cs="Arial"/>
+          <w:color w:val="000000"/>
+          <w:kern w:val="0"/>
+          <w14:ligatures w14:val="none"/>
+        </w:rPr>
+        <w:t xml:space="preserve">, a logo do SENAI, o horário oficial de Brasília e a temperatura atual. </w:t>
+      </w:r>
+    </w:p>
+    <w:p>
+      <w:pPr>
+        <w:spacing w:after="0" w:line="360" w:lineRule="auto"/>
+        <w:ind w:firstLine="709"/>
+        <w:jc w:val="both"/>
+        <w:rPr>
+          <w:rFonts w:ascii="Arial" w:eastAsia="Times New Roman" w:hAnsi="Arial" w:cs="Arial"/>
+          <w:color w:val="000000"/>
+          <w:kern w:val="0"/>
+          <w14:ligatures w14:val="none"/>
+        </w:rPr>
+      </w:pPr>
+      <w:r>
+        <w:rPr>
+          <w:rFonts w:ascii="Arial" w:eastAsia="Times New Roman" w:hAnsi="Arial" w:cs="Arial"/>
+          <w:color w:val="000000"/>
+          <w:kern w:val="0"/>
+          <w14:ligatures w14:val="none"/>
+        </w:rPr>
+        <w:t xml:space="preserve">Na região central </w:t>
+      </w:r>
+      <w:r>
+        <w:rPr>
+          <w:rFonts w:ascii="Arial" w:eastAsia="Times New Roman" w:hAnsi="Arial" w:cs="Arial"/>
+          <w:color w:val="000000"/>
+          <w:kern w:val="0"/>
+          <w14:ligatures w14:val="none"/>
+        </w:rPr>
+        <w:t xml:space="preserve">da tela, são exibidos </w:t>
+      </w:r>
+      <w:r>
+        <w:rPr>
+          <w:rFonts w:ascii="Arial" w:eastAsia="Times New Roman" w:hAnsi="Arial" w:cs="Arial"/>
+          <w:color w:val="000000"/>
+          <w:kern w:val="0"/>
+          <w14:ligatures w14:val="none"/>
+        </w:rPr>
+        <w:t xml:space="preserve">cards </w:t>
+      </w:r>
+      <w:r>
+        <w:rPr>
+          <w:rFonts w:ascii="Arial" w:eastAsia="Times New Roman" w:hAnsi="Arial" w:cs="Arial"/>
+          <w:color w:val="000000"/>
+          <w:kern w:val="0"/>
+          <w14:ligatures w14:val="none"/>
+        </w:rPr>
+        <w:t xml:space="preserve">contendo </w:t>
+      </w:r>
+      <w:r>
+        <w:rPr>
+          <w:rFonts w:ascii="Arial" w:eastAsia="Times New Roman" w:hAnsi="Arial" w:cs="Arial"/>
+          <w:color w:val="000000"/>
+          <w:kern w:val="0"/>
+          <w14:ligatures w14:val="none"/>
+        </w:rPr>
+        <w:t>o nome de cada página do sistema</w:t>
+      </w:r>
+      <w:r>
+        <w:rPr>
+          <w:rFonts w:ascii="Arial" w:eastAsia="Times New Roman" w:hAnsi="Arial" w:cs="Arial"/>
+          <w:color w:val="000000"/>
+          <w:kern w:val="0"/>
+          <w14:ligatures w14:val="none"/>
+        </w:rPr>
+        <w:t>. A</w:t>
+      </w:r>
+      <w:r>
+        <w:rPr>
+          <w:rFonts w:ascii="Arial" w:eastAsia="Times New Roman" w:hAnsi="Arial" w:cs="Arial"/>
+          <w:color w:val="000000"/>
+          <w:kern w:val="0"/>
+          <w14:ligatures w14:val="none"/>
+        </w:rPr>
+        <w:t xml:space="preserve">o clicar </w:t>
+      </w:r>
+      <w:r>
+        <w:rPr>
+          <w:rFonts w:ascii="Arial" w:eastAsia="Times New Roman" w:hAnsi="Arial" w:cs="Arial"/>
+          <w:color w:val="000000"/>
+          <w:kern w:val="0"/>
+          <w14:ligatures w14:val="none"/>
+        </w:rPr>
+        <w:t>em um dos cards o</w:t>
+      </w:r>
+      <w:r>
+        <w:rPr>
+          <w:rFonts w:ascii="Arial" w:eastAsia="Times New Roman" w:hAnsi="Arial" w:cs="Arial"/>
+          <w:color w:val="000000"/>
+          <w:kern w:val="0"/>
+          <w14:ligatures w14:val="none"/>
+        </w:rPr>
+        <w:t xml:space="preserve"> usuário será </w:t>
+      </w:r>
+      <w:r>
+        <w:rPr>
+          <w:rFonts w:ascii="Arial" w:eastAsia="Times New Roman" w:hAnsi="Arial" w:cs="Arial"/>
+          <w:color w:val="000000"/>
+          <w:kern w:val="0"/>
+          <w14:ligatures w14:val="none"/>
+        </w:rPr>
+        <w:t xml:space="preserve">direcionado </w:t>
+      </w:r>
+      <w:r>
+        <w:rPr>
+          <w:rFonts w:ascii="Arial" w:eastAsia="Times New Roman" w:hAnsi="Arial" w:cs="Arial"/>
+          <w:color w:val="000000"/>
+          <w:kern w:val="0"/>
+          <w14:ligatures w14:val="none"/>
+        </w:rPr>
+        <w:t xml:space="preserve">para </w:t>
+      </w:r>
+      <w:r>
+        <w:rPr>
+          <w:rFonts w:ascii="Arial" w:eastAsia="Times New Roman" w:hAnsi="Arial" w:cs="Arial"/>
+          <w:color w:val="000000"/>
+          <w:kern w:val="0"/>
+          <w14:ligatures w14:val="none"/>
+        </w:rPr>
+        <w:t>a</w:t>
+      </w:r>
+      <w:r>
+        <w:rPr>
+          <w:rFonts w:ascii="Arial" w:eastAsia="Times New Roman" w:hAnsi="Arial" w:cs="Arial"/>
+          <w:color w:val="000000"/>
+          <w:kern w:val="0"/>
+          <w14:ligatures w14:val="none"/>
+        </w:rPr>
+        <w:t xml:space="preserve"> respectiv</w:t>
+      </w:r>
+      <w:r>
+        <w:rPr>
+          <w:rFonts w:ascii="Arial" w:eastAsia="Times New Roman" w:hAnsi="Arial" w:cs="Arial"/>
+          <w:color w:val="000000"/>
+          <w:kern w:val="0"/>
+          <w14:ligatures w14:val="none"/>
+        </w:rPr>
+        <w:t>a página</w:t>
+      </w:r>
+      <w:r>
+        <w:rPr>
+          <w:rFonts w:ascii="Arial" w:eastAsia="Times New Roman" w:hAnsi="Arial" w:cs="Arial"/>
+          <w:color w:val="000000"/>
+          <w:kern w:val="0"/>
+          <w14:ligatures w14:val="none"/>
+        </w:rPr>
+        <w:t xml:space="preserve">. </w:t>
+      </w:r>
+      <w:r>
+        <w:rPr>
+          <w:rFonts w:ascii="Arial" w:eastAsia="Times New Roman" w:hAnsi="Arial" w:cs="Arial"/>
+          <w:color w:val="000000"/>
+          <w:kern w:val="0"/>
+          <w14:ligatures w14:val="none"/>
+        </w:rPr>
+        <w:t>Ao criar ou deletar uma nova página, também será criado ou deletado o respectivo card que representa a página e se o administrador alterar o nome de uma das páginas também será alterado o nome do card.</w:t>
+      </w:r>
+    </w:p>
+    <w:p>
+      <w:pPr>
+        <w:spacing w:after="0" w:line="360" w:lineRule="auto"/>
+        <w:ind w:firstLine="709"/>
+        <w:jc w:val="both"/>
+        <w:rPr>
+          <w:rFonts w:ascii="Arial" w:eastAsia="Times New Roman" w:hAnsi="Arial" w:cs="Arial"/>
+          <w:color w:val="000000"/>
+          <w:kern w:val="0"/>
+          <w14:ligatures w14:val="none"/>
+        </w:rPr>
+      </w:pPr>
+      <w:r>
+        <w:rPr>
+          <w:rFonts w:ascii="Arial" w:eastAsia="Times New Roman" w:hAnsi="Arial" w:cs="Arial"/>
+          <w:color w:val="000000"/>
+          <w:kern w:val="0"/>
+          <w14:ligatures w14:val="none"/>
+        </w:rPr>
+        <w:t>Logo abaixo d</w:t>
+      </w:r>
+      <w:r>
+        <w:rPr>
+          <w:rFonts w:ascii="Arial" w:eastAsia="Times New Roman" w:hAnsi="Arial" w:cs="Arial"/>
+          <w:color w:val="000000"/>
+          <w:kern w:val="0"/>
+          <w14:ligatures w14:val="none"/>
+        </w:rPr>
+        <w:t xml:space="preserve">os </w:t>
+      </w:r>
+      <w:r>
+        <w:rPr>
+          <w:rFonts w:ascii="Arial" w:eastAsia="Times New Roman" w:hAnsi="Arial" w:cs="Arial"/>
+          <w:color w:val="000000"/>
+          <w:kern w:val="0"/>
+          <w14:ligatures w14:val="none"/>
+        </w:rPr>
+        <w:t>cards</w:t>
+      </w:r>
+      <w:r>
+        <w:rPr>
+          <w:rFonts w:ascii="Arial" w:eastAsia="Times New Roman" w:hAnsi="Arial" w:cs="Arial"/>
+          <w:color w:val="000000"/>
+          <w:kern w:val="0"/>
+          <w14:ligatures w14:val="none"/>
+        </w:rPr>
+        <w:t xml:space="preserve">, há </w:t>
+      </w:r>
+      <w:r>
+        <w:rPr>
+          <w:rFonts w:ascii="Arial" w:eastAsia="Times New Roman" w:hAnsi="Arial" w:cs="Arial"/>
+          <w:color w:val="000000"/>
+          <w:kern w:val="0"/>
+          <w14:ligatures w14:val="none"/>
+        </w:rPr>
+        <w:t xml:space="preserve">um carrossel </w:t>
+      </w:r>
+      <w:r>
+        <w:rPr>
+          <w:rFonts w:ascii="Arial" w:eastAsia="Times New Roman" w:hAnsi="Arial" w:cs="Arial"/>
+          <w:color w:val="000000"/>
+          <w:kern w:val="0"/>
+          <w14:ligatures w14:val="none"/>
+        </w:rPr>
+        <w:t xml:space="preserve">que apresenta </w:t>
+      </w:r>
+      <w:r>
+        <w:rPr>
+          <w:rFonts w:ascii="Arial" w:eastAsia="Times New Roman" w:hAnsi="Arial" w:cs="Arial"/>
+          <w:color w:val="000000"/>
+          <w:kern w:val="0"/>
+          <w14:ligatures w14:val="none"/>
+        </w:rPr>
+        <w:t>as notícias disponíveis no sistema</w:t>
+      </w:r>
+      <w:r>
+        <w:rPr>
+          <w:rFonts w:ascii="Arial" w:eastAsia="Times New Roman" w:hAnsi="Arial" w:cs="Arial"/>
+          <w:color w:val="000000"/>
+          <w:kern w:val="0"/>
+          <w14:ligatures w14:val="none"/>
+        </w:rPr>
+        <w:t xml:space="preserve"> através de uma imagem, ao clicar em uma notícia o usuário será direcionado para a respectiva página. O administrador é capaz de editar, adicionar e remover notícias do sistema</w:t>
+      </w:r>
+      <w:r>
+        <w:rPr>
+          <w:rFonts w:ascii="Arial" w:eastAsia="Times New Roman" w:hAnsi="Arial" w:cs="Arial"/>
+          <w:color w:val="000000"/>
+          <w:kern w:val="0"/>
+          <w14:ligatures w14:val="none"/>
+        </w:rPr>
+        <w:t>, caso seja adicionado uma nova notícia ou uma seja deletada o carrossel irá acompanhar essa mudança e se atualizará.</w:t>
+      </w:r>
+    </w:p>
+    <w:p>
+      <w:pPr>
+        <w:spacing w:after="0" w:line="360" w:lineRule="auto"/>
+        <w:ind w:firstLine="709"/>
+        <w:jc w:val="both"/>
+        <w:rPr>
+          <w:rFonts w:ascii="Arial" w:eastAsia="Times New Roman" w:hAnsi="Arial" w:cs="Arial"/>
+          <w:color w:val="000000"/>
+          <w:kern w:val="0"/>
+          <w14:ligatures w14:val="none"/>
+        </w:rPr>
+      </w:pPr>
+      <w:r>
+        <w:rPr>
+          <w:rFonts w:ascii="Arial" w:eastAsia="Times New Roman" w:hAnsi="Arial" w:cs="Arial"/>
+          <w:color w:val="000000"/>
+          <w:kern w:val="0"/>
+          <w14:ligatures w14:val="none"/>
+        </w:rPr>
+        <w:t>Por fim, na parte inferior da página o rodapé aparece novamente contendo o nome da equipe que realizou o projeto e cada um de seus integrantes. O rodapé e o cabeçalho são elementos que se repetem em todas as páginas do sistema.</w:t>
+      </w:r>
+    </w:p>
+    <w:p>
+      <w:pPr>
+        <w:spacing w:after="0" w:line="360" w:lineRule="auto"/>
+        <w:ind w:firstLine="709"/>
+        <w:jc w:val="both"/>
+        <w:rPr>
+          <w:rFonts w:ascii="Arial" w:eastAsia="Times New Roman" w:hAnsi="Arial" w:cs="Arial"/>
+          <w:color w:val="000000"/>
+          <w:kern w:val="0"/>
+          <w14:ligatures w14:val="none"/>
+        </w:rPr>
+      </w:pPr>
+      <w:r>
+        <w:rPr>
+          <w:rFonts w:ascii="Arial" w:eastAsia="Times New Roman" w:hAnsi="Arial" w:cs="Arial"/>
+          <w:color w:val="000000"/>
+          <w:kern w:val="0"/>
+          <w14:ligatures w14:val="none"/>
+        </w:rPr>
+        <w:t>Todas essas informações sobre a “</w:t>
+      </w:r>
+      <w:r>
+        <w:rPr>
+          <w:rFonts w:ascii="Arial" w:eastAsia="Times New Roman" w:hAnsi="Arial" w:cs="Arial"/>
+          <w:b/>
+          <w:bCs/>
+          <w:color w:val="000000"/>
+          <w:kern w:val="0"/>
+          <w14:ligatures w14:val="none"/>
+        </w:rPr>
+        <w:t>Homepage</w:t>
+      </w:r>
+      <w:r>
+        <w:rPr>
+          <w:rFonts w:ascii="Arial" w:eastAsia="Times New Roman" w:hAnsi="Arial" w:cs="Arial"/>
+          <w:color w:val="000000"/>
+          <w:kern w:val="0"/>
+          <w14:ligatures w14:val="none"/>
+        </w:rPr>
+        <w:t>” podem ser vistas na figura a seguir</w:t>
+      </w:r>
+    </w:p>
+    <w:p>
+      <w:pPr>
+        <w:jc w:val="center"/>
+        <w:rPr>
+          <w:rFonts w:ascii="Arial" w:eastAsia="Times New Roman" w:hAnsi="Arial" w:cs="Arial"/>
+          <w:b/>
+          <w:bCs/>
+          <w:color w:val="000000"/>
+          <w:kern w:val="0"/>
+          <w14:ligatures w14:val="none"/>
+        </w:rPr>
+      </w:pPr>
+      <w:r>
+        <w:rPr>
+          <w:rFonts w:ascii="Arial" w:eastAsia="Times New Roman" w:hAnsi="Arial" w:cs="Arial"/>
+          <w:b/>
+          <w:bCs/>
+          <w:color w:val="000000"/>
+          <w:kern w:val="0"/>
+          <w14:ligatures w14:val="none"/>
+        </w:rPr>
+        <w:lastRenderedPageBreak/>
+        <w:drawing>
+          <wp:inline distT="0" distB="0" distL="0" distR="0" wp14:anchorId="525DD7A6" wp14:editId="7755CB5A">
+            <wp:extent cx="4754354" cy="7476996"/>
+            <wp:effectExtent l="0" t="0" r="8255" b="0"/>
+            <wp:docPr id="278602338" name="Imagem 1" descr="Interface gráfica do usuário&#10;&#10;O conteúdo gerado por IA pode estar incorreto."/>
+            <wp:cNvGraphicFramePr>
+              <a:graphicFrameLocks xmlns:a="http://schemas.openxmlformats.org/drawingml/2006/main" noChangeAspect="1"/>
+            </wp:cNvGraphicFramePr>
+            <a:graphic xmlns:a="http://schemas.openxmlformats.org/drawingml/2006/main">
+              <a:graphicData uri="http://schemas.openxmlformats.org/drawingml/2006/picture">
+                <pic:pic xmlns:pic="http://schemas.openxmlformats.org/drawingml/2006/picture">
+                  <pic:nvPicPr>
+                    <pic:cNvPr id="278602338" name="Imagem 1" descr="Interface gráfica do usuário&#10;&#10;O conteúdo gerado por IA pode estar incorreto."/>
+                    <pic:cNvPicPr/>
+                  </pic:nvPicPr>
+                  <pic:blipFill>
+                    <a:blip r:embed="rId7"/>
+                    <a:stretch>
+                      <a:fillRect/>
+                    </a:stretch>
+                  </pic:blipFill>
+                  <pic:spPr>
+                    <a:xfrm>
+                      <a:off x="0" y="0"/>
+                      <a:ext cx="4773684" cy="7507396"/>
+                    </a:xfrm>
+                    <a:prstGeom prst="rect">
+                      <a:avLst/>
+                    </a:prstGeom>
+                  </pic:spPr>
+                </pic:pic>
+              </a:graphicData>
+            </a:graphic>
+          </wp:inline>
+        </w:drawing>
+      </w:r>
+    </w:p>
+    <w:p>
+      <w:pPr>
+        <w:rPr>
+          <w:rFonts w:ascii="Arial" w:eastAsia="Times New Roman" w:hAnsi="Arial" w:cs="Arial"/>
+          <w:b/>
+          <w:bCs/>
+          <w:color w:val="000000"/>
+          <w:kern w:val="0"/>
+          <w14:ligatures w14:val="none"/>
+        </w:rPr>
+      </w:pPr>
+      <w:r>
+        <w:rPr>
+          <w:rFonts w:ascii="Arial" w:eastAsia="Times New Roman" w:hAnsi="Arial" w:cs="Arial"/>
+          <w:b/>
+          <w:bCs/>
+          <w:color w:val="000000"/>
+          <w:kern w:val="0"/>
+          <w14:ligatures w14:val="none"/>
+        </w:rPr>
+        <w:br w:type="page"/>
+      </w:r>
+    </w:p>
+    <w:p>
+      <w:pPr>
+        <w:rPr>
+          <w:rFonts w:ascii="Arial" w:eastAsia="Times New Roman" w:hAnsi="Arial" w:cs="Arial"/>
+          <w:b/>
+          <w:bCs/>
+          <w:color w:val="000000"/>
+          <w:kern w:val="0"/>
+          <w14:ligatures w14:val="none"/>
+        </w:rPr>
+      </w:pPr>
+    </w:p>
+    <w:p>
+      <w:pPr>
+        <w:spacing w:after="0" w:line="360" w:lineRule="auto"/>
+        <w:jc w:val="both"/>
+        <w:rPr>
+          <w:rFonts w:ascii="Arial" w:eastAsia="Times New Roman" w:hAnsi="Arial" w:cs="Arial"/>
+          <w:b/>
+          <w:bCs/>
+          <w:color w:val="000000"/>
+          <w:kern w:val="0"/>
+          <w14:ligatures w14:val="none"/>
+        </w:rPr>
+      </w:pPr>
+      <w:r>
+        <w:rPr>
+          <w:rFonts w:ascii="Arial" w:eastAsia="Times New Roman" w:hAnsi="Arial" w:cs="Arial"/>
+          <w:b/>
+          <w:bCs/>
+          <w:color w:val="000000"/>
+          <w:kern w:val="0"/>
+          <w14:ligatures w14:val="none"/>
+        </w:rPr>
+        <w:t xml:space="preserve">CAPÍTULO </w:t>
+      </w:r>
+      <w:r>
+        <w:rPr>
+          <w:rFonts w:ascii="Arial" w:eastAsia="Times New Roman" w:hAnsi="Arial" w:cs="Arial"/>
+          <w:b/>
+          <w:bCs/>
+          <w:color w:val="000000"/>
+          <w:kern w:val="0"/>
+          <w14:ligatures w14:val="none"/>
+        </w:rPr>
+        <w:t>4 - GUIA RÁPIDO</w:t>
+      </w:r>
     </w:p>
     <w:p>
       <w:pPr>
@@ -1726,51 +2475,7 @@
           <w:kern w:val="0"/>
           <w14:ligatures w14:val="none"/>
         </w:rPr>
-        <w:t>4</w:t>
-      </w:r>
-      <w:r>
-        <w:rPr>
-          <w:rFonts w:ascii="Arial" w:eastAsia="Times New Roman" w:hAnsi="Arial" w:cs="Arial"/>
-          <w:b/>
-          <w:bCs/>
-          <w:color w:val="000000"/>
-          <w:kern w:val="0"/>
-          <w14:ligatures w14:val="none"/>
-        </w:rPr>
-        <w:t xml:space="preserve"> </w:t>
-      </w:r>
-      <w:r>
-        <w:rPr>
-          <w:rFonts w:ascii="Arial" w:eastAsia="Times New Roman" w:hAnsi="Arial" w:cs="Arial"/>
-          <w:b/>
-          <w:bCs/>
-          <w:color w:val="000000"/>
-          <w:kern w:val="0"/>
-          <w14:ligatures w14:val="none"/>
-        </w:rPr>
-        <w:t>-</w:t>
-      </w:r>
-      <w:r>
-        <w:rPr>
-          <w:rFonts w:ascii="Arial" w:eastAsia="Times New Roman" w:hAnsi="Arial" w:cs="Arial"/>
-          <w:b/>
-          <w:bCs/>
-          <w:color w:val="000000"/>
-          <w:kern w:val="0"/>
-          <w14:ligatures w14:val="none"/>
-        </w:rPr>
-        <w:t xml:space="preserve"> </w:t>
-      </w:r>
-      <w:r>
-        <w:rPr>
-          <w:rFonts w:ascii="Arial" w:eastAsia="Times New Roman" w:hAnsi="Arial" w:cs="Arial"/>
-          <w:b/>
-          <w:bCs/>
-          <w:color w:val="000000"/>
-          <w:kern w:val="0"/>
-          <w14:ligatures w14:val="none"/>
-        </w:rPr>
-        <w:t>GUIA RÁPIDO</w:t>
+        <w:t>5 – COMO REALIZAR TAREFAS</w:t>
       </w:r>
     </w:p>
     <w:p>
@@ -1830,7 +2535,7 @@
           <w:kern w:val="0"/>
           <w14:ligatures w14:val="none"/>
         </w:rPr>
-        <w:t>5 – COMO REALIZAR TAREFAS</w:t>
+        <w:t>6 – RECURSOS DO SISTEMA</w:t>
       </w:r>
     </w:p>
     <w:p>
@@ -1890,7 +2595,7 @@
           <w:kern w:val="0"/>
           <w14:ligatures w14:val="none"/>
         </w:rPr>
-        <w:t>6 – RECURSOS DO SISTEMA</w:t>
+        <w:t>7 – FLUXOS DE TRABALAHO</w:t>
       </w:r>
     </w:p>
     <w:p>
@@ -1950,7 +2655,7 @@
           <w:kern w:val="0"/>
           <w14:ligatures w14:val="none"/>
         </w:rPr>
-        <w:t>7 – FLUXOS DE TRABALAHO</w:t>
+        <w:t>8 – SOLUÇÃO DE PROBLEMAS</w:t>
       </w:r>
     </w:p>
     <w:p>
@@ -2010,89 +2715,7 @@
           <w:kern w:val="0"/>
           <w14:ligatures w14:val="none"/>
         </w:rPr>
-        <w:t>8 – SOLUÇÃO DE PROBLEMAS</w:t>
-      </w:r>
-    </w:p>
-    <w:p>
-      <w:pPr>
-        <w:rPr>
-          <w:rFonts w:ascii="Arial" w:eastAsia="Times New Roman" w:hAnsi="Arial" w:cs="Arial"/>
-          <w:b/>
-          <w:bCs/>
-          <w:color w:val="000000"/>
-          <w:kern w:val="0"/>
-          <w14:ligatures w14:val="none"/>
-        </w:rPr>
-      </w:pPr>
-      <w:r>
-        <w:rPr>
-          <w:rFonts w:ascii="Arial" w:eastAsia="Times New Roman" w:hAnsi="Arial" w:cs="Arial"/>
-          <w:b/>
-          <w:bCs/>
-          <w:color w:val="000000"/>
-          <w:kern w:val="0"/>
-          <w14:ligatures w14:val="none"/>
-        </w:rPr>
-        <w:br w:type="page"/>
-      </w:r>
-    </w:p>
-    <w:p>
-      <w:pPr>
-        <w:spacing w:after="0" w:line="360" w:lineRule="auto"/>
-        <w:jc w:val="both"/>
-        <w:rPr>
-          <w:rFonts w:ascii="Arial" w:eastAsia="Times New Roman" w:hAnsi="Arial" w:cs="Arial"/>
-          <w:b/>
-          <w:bCs/>
-          <w:color w:val="000000"/>
-          <w:kern w:val="0"/>
-          <w14:ligatures w14:val="none"/>
-        </w:rPr>
-      </w:pPr>
-      <w:r>
-        <w:rPr>
-          <w:rFonts w:ascii="Arial" w:eastAsia="Times New Roman" w:hAnsi="Arial" w:cs="Arial"/>
-          <w:b/>
-          <w:bCs/>
-          <w:color w:val="000000"/>
-          <w:kern w:val="0"/>
-          <w14:ligatures w14:val="none"/>
-        </w:rPr>
-        <w:lastRenderedPageBreak/>
-        <w:t xml:space="preserve">CAPÍTULO </w:t>
-      </w:r>
-      <w:r>
-        <w:rPr>
-          <w:rFonts w:ascii="Arial" w:eastAsia="Times New Roman" w:hAnsi="Arial" w:cs="Arial"/>
-          <w:b/>
-          <w:bCs/>
-          <w:color w:val="000000"/>
-          <w:kern w:val="0"/>
-          <w14:ligatures w14:val="none"/>
-        </w:rPr>
-        <w:t>9</w:t>
-      </w:r>
-      <w:r>
-        <w:rPr>
-          <w:rFonts w:ascii="Arial" w:eastAsia="Times New Roman" w:hAnsi="Arial" w:cs="Arial"/>
-          <w:b/>
-          <w:bCs/>
-          <w:color w:val="000000"/>
-          <w:kern w:val="0"/>
-          <w14:ligatures w14:val="none"/>
-        </w:rPr>
-        <w:t xml:space="preserve"> – </w:t>
-      </w:r>
-      <w:r>
-        <w:rPr>
-          <w:rFonts w:ascii="Arial" w:eastAsia="Times New Roman" w:hAnsi="Arial" w:cs="Arial"/>
-          <w:b/>
-          <w:bCs/>
-          <w:color w:val="000000"/>
-          <w:kern w:val="0"/>
-          <w14:ligatures w14:val="none"/>
-        </w:rPr>
-        <w:t>PERGUNTAS FREQUENTES</w:t>
+        <w:t>9 – PERGUNTAS FREQUENTES</w:t>
       </w:r>
     </w:p>
     <w:p>
@@ -2152,29 +2775,7 @@
           <w:kern w:val="0"/>
           <w14:ligatures w14:val="none"/>
         </w:rPr>
-        <w:t>0</w:t>
-      </w:r>
-      <w:r>
-        <w:rPr>
-          <w:rFonts w:ascii="Arial" w:eastAsia="Times New Roman" w:hAnsi="Arial" w:cs="Arial"/>
-          <w:b/>
-          <w:bCs/>
-          <w:color w:val="000000"/>
-          <w:kern w:val="0"/>
-          <w14:ligatures w14:val="none"/>
-        </w:rPr>
-        <w:t xml:space="preserve"> – </w:t>
-      </w:r>
-      <w:r>
-        <w:rPr>
-          <w:rFonts w:ascii="Arial" w:eastAsia="Times New Roman" w:hAnsi="Arial" w:cs="Arial"/>
-          <w:b/>
-          <w:bCs/>
-          <w:color w:val="000000"/>
-          <w:kern w:val="0"/>
-          <w14:ligatures w14:val="none"/>
-        </w:rPr>
-        <w:t>SEGURANÇA</w:t>
+        <w:t>0 – SEGURANÇA</w:t>
       </w:r>
     </w:p>
     <w:p>
@@ -2294,29 +2895,7 @@
           <w:kern w:val="0"/>
           <w14:ligatures w14:val="none"/>
         </w:rPr>
-        <w:t>2</w:t>
-      </w:r>
-      <w:r>
-        <w:rPr>
-          <w:rFonts w:ascii="Arial" w:eastAsia="Times New Roman" w:hAnsi="Arial" w:cs="Arial"/>
-          <w:b/>
-          <w:bCs/>
-          <w:color w:val="000000"/>
-          <w:kern w:val="0"/>
-          <w14:ligatures w14:val="none"/>
-        </w:rPr>
-        <w:t xml:space="preserve"> </w:t>
-      </w:r>
-      <w:r>
-        <w:rPr>
-          <w:rFonts w:ascii="Arial" w:eastAsia="Times New Roman" w:hAnsi="Arial" w:cs="Arial"/>
-          <w:b/>
-          <w:bCs/>
-          <w:color w:val="000000"/>
-          <w:kern w:val="0"/>
-          <w14:ligatures w14:val="none"/>
-        </w:rPr>
-        <w:t>– ATALHOS</w:t>
+        <w:t>2 – ATALHOS</w:t>
       </w:r>
     </w:p>
     <w:p>

</xml_diff>

<commit_message>
Add Sobre o Senai
</commit_message>
<xml_diff>
--- a/docs/Guia-Usuario/Guia-do-Usuario.docx
+++ b/docs/Guia-Usuario/Guia-do-Usuario.docx
@@ -2322,9 +2322,9 @@
         </w:rPr>
         <w:lastRenderedPageBreak/>
         <w:drawing>
-          <wp:inline distT="0" distB="0" distL="0" distR="0" wp14:anchorId="525DD7A6" wp14:editId="7755CB5A">
-            <wp:extent cx="4754354" cy="7476996"/>
-            <wp:effectExtent l="0" t="0" r="8255" b="0"/>
+          <wp:inline distT="0" distB="0" distL="0" distR="0" wp14:anchorId="525DD7A6" wp14:editId="535240A2">
+            <wp:extent cx="4540134" cy="7140100"/>
+            <wp:effectExtent l="0" t="0" r="0" b="3810"/>
             <wp:docPr id="278602338" name="Imagem 1" descr="Interface gráfica do usuário&#10;&#10;O conteúdo gerado por IA pode estar incorreto."/>
             <wp:cNvGraphicFramePr>
               <a:graphicFrameLocks xmlns:a="http://schemas.openxmlformats.org/drawingml/2006/main" noChangeAspect="1"/>
@@ -2345,7 +2345,7 @@
                   <pic:spPr>
                     <a:xfrm>
                       <a:off x="0" y="0"/>
-                      <a:ext cx="4773684" cy="7507396"/>
+                      <a:ext cx="4563947" cy="7177549"/>
                     </a:xfrm>
                     <a:prstGeom prst="rect">
                       <a:avLst/>
@@ -2360,15 +2360,219 @@
     </w:p>
     <w:p>
       <w:pPr>
-        <w:rPr>
-          <w:rFonts w:ascii="Arial" w:eastAsia="Times New Roman" w:hAnsi="Arial" w:cs="Arial"/>
-          <w:b/>
-          <w:bCs/>
-          <w:color w:val="000000"/>
-          <w:kern w:val="0"/>
-          <w14:ligatures w14:val="none"/>
-        </w:rPr>
-      </w:pPr>
+        <w:spacing w:after="0" w:line="360" w:lineRule="auto"/>
+        <w:ind w:firstLine="709"/>
+        <w:jc w:val="both"/>
+        <w:rPr>
+          <w:rFonts w:ascii="Arial" w:eastAsia="Times New Roman" w:hAnsi="Arial" w:cs="Arial"/>
+          <w:color w:val="000000"/>
+          <w:kern w:val="0"/>
+          <w14:ligatures w14:val="none"/>
+        </w:rPr>
+      </w:pPr>
+    </w:p>
+    <w:p>
+      <w:pPr>
+        <w:spacing w:after="0" w:line="360" w:lineRule="auto"/>
+        <w:ind w:firstLine="709"/>
+        <w:jc w:val="both"/>
+        <w:rPr>
+          <w:rFonts w:ascii="Arial" w:eastAsia="Times New Roman" w:hAnsi="Arial" w:cs="Arial"/>
+          <w:color w:val="000000"/>
+          <w:kern w:val="0"/>
+          <w14:ligatures w14:val="none"/>
+        </w:rPr>
+      </w:pPr>
+      <w:r>
+        <w:rPr>
+          <w:rFonts w:ascii="Arial" w:eastAsia="Times New Roman" w:hAnsi="Arial" w:cs="Arial"/>
+          <w:color w:val="000000"/>
+          <w:kern w:val="0"/>
+          <w14:ligatures w14:val="none"/>
+        </w:rPr>
+        <w:t>A página “</w:t>
+      </w:r>
+      <w:r>
+        <w:rPr>
+          <w:rFonts w:ascii="Arial" w:eastAsia="Times New Roman" w:hAnsi="Arial" w:cs="Arial"/>
+          <w:b/>
+          <w:bCs/>
+          <w:color w:val="000000"/>
+          <w:kern w:val="0"/>
+          <w14:ligatures w14:val="none"/>
+        </w:rPr>
+        <w:t xml:space="preserve">Sobre o SENAI” </w:t>
+      </w:r>
+      <w:r>
+        <w:rPr>
+          <w:rFonts w:ascii="Arial" w:eastAsia="Times New Roman" w:hAnsi="Arial" w:cs="Arial"/>
+          <w:color w:val="000000"/>
+          <w:kern w:val="0"/>
+          <w14:ligatures w14:val="none"/>
+        </w:rPr>
+        <w:t>é dedicada a informações sobre a história da instituição SENAI como um todo para que novos alunos possam aprender mais sobre ele através de textos e imagens complementares.</w:t>
+      </w:r>
+    </w:p>
+    <w:p>
+      <w:pPr>
+        <w:spacing w:after="0" w:line="360" w:lineRule="auto"/>
+        <w:ind w:firstLine="709"/>
+        <w:jc w:val="both"/>
+        <w:rPr>
+          <w:rFonts w:ascii="Arial" w:eastAsia="Times New Roman" w:hAnsi="Arial" w:cs="Arial"/>
+          <w:color w:val="000000"/>
+          <w:kern w:val="0"/>
+          <w14:ligatures w14:val="none"/>
+        </w:rPr>
+      </w:pPr>
+      <w:r>
+        <w:rPr>
+          <w:rFonts w:ascii="Arial" w:eastAsia="Times New Roman" w:hAnsi="Arial" w:cs="Arial"/>
+          <w:color w:val="000000"/>
+          <w:kern w:val="0"/>
+          <w14:ligatures w14:val="none"/>
+        </w:rPr>
+        <w:t xml:space="preserve">O cabeçalho agora possui um “Menu Hamburguer" que é responsável pela navegação do usuário entre as diversas páginas do sistema, nele existem o nome de </w:t>
+      </w:r>
+      <w:r>
+        <w:rPr>
+          <w:rFonts w:ascii="Arial" w:eastAsia="Times New Roman" w:hAnsi="Arial" w:cs="Arial"/>
+          <w:color w:val="000000"/>
+          <w:kern w:val="0"/>
+          <w14:ligatures w14:val="none"/>
+        </w:rPr>
+        <w:lastRenderedPageBreak/>
+        <w:t xml:space="preserve">todas as páginas e </w:t>
+      </w:r>
+      <w:r>
+        <w:rPr>
+          <w:rFonts w:ascii="Arial" w:eastAsia="Times New Roman" w:hAnsi="Arial" w:cs="Arial"/>
+          <w:color w:val="000000"/>
+          <w:kern w:val="0"/>
+          <w14:ligatures w14:val="none"/>
+        </w:rPr>
+        <w:t>através</w:t>
+      </w:r>
+      <w:r>
+        <w:rPr>
+          <w:rFonts w:ascii="Arial" w:eastAsia="Times New Roman" w:hAnsi="Arial" w:cs="Arial"/>
+          <w:color w:val="000000"/>
+          <w:kern w:val="0"/>
+          <w14:ligatures w14:val="none"/>
+        </w:rPr>
+        <w:t xml:space="preserve"> de um </w:t>
+      </w:r>
+      <w:r>
+        <w:rPr>
+          <w:rFonts w:ascii="Arial" w:eastAsia="Times New Roman" w:hAnsi="Arial" w:cs="Arial"/>
+          <w:color w:val="000000"/>
+          <w:kern w:val="0"/>
+          <w14:ligatures w14:val="none"/>
+        </w:rPr>
+        <w:t>click</w:t>
+      </w:r>
+      <w:r>
+        <w:rPr>
+          <w:rFonts w:ascii="Arial" w:eastAsia="Times New Roman" w:hAnsi="Arial" w:cs="Arial"/>
+          <w:color w:val="000000"/>
+          <w:kern w:val="0"/>
+          <w14:ligatures w14:val="none"/>
+        </w:rPr>
+        <w:t xml:space="preserve"> o software direciona o usuário </w:t>
+      </w:r>
+      <w:r>
+        <w:rPr>
+          <w:rFonts w:ascii="Arial" w:eastAsia="Times New Roman" w:hAnsi="Arial" w:cs="Arial"/>
+          <w:color w:val="000000"/>
+          <w:kern w:val="0"/>
+          <w14:ligatures w14:val="none"/>
+        </w:rPr>
+        <w:t>para a respectiva página.</w:t>
+      </w:r>
+    </w:p>
+    <w:p>
+      <w:pPr>
+        <w:spacing w:after="0" w:line="360" w:lineRule="auto"/>
+        <w:ind w:firstLine="709"/>
+        <w:jc w:val="both"/>
+        <w:rPr>
+          <w:rFonts w:ascii="Arial" w:eastAsia="Times New Roman" w:hAnsi="Arial" w:cs="Arial"/>
+          <w:b/>
+          <w:bCs/>
+          <w:color w:val="000000"/>
+          <w:kern w:val="0"/>
+          <w14:ligatures w14:val="none"/>
+        </w:rPr>
+      </w:pPr>
+    </w:p>
+    <w:p>
+      <w:pPr>
+        <w:spacing w:after="0" w:line="360" w:lineRule="auto"/>
+        <w:ind w:firstLine="709"/>
+        <w:jc w:val="center"/>
+        <w:rPr>
+          <w:rFonts w:ascii="Arial" w:eastAsia="Times New Roman" w:hAnsi="Arial" w:cs="Arial"/>
+          <w:b/>
+          <w:bCs/>
+          <w:color w:val="000000"/>
+          <w:kern w:val="0"/>
+          <w14:ligatures w14:val="none"/>
+        </w:rPr>
+      </w:pPr>
+      <w:r>
+        <w:rPr>
+          <w:rFonts w:ascii="Arial" w:eastAsia="Times New Roman" w:hAnsi="Arial" w:cs="Arial"/>
+          <w:b/>
+          <w:bCs/>
+          <w:color w:val="000000"/>
+          <w:kern w:val="0"/>
+          <w14:ligatures w14:val="none"/>
+        </w:rPr>
+        <w:drawing>
+          <wp:inline distT="0" distB="0" distL="0" distR="0" wp14:anchorId="676A0D9A" wp14:editId="76324329">
+            <wp:extent cx="4314826" cy="7111294"/>
+            <wp:effectExtent l="0" t="0" r="0" b="0"/>
+            <wp:docPr id="873272659" name="Imagem 1" descr="Interface gráfica do usuário, Aplicativo, PowerPoint&#10;&#10;O conteúdo gerado por IA pode estar incorreto."/>
+            <wp:cNvGraphicFramePr>
+              <a:graphicFrameLocks xmlns:a="http://schemas.openxmlformats.org/drawingml/2006/main" noChangeAspect="1"/>
+            </wp:cNvGraphicFramePr>
+            <a:graphic xmlns:a="http://schemas.openxmlformats.org/drawingml/2006/main">
+              <a:graphicData uri="http://schemas.openxmlformats.org/drawingml/2006/picture">
+                <pic:pic xmlns:pic="http://schemas.openxmlformats.org/drawingml/2006/picture">
+                  <pic:nvPicPr>
+                    <pic:cNvPr id="873272659" name="Imagem 1" descr="Interface gráfica do usuário, Aplicativo, PowerPoint&#10;&#10;O conteúdo gerado por IA pode estar incorreto."/>
+                    <pic:cNvPicPr/>
+                  </pic:nvPicPr>
+                  <pic:blipFill rotWithShape="1">
+                    <a:blip r:embed="rId8"/>
+                    <a:srcRect t="428"/>
+                    <a:stretch>
+                      <a:fillRect/>
+                    </a:stretch>
+                  </pic:blipFill>
+                  <pic:spPr bwMode="auto">
+                    <a:xfrm>
+                      <a:off x="0" y="0"/>
+                      <a:ext cx="4350379" cy="7169889"/>
+                    </a:xfrm>
+                    <a:prstGeom prst="rect">
+                      <a:avLst/>
+                    </a:prstGeom>
+                    <a:ln>
+                      <a:noFill/>
+                    </a:ln>
+                    <a:extLst>
+                      <a:ext uri="{53640926-AAD7-44D8-BBD7-CCE9431645EC}">
+                        <a14:shadowObscured xmlns:a14="http://schemas.microsoft.com/office/drawing/2010/main"/>
+                      </a:ext>
+                    </a:extLst>
+                  </pic:spPr>
+                </pic:pic>
+              </a:graphicData>
+            </a:graphic>
+          </wp:inline>
+        </w:drawing>
+      </w:r>
       <w:r>
         <w:rPr>
           <w:rFonts w:ascii="Arial" w:eastAsia="Times New Roman" w:hAnsi="Arial" w:cs="Arial"/>

</xml_diff>

<commit_message>
Add paginaEmprego e paginaEstagio
</commit_message>
<xml_diff>
--- a/docs/Guia-Usuario/Guia-do-Usuario.docx
+++ b/docs/Guia-Usuario/Guia-do-Usuario.docx
@@ -1570,7 +1570,7 @@
           <w:kern w:val="0"/>
         </w:rPr>
         <w:drawing>
-          <wp:inline distT="0" distB="0" distL="0" distR="0" wp14:anchorId="1A26D565" wp14:editId="1E369DFE">
+          <wp:inline distT="0" distB="0" distL="0" distR="0" wp14:anchorId="1A26D565" wp14:editId="1C40E8A9">
             <wp:extent cx="6013014" cy="4248350"/>
             <wp:effectExtent l="0" t="0" r="6985" b="0"/>
             <wp:docPr id="4728309" name="Imagem 1" descr="Diagrama&#10;&#10;O conteúdo gerado por IA pode estar incorreto."/>
@@ -2530,9 +2530,9 @@
           <w14:ligatures w14:val="none"/>
         </w:rPr>
         <w:drawing>
-          <wp:inline distT="0" distB="0" distL="0" distR="0" wp14:anchorId="676A0D9A" wp14:editId="76324329">
-            <wp:extent cx="4314826" cy="7111294"/>
-            <wp:effectExtent l="0" t="0" r="0" b="0"/>
+          <wp:inline distT="0" distB="0" distL="0" distR="0" wp14:anchorId="676A0D9A" wp14:editId="3903D020">
+            <wp:extent cx="4162680" cy="6860540"/>
+            <wp:effectExtent l="0" t="0" r="9525" b="0"/>
             <wp:docPr id="873272659" name="Imagem 1" descr="Interface gráfica do usuário, Aplicativo, PowerPoint&#10;&#10;O conteúdo gerado por IA pode estar incorreto."/>
             <wp:cNvGraphicFramePr>
               <a:graphicFrameLocks xmlns:a="http://schemas.openxmlformats.org/drawingml/2006/main" noChangeAspect="1"/>
@@ -2554,7 +2554,7 @@
                   <pic:spPr bwMode="auto">
                     <a:xfrm>
                       <a:off x="0" y="0"/>
-                      <a:ext cx="4350379" cy="7169889"/>
+                      <a:ext cx="4199265" cy="6920836"/>
                     </a:xfrm>
                     <a:prstGeom prst="rect">
                       <a:avLst/>
@@ -2640,7 +2640,134 @@
           <w:kern w:val="0"/>
           <w14:ligatures w14:val="none"/>
         </w:rPr>
-        <w:t xml:space="preserve">” contém todas as vagas de emprego publicadas pela unidade dos diferentes setores trabalhistas que ela é responsável. </w:t>
+        <w:t>” contém todas as vagas de emprego publicadas pela unidade</w:t>
+      </w:r>
+      <w:r>
+        <w:rPr>
+          <w:rFonts w:ascii="Arial" w:eastAsia="Times New Roman" w:hAnsi="Arial" w:cs="Arial"/>
+          <w:color w:val="000000"/>
+          <w:kern w:val="0"/>
+          <w14:ligatures w14:val="none"/>
+        </w:rPr>
+        <w:t>,</w:t>
+      </w:r>
+      <w:r>
+        <w:rPr>
+          <w:rFonts w:ascii="Arial" w:eastAsia="Times New Roman" w:hAnsi="Arial" w:cs="Arial"/>
+          <w:color w:val="000000"/>
+          <w:kern w:val="0"/>
+          <w14:ligatures w14:val="none"/>
+        </w:rPr>
+        <w:t xml:space="preserve"> dos diferentes setores trabalhistas que ela é responsável. </w:t>
+      </w:r>
+      <w:r>
+        <w:rPr>
+          <w:rFonts w:ascii="Arial" w:eastAsia="Times New Roman" w:hAnsi="Arial" w:cs="Arial"/>
+          <w:color w:val="000000"/>
+          <w:kern w:val="0"/>
+          <w14:ligatures w14:val="none"/>
+        </w:rPr>
+        <w:t>Na parte superior da tela</w:t>
+      </w:r>
+      <w:r>
+        <w:rPr>
+          <w:rFonts w:ascii="Arial" w:eastAsia="Times New Roman" w:hAnsi="Arial" w:cs="Arial"/>
+          <w:color w:val="000000"/>
+          <w:kern w:val="0"/>
+          <w14:ligatures w14:val="none"/>
+        </w:rPr>
+        <w:t xml:space="preserve">, </w:t>
+      </w:r>
+      <w:r>
+        <w:rPr>
+          <w:rFonts w:ascii="Arial" w:eastAsia="Times New Roman" w:hAnsi="Arial" w:cs="Arial"/>
+          <w:color w:val="000000"/>
+          <w:kern w:val="0"/>
+          <w14:ligatures w14:val="none"/>
+        </w:rPr>
+        <w:t xml:space="preserve">há o campo contendo o filtro da área da vaga, através dele é possível </w:t>
+      </w:r>
+      <w:r>
+        <w:rPr>
+          <w:rFonts w:ascii="Arial" w:eastAsia="Times New Roman" w:hAnsi="Arial" w:cs="Arial"/>
+          <w:color w:val="000000"/>
+          <w:kern w:val="0"/>
+          <w14:ligatures w14:val="none"/>
+        </w:rPr>
+        <w:lastRenderedPageBreak/>
+        <w:t>buscar uma vaga de um setor específico</w:t>
+      </w:r>
+      <w:r>
+        <w:rPr>
+          <w:rFonts w:ascii="Arial" w:eastAsia="Times New Roman" w:hAnsi="Arial" w:cs="Arial"/>
+          <w:color w:val="000000"/>
+          <w:kern w:val="0"/>
+          <w14:ligatures w14:val="none"/>
+        </w:rPr>
+        <w:t xml:space="preserve">. Caso </w:t>
+      </w:r>
+      <w:r>
+        <w:rPr>
+          <w:rFonts w:ascii="Arial" w:eastAsia="Times New Roman" w:hAnsi="Arial" w:cs="Arial"/>
+          <w:color w:val="000000"/>
+          <w:kern w:val="0"/>
+          <w14:ligatures w14:val="none"/>
+        </w:rPr>
+        <w:t xml:space="preserve">nenhum filtro </w:t>
+      </w:r>
+      <w:r>
+        <w:rPr>
+          <w:rFonts w:ascii="Arial" w:eastAsia="Times New Roman" w:hAnsi="Arial" w:cs="Arial"/>
+          <w:color w:val="000000"/>
+          <w:kern w:val="0"/>
+          <w14:ligatures w14:val="none"/>
+        </w:rPr>
+        <w:t>seja</w:t>
+      </w:r>
+      <w:r>
+        <w:rPr>
+          <w:rFonts w:ascii="Arial" w:eastAsia="Times New Roman" w:hAnsi="Arial" w:cs="Arial"/>
+          <w:color w:val="000000"/>
+          <w:kern w:val="0"/>
+          <w14:ligatures w14:val="none"/>
+        </w:rPr>
+        <w:t xml:space="preserve"> aplicado</w:t>
+      </w:r>
+      <w:r>
+        <w:rPr>
+          <w:rFonts w:ascii="Arial" w:eastAsia="Times New Roman" w:hAnsi="Arial" w:cs="Arial"/>
+          <w:color w:val="000000"/>
+          <w:kern w:val="0"/>
+          <w14:ligatures w14:val="none"/>
+        </w:rPr>
+        <w:t>,</w:t>
+      </w:r>
+      <w:r>
+        <w:rPr>
+          <w:rFonts w:ascii="Arial" w:eastAsia="Times New Roman" w:hAnsi="Arial" w:cs="Arial"/>
+          <w:color w:val="000000"/>
+          <w:kern w:val="0"/>
+          <w14:ligatures w14:val="none"/>
+        </w:rPr>
+        <w:t xml:space="preserve"> todas as vagas </w:t>
+      </w:r>
+      <w:r>
+        <w:rPr>
+          <w:rFonts w:ascii="Arial" w:eastAsia="Times New Roman" w:hAnsi="Arial" w:cs="Arial"/>
+          <w:color w:val="000000"/>
+          <w:kern w:val="0"/>
+          <w14:ligatures w14:val="none"/>
+        </w:rPr>
+        <w:t>serão exibidas</w:t>
+      </w:r>
+      <w:r>
+        <w:rPr>
+          <w:rFonts w:ascii="Arial" w:eastAsia="Times New Roman" w:hAnsi="Arial" w:cs="Arial"/>
+          <w:color w:val="000000"/>
+          <w:kern w:val="0"/>
+          <w14:ligatures w14:val="none"/>
+        </w:rPr>
+        <w:t>.</w:t>
       </w:r>
     </w:p>
     <w:p>
@@ -2650,23 +2777,474 @@
         <w:jc w:val="both"/>
         <w:rPr>
           <w:rFonts w:ascii="Arial" w:eastAsia="Times New Roman" w:hAnsi="Arial" w:cs="Arial"/>
-          <w:b/>
-          <w:bCs/>
-          <w:color w:val="000000"/>
-          <w:kern w:val="0"/>
-          <w14:ligatures w14:val="none"/>
-        </w:rPr>
-      </w:pPr>
-      <w:r>
-        <w:rPr>
-          <w:rFonts w:ascii="Arial" w:eastAsia="Times New Roman" w:hAnsi="Arial" w:cs="Arial"/>
-          <w:b/>
-          <w:bCs/>
-          <w:color w:val="000000"/>
-          <w:kern w:val="0"/>
-          <w14:ligatures w14:val="none"/>
-        </w:rPr>
-        <w:lastRenderedPageBreak/>
+          <w:color w:val="000000"/>
+          <w:kern w:val="0"/>
+          <w14:ligatures w14:val="none"/>
+        </w:rPr>
+      </w:pPr>
+      <w:r>
+        <w:rPr>
+          <w:rFonts w:ascii="Arial" w:eastAsia="Times New Roman" w:hAnsi="Arial" w:cs="Arial"/>
+          <w:color w:val="000000"/>
+          <w:kern w:val="0"/>
+          <w14:ligatures w14:val="none"/>
+        </w:rPr>
+        <w:t>Logo abaixo</w:t>
+      </w:r>
+      <w:r>
+        <w:rPr>
+          <w:rFonts w:ascii="Arial" w:eastAsia="Times New Roman" w:hAnsi="Arial" w:cs="Arial"/>
+          <w:color w:val="000000"/>
+          <w:kern w:val="0"/>
+          <w14:ligatures w14:val="none"/>
+        </w:rPr>
+        <w:t xml:space="preserve">, </w:t>
+      </w:r>
+      <w:r>
+        <w:rPr>
+          <w:rFonts w:ascii="Arial" w:eastAsia="Times New Roman" w:hAnsi="Arial" w:cs="Arial"/>
+          <w:color w:val="000000"/>
+          <w:kern w:val="0"/>
+          <w14:ligatures w14:val="none"/>
+        </w:rPr>
+        <w:t>existem os cards com o título de cada vaga de emprego</w:t>
+      </w:r>
+      <w:r>
+        <w:rPr>
+          <w:rFonts w:ascii="Arial" w:eastAsia="Times New Roman" w:hAnsi="Arial" w:cs="Arial"/>
+          <w:color w:val="000000"/>
+          <w:kern w:val="0"/>
+          <w14:ligatures w14:val="none"/>
+        </w:rPr>
+        <w:t>. A</w:t>
+      </w:r>
+      <w:r>
+        <w:rPr>
+          <w:rFonts w:ascii="Arial" w:eastAsia="Times New Roman" w:hAnsi="Arial" w:cs="Arial"/>
+          <w:color w:val="000000"/>
+          <w:kern w:val="0"/>
+          <w14:ligatures w14:val="none"/>
+        </w:rPr>
+        <w:t xml:space="preserve">o clicar em um dos cards, informações </w:t>
+      </w:r>
+      <w:r>
+        <w:rPr>
+          <w:rFonts w:ascii="Arial" w:eastAsia="Times New Roman" w:hAnsi="Arial" w:cs="Arial"/>
+          <w:color w:val="000000"/>
+          <w:kern w:val="0"/>
+          <w14:ligatures w14:val="none"/>
+        </w:rPr>
+        <w:t xml:space="preserve">sobre a </w:t>
+      </w:r>
+      <w:r>
+        <w:rPr>
+          <w:rFonts w:ascii="Arial" w:eastAsia="Times New Roman" w:hAnsi="Arial" w:cs="Arial"/>
+          <w:color w:val="000000"/>
+          <w:kern w:val="0"/>
+          <w14:ligatures w14:val="none"/>
+        </w:rPr>
+        <w:t xml:space="preserve">vaga como salário, local, atividades </w:t>
+      </w:r>
+      <w:r>
+        <w:rPr>
+          <w:rFonts w:ascii="Arial" w:eastAsia="Times New Roman" w:hAnsi="Arial" w:cs="Arial"/>
+          <w:color w:val="000000"/>
+          <w:kern w:val="0"/>
+          <w14:ligatures w14:val="none"/>
+        </w:rPr>
+        <w:t xml:space="preserve">a serem </w:t>
+      </w:r>
+      <w:r>
+        <w:rPr>
+          <w:rFonts w:ascii="Arial" w:eastAsia="Times New Roman" w:hAnsi="Arial" w:cs="Arial"/>
+          <w:color w:val="000000"/>
+          <w:kern w:val="0"/>
+          <w14:ligatures w14:val="none"/>
+        </w:rPr>
+        <w:t>executadas e exigências</w:t>
+      </w:r>
+      <w:r>
+        <w:rPr>
+          <w:rFonts w:ascii="Arial" w:eastAsia="Times New Roman" w:hAnsi="Arial" w:cs="Arial"/>
+          <w:color w:val="000000"/>
+          <w:kern w:val="0"/>
+          <w14:ligatures w14:val="none"/>
+        </w:rPr>
+        <w:t>,</w:t>
+      </w:r>
+      <w:r>
+        <w:rPr>
+          <w:rFonts w:ascii="Arial" w:eastAsia="Times New Roman" w:hAnsi="Arial" w:cs="Arial"/>
+          <w:color w:val="000000"/>
+          <w:kern w:val="0"/>
+          <w14:ligatures w14:val="none"/>
+        </w:rPr>
+        <w:t xml:space="preserve"> aparecem no menu inferior da tela, </w:t>
+      </w:r>
+      <w:r>
+        <w:rPr>
+          <w:rFonts w:ascii="Arial" w:eastAsia="Times New Roman" w:hAnsi="Arial" w:cs="Arial"/>
+          <w:color w:val="000000"/>
+          <w:kern w:val="0"/>
+          <w14:ligatures w14:val="none"/>
+        </w:rPr>
+        <w:t xml:space="preserve">com </w:t>
+      </w:r>
+      <w:r>
+        <w:rPr>
+          <w:rFonts w:ascii="Arial" w:eastAsia="Times New Roman" w:hAnsi="Arial" w:cs="Arial"/>
+          <w:color w:val="000000"/>
+          <w:kern w:val="0"/>
+          <w14:ligatures w14:val="none"/>
+        </w:rPr>
+        <w:t>cada informação devidamente discriminada.</w:t>
+      </w:r>
+    </w:p>
+    <w:p>
+      <w:pPr>
+        <w:spacing w:after="0" w:line="360" w:lineRule="auto"/>
+        <w:ind w:firstLine="709"/>
+        <w:jc w:val="both"/>
+        <w:rPr>
+          <w:rFonts w:ascii="Arial" w:eastAsia="Times New Roman" w:hAnsi="Arial" w:cs="Arial"/>
+          <w:color w:val="000000"/>
+          <w:kern w:val="0"/>
+          <w14:ligatures w14:val="none"/>
+        </w:rPr>
+      </w:pPr>
+      <w:r>
+        <w:rPr>
+          <w:rFonts w:ascii="Arial" w:eastAsia="Times New Roman" w:hAnsi="Arial" w:cs="Arial"/>
+          <w:color w:val="000000"/>
+          <w:kern w:val="0"/>
+          <w14:ligatures w14:val="none"/>
+        </w:rPr>
+        <w:t>Ressalta</w:t>
+      </w:r>
+      <w:r>
+        <w:rPr>
+          <w:rFonts w:ascii="Arial" w:eastAsia="Times New Roman" w:hAnsi="Arial" w:cs="Arial"/>
+          <w:color w:val="000000"/>
+          <w:kern w:val="0"/>
+          <w14:ligatures w14:val="none"/>
+        </w:rPr>
+        <w:t>-se</w:t>
+      </w:r>
+      <w:r>
+        <w:rPr>
+          <w:rFonts w:ascii="Arial" w:eastAsia="Times New Roman" w:hAnsi="Arial" w:cs="Arial"/>
+          <w:color w:val="000000"/>
+          <w:kern w:val="0"/>
+          <w14:ligatures w14:val="none"/>
+        </w:rPr>
+        <w:t xml:space="preserve"> que o sistema não será o canal que o usuário irá se comunicar diretamente com a empresa</w:t>
+      </w:r>
+      <w:r>
+        <w:rPr>
+          <w:rFonts w:ascii="Arial" w:eastAsia="Times New Roman" w:hAnsi="Arial" w:cs="Arial"/>
+          <w:color w:val="000000"/>
+          <w:kern w:val="0"/>
+          <w14:ligatures w14:val="none"/>
+        </w:rPr>
+        <w:t>;</w:t>
+      </w:r>
+      <w:r>
+        <w:rPr>
+          <w:rFonts w:ascii="Arial" w:eastAsia="Times New Roman" w:hAnsi="Arial" w:cs="Arial"/>
+          <w:color w:val="000000"/>
+          <w:kern w:val="0"/>
+          <w14:ligatures w14:val="none"/>
+        </w:rPr>
+        <w:t xml:space="preserve"> ele </w:t>
+      </w:r>
+      <w:r>
+        <w:rPr>
+          <w:rFonts w:ascii="Arial" w:eastAsia="Times New Roman" w:hAnsi="Arial" w:cs="Arial"/>
+          <w:color w:val="000000"/>
+          <w:kern w:val="0"/>
+          <w14:ligatures w14:val="none"/>
+        </w:rPr>
+        <w:t>servirá apenas</w:t>
+      </w:r>
+      <w:r>
+        <w:rPr>
+          <w:rFonts w:ascii="Arial" w:eastAsia="Times New Roman" w:hAnsi="Arial" w:cs="Arial"/>
+          <w:color w:val="000000"/>
+          <w:kern w:val="0"/>
+          <w14:ligatures w14:val="none"/>
+        </w:rPr>
+        <w:t xml:space="preserve"> para exibir as informações da vaga. Caso o usuário queira saber mais sobre </w:t>
+      </w:r>
+      <w:r>
+        <w:rPr>
+          <w:rFonts w:ascii="Arial" w:eastAsia="Times New Roman" w:hAnsi="Arial" w:cs="Arial"/>
+          <w:color w:val="000000"/>
+          <w:kern w:val="0"/>
+          <w14:ligatures w14:val="none"/>
+        </w:rPr>
+        <w:t>a oportunidade de trabalho</w:t>
+      </w:r>
+      <w:r>
+        <w:rPr>
+          <w:rFonts w:ascii="Arial" w:eastAsia="Times New Roman" w:hAnsi="Arial" w:cs="Arial"/>
+          <w:color w:val="000000"/>
+          <w:kern w:val="0"/>
+          <w14:ligatures w14:val="none"/>
+        </w:rPr>
+        <w:t xml:space="preserve"> disponibilizad</w:t>
+      </w:r>
+      <w:r>
+        <w:rPr>
+          <w:rFonts w:ascii="Arial" w:eastAsia="Times New Roman" w:hAnsi="Arial" w:cs="Arial"/>
+          <w:color w:val="000000"/>
+          <w:kern w:val="0"/>
+          <w14:ligatures w14:val="none"/>
+        </w:rPr>
+        <w:t>a</w:t>
+      </w:r>
+      <w:r>
+        <w:rPr>
+          <w:rFonts w:ascii="Arial" w:eastAsia="Times New Roman" w:hAnsi="Arial" w:cs="Arial"/>
+          <w:color w:val="000000"/>
+          <w:kern w:val="0"/>
+          <w14:ligatures w14:val="none"/>
+        </w:rPr>
+        <w:t xml:space="preserve">, </w:t>
+      </w:r>
+      <w:r>
+        <w:rPr>
+          <w:rFonts w:ascii="Arial" w:eastAsia="Times New Roman" w:hAnsi="Arial" w:cs="Arial"/>
+          <w:color w:val="000000"/>
+          <w:kern w:val="0"/>
+          <w14:ligatures w14:val="none"/>
+        </w:rPr>
+        <w:t>deverá</w:t>
+      </w:r>
+      <w:r>
+        <w:rPr>
+          <w:rFonts w:ascii="Arial" w:eastAsia="Times New Roman" w:hAnsi="Arial" w:cs="Arial"/>
+          <w:color w:val="000000"/>
+          <w:kern w:val="0"/>
+          <w14:ligatures w14:val="none"/>
+        </w:rPr>
+        <w:t xml:space="preserve"> entrar em contato com a empresa pelos canais </w:t>
+      </w:r>
+      <w:r>
+        <w:rPr>
+          <w:rFonts w:ascii="Arial" w:eastAsia="Times New Roman" w:hAnsi="Arial" w:cs="Arial"/>
+          <w:color w:val="000000"/>
+          <w:kern w:val="0"/>
+          <w14:ligatures w14:val="none"/>
+        </w:rPr>
+        <w:t>informados</w:t>
+      </w:r>
+      <w:r>
+        <w:rPr>
+          <w:rFonts w:ascii="Arial" w:eastAsia="Times New Roman" w:hAnsi="Arial" w:cs="Arial"/>
+          <w:color w:val="000000"/>
+          <w:kern w:val="0"/>
+          <w14:ligatures w14:val="none"/>
+        </w:rPr>
+        <w:t xml:space="preserve"> no card</w:t>
+      </w:r>
+      <w:r>
+        <w:rPr>
+          <w:rFonts w:ascii="Arial" w:eastAsia="Times New Roman" w:hAnsi="Arial" w:cs="Arial"/>
+          <w:color w:val="000000"/>
+          <w:kern w:val="0"/>
+          <w14:ligatures w14:val="none"/>
+        </w:rPr>
+        <w:t xml:space="preserve"> </w:t>
+      </w:r>
+      <w:r>
+        <w:rPr>
+          <w:rFonts w:ascii="Arial" w:eastAsia="Times New Roman" w:hAnsi="Arial" w:cs="Arial"/>
+          <w:color w:val="000000"/>
+          <w:kern w:val="0"/>
+          <w14:ligatures w14:val="none"/>
+        </w:rPr>
+        <w:t xml:space="preserve">ou com a secretaria do SENAI. </w:t>
+      </w:r>
+    </w:p>
+    <w:p>
+      <w:pPr>
+        <w:spacing w:after="0" w:line="360" w:lineRule="auto"/>
+        <w:ind w:firstLine="709"/>
+        <w:jc w:val="both"/>
+        <w:rPr>
+          <w:rFonts w:ascii="Arial" w:eastAsia="Times New Roman" w:hAnsi="Arial" w:cs="Arial"/>
+          <w:color w:val="000000"/>
+          <w:kern w:val="0"/>
+          <w14:ligatures w14:val="none"/>
+        </w:rPr>
+      </w:pPr>
+    </w:p>
+    <w:p>
+      <w:pPr>
+        <w:spacing w:after="0" w:line="360" w:lineRule="auto"/>
+        <w:ind w:firstLine="709"/>
+        <w:jc w:val="both"/>
+        <w:rPr>
+          <w:rFonts w:ascii="Arial" w:eastAsia="Times New Roman" w:hAnsi="Arial" w:cs="Arial"/>
+          <w:color w:val="000000"/>
+          <w:kern w:val="0"/>
+          <w14:ligatures w14:val="none"/>
+        </w:rPr>
+      </w:pPr>
+      <w:r>
+        <w:rPr>
+          <w:rFonts w:ascii="Arial" w:eastAsia="Times New Roman" w:hAnsi="Arial" w:cs="Arial"/>
+          <w:color w:val="000000"/>
+          <w:kern w:val="0"/>
+          <w14:ligatures w14:val="none"/>
+        </w:rPr>
+        <w:t>A página “</w:t>
+      </w:r>
+      <w:r>
+        <w:rPr>
+          <w:rFonts w:ascii="Arial" w:eastAsia="Times New Roman" w:hAnsi="Arial" w:cs="Arial"/>
+          <w:b/>
+          <w:bCs/>
+          <w:color w:val="000000"/>
+          <w:kern w:val="0"/>
+          <w14:ligatures w14:val="none"/>
+        </w:rPr>
+        <w:t>Vagas de estágio</w:t>
+      </w:r>
+      <w:r>
+        <w:rPr>
+          <w:rFonts w:ascii="Arial" w:eastAsia="Times New Roman" w:hAnsi="Arial" w:cs="Arial"/>
+          <w:color w:val="000000"/>
+          <w:kern w:val="0"/>
+          <w14:ligatures w14:val="none"/>
+        </w:rPr>
+        <w:t xml:space="preserve">” </w:t>
+      </w:r>
+      <w:r>
+        <w:rPr>
+          <w:rFonts w:ascii="Arial" w:eastAsia="Times New Roman" w:hAnsi="Arial" w:cs="Arial"/>
+          <w:color w:val="000000"/>
+          <w:kern w:val="0"/>
+          <w14:ligatures w14:val="none"/>
+        </w:rPr>
+        <w:t>contém todas as vagas de estágio divulgadas pela unidade, dos diferentes setores trabalhistas que ela é responsável. Na parte superior da tela, há o campo contendo o filtro da área da vaga, através dele é possível buscar uma paga por seu setor específico. Caso nenhum filtro seja aplicado, todas as vagas serão exibidas.</w:t>
+      </w:r>
+    </w:p>
+    <w:p>
+      <w:pPr>
+        <w:spacing w:after="0" w:line="360" w:lineRule="auto"/>
+        <w:ind w:firstLine="709"/>
+        <w:jc w:val="both"/>
+        <w:rPr>
+          <w:rFonts w:ascii="Arial" w:eastAsia="Times New Roman" w:hAnsi="Arial" w:cs="Arial"/>
+          <w:color w:val="000000"/>
+          <w:kern w:val="0"/>
+          <w14:ligatures w14:val="none"/>
+        </w:rPr>
+      </w:pPr>
+      <w:r>
+        <w:rPr>
+          <w:rFonts w:ascii="Arial" w:eastAsia="Times New Roman" w:hAnsi="Arial" w:cs="Arial"/>
+          <w:color w:val="000000"/>
+          <w:kern w:val="0"/>
+          <w14:ligatures w14:val="none"/>
+        </w:rPr>
+        <w:t>Logo abaixo, existem os cards com o título de cada vaga de estágio. Ao clicar em um dos cards, informações sobre a vaga como salário, local, atividades a serem executadas e exigências, aparecem no menu inferior da tela, com cada informação devidamente discriminada.</w:t>
+      </w:r>
+    </w:p>
+    <w:p>
+      <w:pPr>
+        <w:spacing w:after="0" w:line="360" w:lineRule="auto"/>
+        <w:ind w:firstLine="709"/>
+        <w:jc w:val="both"/>
+        <w:rPr>
+          <w:rFonts w:ascii="Arial" w:eastAsia="Times New Roman" w:hAnsi="Arial" w:cs="Arial"/>
+          <w:color w:val="000000"/>
+          <w:kern w:val="0"/>
+          <w14:ligatures w14:val="none"/>
+        </w:rPr>
+      </w:pPr>
+      <w:r>
+        <w:rPr>
+          <w:rFonts w:ascii="Arial" w:eastAsia="Times New Roman" w:hAnsi="Arial" w:cs="Arial"/>
+          <w:color w:val="000000"/>
+          <w:kern w:val="0"/>
+          <w14:ligatures w14:val="none"/>
+        </w:rPr>
+        <w:t xml:space="preserve">Ressalta-se </w:t>
+      </w:r>
+      <w:r>
+        <w:rPr>
+          <w:rFonts w:ascii="Arial" w:eastAsia="Times New Roman" w:hAnsi="Arial" w:cs="Arial"/>
+          <w:color w:val="000000"/>
+          <w:kern w:val="0"/>
+          <w14:ligatures w14:val="none"/>
+        </w:rPr>
+        <w:t>que o sistema não será o canal que o usuário irá se comunicar diretamente com a empresa; ele servirá apenas para exibir as informações da vaga. Caso o usuário queira saber mais sobre a oportunidade de estágio disponibilizada, deverá entrar em contato com a empresa pelos canais informados no card ou com a secretaria do SENAI. Além disso, o sistema não é responsável pela criação do termo de estágio e nem documentos do gênero, cabe ao usuário entrar em contato com a coordenação de estágio da unidade para conseguir esses documentos.</w:t>
+      </w:r>
+    </w:p>
+    <w:p>
+      <w:pPr>
+        <w:spacing w:after="0" w:line="360" w:lineRule="auto"/>
+        <w:ind w:firstLine="709"/>
+        <w:jc w:val="both"/>
+        <w:rPr>
+          <w:rFonts w:ascii="Arial" w:eastAsia="Times New Roman" w:hAnsi="Arial" w:cs="Arial"/>
+          <w:color w:val="000000"/>
+          <w:kern w:val="0"/>
+          <w14:ligatures w14:val="none"/>
+        </w:rPr>
+      </w:pPr>
+    </w:p>
+    <w:p>
+      <w:pPr>
+        <w:spacing w:after="0" w:line="360" w:lineRule="auto"/>
+        <w:ind w:firstLine="709"/>
+        <w:jc w:val="both"/>
+        <w:rPr>
+          <w:rFonts w:ascii="Arial" w:eastAsia="Times New Roman" w:hAnsi="Arial" w:cs="Arial"/>
+          <w:color w:val="000000"/>
+          <w:kern w:val="0"/>
+          <w14:ligatures w14:val="none"/>
+        </w:rPr>
+      </w:pPr>
+    </w:p>
+    <w:p>
+      <w:pPr>
+        <w:spacing w:after="0" w:line="360" w:lineRule="auto"/>
+        <w:ind w:firstLine="709"/>
+        <w:jc w:val="both"/>
+        <w:rPr>
+          <w:rFonts w:ascii="Arial" w:eastAsia="Times New Roman" w:hAnsi="Arial" w:cs="Arial"/>
+          <w:color w:val="000000"/>
+          <w:kern w:val="0"/>
+          <w14:ligatures w14:val="none"/>
+        </w:rPr>
+      </w:pPr>
+    </w:p>
+    <w:p>
+      <w:pPr>
+        <w:spacing w:after="0" w:line="360" w:lineRule="auto"/>
+        <w:ind w:firstLine="709"/>
+        <w:jc w:val="both"/>
+        <w:rPr>
+          <w:rFonts w:ascii="Arial" w:eastAsia="Times New Roman" w:hAnsi="Arial" w:cs="Arial"/>
+          <w:b/>
+          <w:bCs/>
+          <w:color w:val="000000"/>
+          <w:kern w:val="0"/>
+          <w14:ligatures w14:val="none"/>
+        </w:rPr>
+      </w:pPr>
+      <w:r>
+        <w:rPr>
+          <w:rFonts w:ascii="Arial" w:eastAsia="Times New Roman" w:hAnsi="Arial" w:cs="Arial"/>
+          <w:b/>
+          <w:bCs/>
+          <w:color w:val="000000"/>
+          <w:kern w:val="0"/>
+          <w14:ligatures w14:val="none"/>
+        </w:rPr>
         <w:br w:type="page"/>
       </w:r>
     </w:p>

</xml_diff>

<commit_message>
Add UserPage, PagePage, MapPage, HorariodeAulas on section 3
</commit_message>
<xml_diff>
--- a/docs/Guia-Usuario/Guia-do-Usuario.docx
+++ b/docs/Guia-Usuario/Guia-do-Usuario.docx
@@ -1570,7 +1570,7 @@
           <w:kern w:val="0"/>
         </w:rPr>
         <w:drawing>
-          <wp:inline distT="0" distB="0" distL="0" distR="0" wp14:anchorId="1A26D565" wp14:editId="1C40E8A9">
+          <wp:inline distT="0" distB="0" distL="0" distR="0" wp14:anchorId="1A26D565" wp14:editId="22A32B58">
             <wp:extent cx="6013014" cy="4248350"/>
             <wp:effectExtent l="0" t="0" r="6985" b="0"/>
             <wp:docPr id="4728309" name="Imagem 1" descr="Diagrama&#10;&#10;O conteúdo gerado por IA pode estar incorreto."/>
@@ -3182,6 +3182,507 @@
         </w:rPr>
         <w:t>que o sistema não será o canal que o usuário irá se comunicar diretamente com a empresa; ele servirá apenas para exibir as informações da vaga. Caso o usuário queira saber mais sobre a oportunidade de estágio disponibilizada, deverá entrar em contato com a empresa pelos canais informados no card ou com a secretaria do SENAI. Além disso, o sistema não é responsável pela criação do termo de estágio e nem documentos do gênero, cabe ao usuário entrar em contato com a coordenação de estágio da unidade para conseguir esses documentos.</w:t>
       </w:r>
+    </w:p>
+    <w:p>
+      <w:pPr>
+        <w:spacing w:after="0" w:line="360" w:lineRule="auto"/>
+        <w:ind w:firstLine="709"/>
+        <w:jc w:val="both"/>
+        <w:rPr>
+          <w:rFonts w:ascii="Arial" w:eastAsia="Times New Roman" w:hAnsi="Arial" w:cs="Arial"/>
+          <w:color w:val="000000"/>
+          <w:kern w:val="0"/>
+          <w14:ligatures w14:val="none"/>
+        </w:rPr>
+      </w:pPr>
+    </w:p>
+    <w:p>
+      <w:pPr>
+        <w:spacing w:after="0" w:line="360" w:lineRule="auto"/>
+        <w:ind w:firstLine="709"/>
+        <w:jc w:val="both"/>
+        <w:rPr>
+          <w:rFonts w:ascii="Arial" w:eastAsia="Times New Roman" w:hAnsi="Arial" w:cs="Arial"/>
+          <w:color w:val="000000"/>
+          <w:kern w:val="0"/>
+          <w14:ligatures w14:val="none"/>
+        </w:rPr>
+      </w:pPr>
+    </w:p>
+    <w:p>
+      <w:pPr>
+        <w:spacing w:after="0" w:line="360" w:lineRule="auto"/>
+        <w:ind w:firstLine="709"/>
+        <w:jc w:val="both"/>
+        <w:rPr>
+          <w:rFonts w:ascii="Arial" w:eastAsia="Times New Roman" w:hAnsi="Arial" w:cs="Arial"/>
+          <w:color w:val="000000"/>
+          <w:kern w:val="0"/>
+          <w14:ligatures w14:val="none"/>
+        </w:rPr>
+      </w:pPr>
+      <w:r>
+        <w:rPr>
+          <w:rFonts w:ascii="Arial" w:eastAsia="Times New Roman" w:hAnsi="Arial" w:cs="Arial"/>
+          <w:color w:val="000000"/>
+          <w:kern w:val="0"/>
+          <w14:ligatures w14:val="none"/>
+        </w:rPr>
+        <w:t>A página “Horário de Aulas” contém as informações sobre os horários de cada turma</w:t>
+      </w:r>
+      <w:r>
+        <w:rPr>
+          <w:rFonts w:ascii="Arial" w:eastAsia="Times New Roman" w:hAnsi="Arial" w:cs="Arial"/>
+          <w:color w:val="000000"/>
+          <w:kern w:val="0"/>
+          <w14:ligatures w14:val="none"/>
+        </w:rPr>
+        <w:t xml:space="preserve"> da unidade. Na parte superior da tela existe um filtro para que o usuário consiga escolher determinada turma. Caso nenhum filtro seja aplicado, nenhum horário aparecerá.</w:t>
+      </w:r>
+    </w:p>
+    <w:p>
+      <w:pPr>
+        <w:spacing w:after="0" w:line="360" w:lineRule="auto"/>
+        <w:ind w:firstLine="709"/>
+        <w:jc w:val="both"/>
+        <w:rPr>
+          <w:rFonts w:ascii="Arial" w:eastAsia="Times New Roman" w:hAnsi="Arial" w:cs="Arial"/>
+          <w:color w:val="000000"/>
+          <w:kern w:val="0"/>
+          <w14:ligatures w14:val="none"/>
+        </w:rPr>
+      </w:pPr>
+      <w:r>
+        <w:rPr>
+          <w:rFonts w:ascii="Arial" w:eastAsia="Times New Roman" w:hAnsi="Arial" w:cs="Arial"/>
+          <w:color w:val="000000"/>
+          <w:kern w:val="0"/>
+          <w14:ligatures w14:val="none"/>
+        </w:rPr>
+        <w:lastRenderedPageBreak/>
+        <w:t>Logo abaixo do filtro existe um espaço reservado para exibir os horários da turma selecionada, logo, quando o usuário escolher uma turma automaticamente esse espaço será ocupado por seus respectivos horários, contendo os dias da semana, o nome do professor que dará a aula naquele dia e a sala onde será realizada a aula.</w:t>
+      </w:r>
+    </w:p>
+    <w:p>
+      <w:pPr>
+        <w:spacing w:after="0" w:line="360" w:lineRule="auto"/>
+        <w:ind w:firstLine="709"/>
+        <w:jc w:val="both"/>
+        <w:rPr>
+          <w:rFonts w:ascii="Arial" w:eastAsia="Times New Roman" w:hAnsi="Arial" w:cs="Arial"/>
+          <w:color w:val="000000"/>
+          <w:kern w:val="0"/>
+          <w14:ligatures w14:val="none"/>
+        </w:rPr>
+      </w:pPr>
+      <w:r>
+        <w:rPr>
+          <w:rFonts w:ascii="Arial" w:eastAsia="Times New Roman" w:hAnsi="Arial" w:cs="Arial"/>
+          <w:color w:val="000000"/>
+          <w:kern w:val="0"/>
+          <w14:ligatures w14:val="none"/>
+        </w:rPr>
+        <w:t>Por último, existe o botão de “</w:t>
+      </w:r>
+      <w:r>
+        <w:rPr>
+          <w:rFonts w:ascii="Arial" w:eastAsia="Times New Roman" w:hAnsi="Arial" w:cs="Arial"/>
+          <w:b/>
+          <w:bCs/>
+          <w:color w:val="000000"/>
+          <w:kern w:val="0"/>
+          <w14:ligatures w14:val="none"/>
+        </w:rPr>
+        <w:t>Mostrar no Mapa</w:t>
+      </w:r>
+      <w:r>
+        <w:rPr>
+          <w:rFonts w:ascii="Arial" w:eastAsia="Times New Roman" w:hAnsi="Arial" w:cs="Arial"/>
+          <w:color w:val="000000"/>
+          <w:kern w:val="0"/>
+          <w14:ligatures w14:val="none"/>
+        </w:rPr>
+        <w:t>”, ao clicar nele o usuário será redirecionado para a página de “</w:t>
+      </w:r>
+      <w:r>
+        <w:rPr>
+          <w:rFonts w:ascii="Arial" w:eastAsia="Times New Roman" w:hAnsi="Arial" w:cs="Arial"/>
+          <w:b/>
+          <w:bCs/>
+          <w:color w:val="000000"/>
+          <w:kern w:val="0"/>
+          <w14:ligatures w14:val="none"/>
+        </w:rPr>
+        <w:t>Mapa</w:t>
+      </w:r>
+      <w:r>
+        <w:rPr>
+          <w:rFonts w:ascii="Arial" w:eastAsia="Times New Roman" w:hAnsi="Arial" w:cs="Arial"/>
+          <w:b/>
+          <w:bCs/>
+          <w:color w:val="000000"/>
+          <w:kern w:val="0"/>
+          <w14:ligatures w14:val="none"/>
+        </w:rPr>
+        <w:t xml:space="preserve"> da Escola</w:t>
+      </w:r>
+      <w:r>
+        <w:rPr>
+          <w:rFonts w:ascii="Arial" w:eastAsia="Times New Roman" w:hAnsi="Arial" w:cs="Arial"/>
+          <w:color w:val="000000"/>
+          <w:kern w:val="0"/>
+          <w14:ligatures w14:val="none"/>
+        </w:rPr>
+        <w:t>”, onde será mostrado um mapa com a localização da sala que será dada a aula naquele dia da semana para guiar o aluno dentro da unidade.</w:t>
+      </w:r>
+    </w:p>
+    <w:p>
+      <w:pPr>
+        <w:spacing w:after="0" w:line="360" w:lineRule="auto"/>
+        <w:ind w:firstLine="709"/>
+        <w:jc w:val="both"/>
+        <w:rPr>
+          <w:rFonts w:ascii="Arial" w:eastAsia="Times New Roman" w:hAnsi="Arial" w:cs="Arial"/>
+          <w:color w:val="000000"/>
+          <w:kern w:val="0"/>
+          <w14:ligatures w14:val="none"/>
+        </w:rPr>
+      </w:pPr>
+    </w:p>
+    <w:p>
+      <w:pPr>
+        <w:spacing w:after="0" w:line="360" w:lineRule="auto"/>
+        <w:ind w:firstLine="709"/>
+        <w:jc w:val="both"/>
+        <w:rPr>
+          <w:rFonts w:ascii="Arial" w:eastAsia="Times New Roman" w:hAnsi="Arial" w:cs="Arial"/>
+          <w:color w:val="000000"/>
+          <w:kern w:val="0"/>
+          <w14:ligatures w14:val="none"/>
+        </w:rPr>
+      </w:pPr>
+    </w:p>
+    <w:p>
+      <w:pPr>
+        <w:spacing w:after="0" w:line="360" w:lineRule="auto"/>
+        <w:ind w:firstLine="709"/>
+        <w:jc w:val="both"/>
+        <w:rPr>
+          <w:rFonts w:ascii="Arial" w:eastAsia="Times New Roman" w:hAnsi="Arial" w:cs="Arial"/>
+          <w:color w:val="000000"/>
+          <w:kern w:val="0"/>
+          <w14:ligatures w14:val="none"/>
+        </w:rPr>
+      </w:pPr>
+      <w:r>
+        <w:rPr>
+          <w:rFonts w:ascii="Arial" w:eastAsia="Times New Roman" w:hAnsi="Arial" w:cs="Arial"/>
+          <w:color w:val="000000"/>
+          <w:kern w:val="0"/>
+          <w14:ligatures w14:val="none"/>
+        </w:rPr>
+        <w:t>A página “</w:t>
+      </w:r>
+      <w:r>
+        <w:rPr>
+          <w:rFonts w:ascii="Arial" w:eastAsia="Times New Roman" w:hAnsi="Arial" w:cs="Arial"/>
+          <w:b/>
+          <w:bCs/>
+          <w:color w:val="000000"/>
+          <w:kern w:val="0"/>
+          <w14:ligatures w14:val="none"/>
+        </w:rPr>
+        <w:t>Mapa da Escola</w:t>
+      </w:r>
+      <w:r>
+        <w:rPr>
+          <w:rFonts w:ascii="Arial" w:eastAsia="Times New Roman" w:hAnsi="Arial" w:cs="Arial"/>
+          <w:color w:val="000000"/>
+          <w:kern w:val="0"/>
+          <w14:ligatures w14:val="none"/>
+        </w:rPr>
+        <w:t>” é dedicada para conter um mapa interativo da unidade da escola, no qual os usuários conseguem visualizar o local de salas e pontos de interesse. O objetivo é ajudar os novos alunos a se familiarizarem com a escola e os guiar pelo ambiente nesses momentos iniciais.</w:t>
+      </w:r>
+    </w:p>
+    <w:p>
+      <w:pPr>
+        <w:spacing w:after="0" w:line="360" w:lineRule="auto"/>
+        <w:ind w:firstLine="709"/>
+        <w:jc w:val="both"/>
+        <w:rPr>
+          <w:rFonts w:ascii="Arial" w:eastAsia="Times New Roman" w:hAnsi="Arial" w:cs="Arial"/>
+          <w:color w:val="000000"/>
+          <w:kern w:val="0"/>
+          <w14:ligatures w14:val="none"/>
+        </w:rPr>
+      </w:pPr>
+      <w:r>
+        <w:rPr>
+          <w:rFonts w:ascii="Arial" w:eastAsia="Times New Roman" w:hAnsi="Arial" w:cs="Arial"/>
+          <w:color w:val="000000"/>
+          <w:kern w:val="0"/>
+          <w14:ligatures w14:val="none"/>
+        </w:rPr>
+        <w:t>Na parte superior existe um mapa interativo contendo uma vista superior dos corredores e locais da escola, acima dele há dois campos responsáveis por especificar qual bloco e andar está sendo mostrado pelo mapa.</w:t>
+      </w:r>
+    </w:p>
+    <w:p>
+      <w:pPr>
+        <w:spacing w:after="0" w:line="360" w:lineRule="auto"/>
+        <w:ind w:firstLine="709"/>
+        <w:jc w:val="both"/>
+        <w:rPr>
+          <w:rFonts w:ascii="Arial" w:eastAsia="Times New Roman" w:hAnsi="Arial" w:cs="Arial"/>
+          <w:color w:val="000000"/>
+          <w:kern w:val="0"/>
+          <w14:ligatures w14:val="none"/>
+        </w:rPr>
+      </w:pPr>
+      <w:r>
+        <w:rPr>
+          <w:rFonts w:ascii="Arial" w:eastAsia="Times New Roman" w:hAnsi="Arial" w:cs="Arial"/>
+          <w:color w:val="000000"/>
+          <w:kern w:val="0"/>
+          <w14:ligatures w14:val="none"/>
+        </w:rPr>
+        <w:t>Ao clicar em uma das localidades do mapa, imagens referentes àquela sala ou localidade aparecem no espaço abaixo, dando assim uma ideia de como é fisicamente aquele local. Novamente, o intuito é auxiliar os novos alunos a se localizarem na unidade nesses momentos iniciais e confusos.</w:t>
+      </w:r>
+    </w:p>
+    <w:p>
+      <w:pPr>
+        <w:spacing w:after="0" w:line="360" w:lineRule="auto"/>
+        <w:ind w:firstLine="709"/>
+        <w:jc w:val="both"/>
+        <w:rPr>
+          <w:rFonts w:ascii="Arial" w:eastAsia="Times New Roman" w:hAnsi="Arial" w:cs="Arial"/>
+          <w:color w:val="000000"/>
+          <w:kern w:val="0"/>
+          <w14:ligatures w14:val="none"/>
+        </w:rPr>
+      </w:pPr>
+    </w:p>
+    <w:p>
+      <w:pPr>
+        <w:spacing w:after="0" w:line="360" w:lineRule="auto"/>
+        <w:ind w:firstLine="709"/>
+        <w:jc w:val="both"/>
+        <w:rPr>
+          <w:rFonts w:ascii="Arial" w:eastAsia="Times New Roman" w:hAnsi="Arial" w:cs="Arial"/>
+          <w:color w:val="000000"/>
+          <w:kern w:val="0"/>
+          <w14:ligatures w14:val="none"/>
+        </w:rPr>
+      </w:pPr>
+      <w:r>
+        <w:rPr>
+          <w:rFonts w:ascii="Arial" w:eastAsia="Times New Roman" w:hAnsi="Arial" w:cs="Arial"/>
+          <w:color w:val="000000"/>
+          <w:kern w:val="0"/>
+          <w14:ligatures w14:val="none"/>
+        </w:rPr>
+        <w:t>A página “</w:t>
+      </w:r>
+      <w:r>
+        <w:rPr>
+          <w:rFonts w:ascii="Arial" w:eastAsia="Times New Roman" w:hAnsi="Arial" w:cs="Arial"/>
+          <w:b/>
+          <w:bCs/>
+          <w:color w:val="000000"/>
+          <w:kern w:val="0"/>
+          <w14:ligatures w14:val="none"/>
+        </w:rPr>
+        <w:t>Usuários</w:t>
+      </w:r>
+      <w:r>
+        <w:rPr>
+          <w:rFonts w:ascii="Arial" w:eastAsia="Times New Roman" w:hAnsi="Arial" w:cs="Arial"/>
+          <w:color w:val="000000"/>
+          <w:kern w:val="0"/>
+          <w14:ligatures w14:val="none"/>
+        </w:rPr>
+        <w:t>” é exclusiva para os administradores do sistema, nela é mostrado informações sobre todos os usuários cadastrados no sistema, exibindo o nome, a função dele e seu e-mail.</w:t>
+      </w:r>
+    </w:p>
+    <w:p>
+      <w:pPr>
+        <w:spacing w:after="0" w:line="360" w:lineRule="auto"/>
+        <w:ind w:firstLine="709"/>
+        <w:jc w:val="both"/>
+        <w:rPr>
+          <w:rFonts w:ascii="Arial" w:eastAsia="Times New Roman" w:hAnsi="Arial" w:cs="Arial"/>
+          <w:color w:val="000000"/>
+          <w:kern w:val="0"/>
+          <w14:ligatures w14:val="none"/>
+        </w:rPr>
+      </w:pPr>
+      <w:r>
+        <w:rPr>
+          <w:rFonts w:ascii="Arial" w:eastAsia="Times New Roman" w:hAnsi="Arial" w:cs="Arial"/>
+          <w:color w:val="000000"/>
+          <w:kern w:val="0"/>
+          <w14:ligatures w14:val="none"/>
+        </w:rPr>
+        <w:t>A partir dela é possível que o administrador consiga adicionar novos usuários ou remover eles do sistema, além de editar certos dados como a “</w:t>
+      </w:r>
+      <w:r>
+        <w:rPr>
+          <w:rFonts w:ascii="Arial" w:eastAsia="Times New Roman" w:hAnsi="Arial" w:cs="Arial"/>
+          <w:b/>
+          <w:bCs/>
+          <w:color w:val="000000"/>
+          <w:kern w:val="0"/>
+          <w14:ligatures w14:val="none"/>
+        </w:rPr>
+        <w:t>Função</w:t>
+      </w:r>
+      <w:r>
+        <w:rPr>
+          <w:rFonts w:ascii="Arial" w:eastAsia="Times New Roman" w:hAnsi="Arial" w:cs="Arial"/>
+          <w:color w:val="000000"/>
+          <w:kern w:val="0"/>
+          <w14:ligatures w14:val="none"/>
+        </w:rPr>
+        <w:t>” dele, ou seja, é capaz de transformar um usuário comum e um administrador e um administrador em um usuário comum.</w:t>
+      </w:r>
+    </w:p>
+    <w:p>
+      <w:pPr>
+        <w:spacing w:after="0" w:line="360" w:lineRule="auto"/>
+        <w:ind w:firstLine="709"/>
+        <w:jc w:val="both"/>
+        <w:rPr>
+          <w:rFonts w:ascii="Arial" w:eastAsia="Times New Roman" w:hAnsi="Arial" w:cs="Arial"/>
+          <w:color w:val="000000"/>
+          <w:kern w:val="0"/>
+          <w14:ligatures w14:val="none"/>
+        </w:rPr>
+      </w:pPr>
+    </w:p>
+    <w:p>
+      <w:pPr>
+        <w:spacing w:after="0" w:line="360" w:lineRule="auto"/>
+        <w:ind w:firstLine="709"/>
+        <w:jc w:val="both"/>
+        <w:rPr>
+          <w:rFonts w:ascii="Arial" w:eastAsia="Times New Roman" w:hAnsi="Arial" w:cs="Arial"/>
+          <w:color w:val="000000"/>
+          <w:kern w:val="0"/>
+          <w14:ligatures w14:val="none"/>
+        </w:rPr>
+      </w:pPr>
+      <w:r>
+        <w:rPr>
+          <w:rFonts w:ascii="Arial" w:eastAsia="Times New Roman" w:hAnsi="Arial" w:cs="Arial"/>
+          <w:color w:val="000000"/>
+          <w:kern w:val="0"/>
+          <w14:ligatures w14:val="none"/>
+        </w:rPr>
+        <w:t>A página “</w:t>
+      </w:r>
+      <w:r>
+        <w:rPr>
+          <w:rFonts w:ascii="Arial" w:eastAsia="Times New Roman" w:hAnsi="Arial" w:cs="Arial"/>
+          <w:b/>
+          <w:bCs/>
+          <w:color w:val="000000"/>
+          <w:kern w:val="0"/>
+          <w14:ligatures w14:val="none"/>
+        </w:rPr>
+        <w:t>Páginas</w:t>
+      </w:r>
+      <w:r>
+        <w:rPr>
+          <w:rFonts w:ascii="Arial" w:eastAsia="Times New Roman" w:hAnsi="Arial" w:cs="Arial"/>
+          <w:color w:val="000000"/>
+          <w:kern w:val="0"/>
+          <w14:ligatures w14:val="none"/>
+        </w:rPr>
+        <w:t>”</w:t>
+      </w:r>
+      <w:r>
+        <w:rPr>
+          <w:rFonts w:ascii="Arial" w:eastAsia="Times New Roman" w:hAnsi="Arial" w:cs="Arial"/>
+          <w:color w:val="000000"/>
+          <w:kern w:val="0"/>
+          <w14:ligatures w14:val="none"/>
+        </w:rPr>
+        <w:t xml:space="preserve"> é exclusiva para os administradores do sistema, nela é mostrado informações sobre todas as páginas existentes no sistema, mostrando o nome e seu tipo.</w:t>
+      </w:r>
+    </w:p>
+    <w:p>
+      <w:pPr>
+        <w:spacing w:after="0" w:line="360" w:lineRule="auto"/>
+        <w:ind w:firstLine="709"/>
+        <w:jc w:val="both"/>
+        <w:rPr>
+          <w:rFonts w:ascii="Arial" w:eastAsia="Times New Roman" w:hAnsi="Arial" w:cs="Arial"/>
+          <w:color w:val="000000"/>
+          <w:kern w:val="0"/>
+          <w14:ligatures w14:val="none"/>
+        </w:rPr>
+      </w:pPr>
+      <w:r>
+        <w:rPr>
+          <w:rFonts w:ascii="Arial" w:eastAsia="Times New Roman" w:hAnsi="Arial" w:cs="Arial"/>
+          <w:color w:val="000000"/>
+          <w:kern w:val="0"/>
+          <w14:ligatures w14:val="none"/>
+        </w:rPr>
+        <w:lastRenderedPageBreak/>
+        <w:t>Nela há uma lista com as informações de cada páginas, ao lado das informações existem ícones que são responsáveis por editar e remover a página correspondente. Através do click do usuário no ícone de editar, o sistema irá redirecionar o usuário para um formulário que exibe as informações e o estado atual daquela página e nesse formulário o usuário consegue editar dados como o texto e imagens apresentadas; se ele clicar no ícone de remover, abrirá uma tela de confirmação e se o usuário confirmar a exclusão, a página será removida do sistema.</w:t>
+      </w:r>
+    </w:p>
+    <w:p>
+      <w:pPr>
+        <w:spacing w:after="0" w:line="360" w:lineRule="auto"/>
+        <w:ind w:firstLine="709"/>
+        <w:jc w:val="both"/>
+        <w:rPr>
+          <w:rFonts w:ascii="Arial" w:eastAsia="Times New Roman" w:hAnsi="Arial" w:cs="Arial"/>
+          <w:color w:val="000000"/>
+          <w:kern w:val="0"/>
+          <w14:ligatures w14:val="none"/>
+        </w:rPr>
+      </w:pPr>
+    </w:p>
+    <w:p>
+      <w:pPr>
+        <w:spacing w:after="0" w:line="360" w:lineRule="auto"/>
+        <w:ind w:firstLine="709"/>
+        <w:jc w:val="both"/>
+        <w:rPr>
+          <w:rFonts w:ascii="Arial" w:eastAsia="Times New Roman" w:hAnsi="Arial" w:cs="Arial"/>
+          <w:color w:val="000000"/>
+          <w:kern w:val="0"/>
+          <w14:ligatures w14:val="none"/>
+        </w:rPr>
+      </w:pPr>
+    </w:p>
+    <w:p>
+      <w:pPr>
+        <w:spacing w:after="0" w:line="360" w:lineRule="auto"/>
+        <w:ind w:firstLine="709"/>
+        <w:jc w:val="both"/>
+        <w:rPr>
+          <w:rFonts w:ascii="Arial" w:eastAsia="Times New Roman" w:hAnsi="Arial" w:cs="Arial"/>
+          <w:color w:val="000000"/>
+          <w:kern w:val="0"/>
+          <w14:ligatures w14:val="none"/>
+        </w:rPr>
+      </w:pPr>
+    </w:p>
+    <w:p>
+      <w:pPr>
+        <w:spacing w:after="0" w:line="360" w:lineRule="auto"/>
+        <w:ind w:firstLine="709"/>
+        <w:jc w:val="both"/>
+        <w:rPr>
+          <w:rFonts w:ascii="Arial" w:eastAsia="Times New Roman" w:hAnsi="Arial" w:cs="Arial"/>
+          <w:color w:val="000000"/>
+          <w:kern w:val="0"/>
+          <w14:ligatures w14:val="none"/>
+        </w:rPr>
+      </w:pPr>
     </w:p>
     <w:p>
       <w:pPr>

</xml_diff>

<commit_message>
Comeco do capitulo 5
</commit_message>
<xml_diff>
--- a/docs/Guia-Usuario/Guia-do-Usuario.docx
+++ b/docs/Guia-Usuario/Guia-do-Usuario.docx
@@ -1570,7 +1570,7 @@
           <w:kern w:val="0"/>
         </w:rPr>
         <w:drawing>
-          <wp:inline distT="0" distB="0" distL="0" distR="0" wp14:anchorId="1A26D565" wp14:editId="22A32B58">
+          <wp:inline distT="0" distB="0" distL="0" distR="0" wp14:anchorId="1A26D565" wp14:editId="0AA9792E">
             <wp:extent cx="6013014" cy="4248350"/>
             <wp:effectExtent l="0" t="0" r="6985" b="0"/>
             <wp:docPr id="4728309" name="Imagem 1" descr="Diagrama&#10;&#10;O conteúdo gerado por IA pode estar incorreto."/>
@@ -3856,6 +3856,1196 @@
         </w:rPr>
         <w:t>5 – COMO REALIZAR TAREFAS</w:t>
       </w:r>
+    </w:p>
+    <w:p>
+      <w:pPr>
+        <w:spacing w:after="0" w:line="360" w:lineRule="auto"/>
+        <w:jc w:val="both"/>
+        <w:rPr>
+          <w:rFonts w:ascii="Arial" w:eastAsia="Times New Roman" w:hAnsi="Arial" w:cs="Arial"/>
+          <w:b/>
+          <w:bCs/>
+          <w:color w:val="000000"/>
+          <w:kern w:val="0"/>
+          <w14:ligatures w14:val="none"/>
+        </w:rPr>
+      </w:pPr>
+    </w:p>
+    <w:p>
+      <w:pPr>
+        <w:spacing w:after="0" w:line="360" w:lineRule="auto"/>
+        <w:ind w:firstLine="709"/>
+        <w:jc w:val="both"/>
+        <w:rPr>
+          <w:rFonts w:ascii="Arial" w:eastAsia="Times New Roman" w:hAnsi="Arial" w:cs="Arial"/>
+          <w:color w:val="000000"/>
+          <w:kern w:val="0"/>
+          <w14:ligatures w14:val="none"/>
+        </w:rPr>
+      </w:pPr>
+      <w:r>
+        <w:rPr>
+          <w:rFonts w:ascii="Arial" w:eastAsia="Times New Roman" w:hAnsi="Arial" w:cs="Arial"/>
+          <w:color w:val="000000"/>
+          <w:kern w:val="0"/>
+          <w14:ligatures w14:val="none"/>
+        </w:rPr>
+        <w:t>Esse capítulo tem como finalidade apresentar as principais funcionalidades do sistema e mostrar um tutorial de como realizá-las. O tutorial de cada funcionalidade conta com uma tabela de apoio com suas informações chaves e logo depois um passo a passo da tarefa.</w:t>
+      </w:r>
+    </w:p>
+    <w:p>
+      <w:pPr>
+        <w:spacing w:after="0" w:line="360" w:lineRule="auto"/>
+        <w:ind w:firstLine="709"/>
+        <w:jc w:val="both"/>
+        <w:rPr>
+          <w:rFonts w:ascii="Arial" w:eastAsia="Times New Roman" w:hAnsi="Arial" w:cs="Arial"/>
+          <w:color w:val="000000"/>
+          <w:kern w:val="0"/>
+          <w14:ligatures w14:val="none"/>
+        </w:rPr>
+      </w:pPr>
+    </w:p>
+    <w:p>
+      <w:pPr>
+        <w:spacing w:after="0" w:line="360" w:lineRule="auto"/>
+        <w:ind w:firstLine="709"/>
+        <w:jc w:val="both"/>
+        <w:rPr>
+          <w:rFonts w:ascii="Arial" w:eastAsia="Times New Roman" w:hAnsi="Arial" w:cs="Arial"/>
+          <w:color w:val="000000"/>
+          <w:kern w:val="0"/>
+          <w14:ligatures w14:val="none"/>
+        </w:rPr>
+      </w:pPr>
+      <w:r>
+        <w:rPr>
+          <w:rFonts w:ascii="Arial" w:eastAsia="Times New Roman" w:hAnsi="Arial" w:cs="Arial"/>
+          <w:color w:val="000000"/>
+          <w:kern w:val="0"/>
+          <w14:ligatures w14:val="none"/>
+        </w:rPr>
+        <w:t xml:space="preserve">5.1 Como realizar o login </w:t>
+      </w:r>
+    </w:p>
+    <w:p>
+      <w:pPr>
+        <w:spacing w:after="0" w:line="360" w:lineRule="auto"/>
+        <w:ind w:firstLine="709"/>
+        <w:jc w:val="both"/>
+        <w:rPr>
+          <w:rFonts w:ascii="Arial" w:eastAsia="Times New Roman" w:hAnsi="Arial" w:cs="Arial"/>
+          <w:color w:val="000000"/>
+          <w:kern w:val="0"/>
+          <w14:ligatures w14:val="none"/>
+        </w:rPr>
+      </w:pPr>
+    </w:p>
+    <w:p>
+      <w:pPr>
+        <w:spacing w:after="0" w:line="360" w:lineRule="auto"/>
+        <w:jc w:val="center"/>
+        <w:rPr>
+          <w:rFonts w:ascii="Arial" w:eastAsia="Times New Roman" w:hAnsi="Arial" w:cs="Arial"/>
+          <w:b/>
+          <w:bCs/>
+          <w:color w:val="000000"/>
+          <w:kern w:val="0"/>
+          <w14:ligatures w14:val="none"/>
+        </w:rPr>
+      </w:pPr>
+      <w:r>
+        <w:drawing>
+          <wp:inline distT="0" distB="0" distL="0" distR="0" wp14:anchorId="435930EF" wp14:editId="6B02BE38">
+            <wp:extent cx="5438775" cy="3409950"/>
+            <wp:effectExtent l="0" t="0" r="9525" b="0"/>
+            <wp:docPr id="715179930" name="Imagem 1"/>
+            <wp:cNvGraphicFramePr>
+              <a:graphicFrameLocks xmlns:a="http://schemas.openxmlformats.org/drawingml/2006/main" noChangeAspect="1"/>
+            </wp:cNvGraphicFramePr>
+            <a:graphic xmlns:a="http://schemas.openxmlformats.org/drawingml/2006/main">
+              <a:graphicData uri="http://schemas.openxmlformats.org/drawingml/2006/picture">
+                <pic:pic xmlns:pic="http://schemas.openxmlformats.org/drawingml/2006/picture">
+                  <pic:nvPicPr>
+                    <pic:cNvPr id="0" name="Picture 1"/>
+                    <pic:cNvPicPr>
+                      <a:picLocks noChangeAspect="1" noChangeArrowheads="1"/>
+                    </pic:cNvPicPr>
+                  </pic:nvPicPr>
+                  <pic:blipFill>
+                    <a:blip r:embed="rId9">
+                      <a:extLst>
+                        <a:ext uri="{28A0092B-C50C-407E-A947-70E740481C1C}">
+                          <a14:useLocalDpi xmlns:a14="http://schemas.microsoft.com/office/drawing/2010/main" val="0"/>
+                        </a:ext>
+                      </a:extLst>
+                    </a:blip>
+                    <a:srcRect/>
+                    <a:stretch>
+                      <a:fillRect/>
+                    </a:stretch>
+                  </pic:blipFill>
+                  <pic:spPr bwMode="auto">
+                    <a:xfrm>
+                      <a:off x="0" y="0"/>
+                      <a:ext cx="5438775" cy="3409950"/>
+                    </a:xfrm>
+                    <a:prstGeom prst="rect">
+                      <a:avLst/>
+                    </a:prstGeom>
+                    <a:noFill/>
+                    <a:ln>
+                      <a:noFill/>
+                    </a:ln>
+                  </pic:spPr>
+                </pic:pic>
+              </a:graphicData>
+            </a:graphic>
+          </wp:inline>
+        </w:drawing>
+      </w:r>
+    </w:p>
+    <w:p>
+      <w:pPr>
+        <w:spacing w:after="0" w:line="360" w:lineRule="auto"/>
+        <w:jc w:val="center"/>
+        <w:rPr>
+          <w:rFonts w:ascii="Arial" w:eastAsia="Times New Roman" w:hAnsi="Arial" w:cs="Arial"/>
+          <w:b/>
+          <w:bCs/>
+          <w:color w:val="000000"/>
+          <w:kern w:val="0"/>
+          <w14:ligatures w14:val="none"/>
+        </w:rPr>
+      </w:pPr>
+    </w:p>
+    <w:p>
+      <w:pPr>
+        <w:spacing w:after="0" w:line="360" w:lineRule="auto"/>
+        <w:ind w:firstLine="709"/>
+        <w:jc w:val="both"/>
+        <w:rPr>
+          <w:rFonts w:ascii="Arial" w:eastAsia="Times New Roman" w:hAnsi="Arial" w:cs="Arial"/>
+          <w:color w:val="000000"/>
+          <w:kern w:val="0"/>
+          <w14:ligatures w14:val="none"/>
+        </w:rPr>
+      </w:pPr>
+      <w:r>
+        <w:rPr>
+          <w:rFonts w:ascii="Arial" w:eastAsia="Times New Roman" w:hAnsi="Arial" w:cs="Arial"/>
+          <w:color w:val="000000"/>
+          <w:kern w:val="0"/>
+          <w14:ligatures w14:val="none"/>
+        </w:rPr>
+        <w:t>Na página de login existem os campos de “</w:t>
+      </w:r>
+      <w:r>
+        <w:rPr>
+          <w:rFonts w:ascii="Arial" w:eastAsia="Times New Roman" w:hAnsi="Arial" w:cs="Arial"/>
+          <w:b/>
+          <w:bCs/>
+          <w:color w:val="000000"/>
+          <w:kern w:val="0"/>
+          <w14:ligatures w14:val="none"/>
+        </w:rPr>
+        <w:t>e-mail</w:t>
+      </w:r>
+      <w:r>
+        <w:rPr>
+          <w:rFonts w:ascii="Arial" w:eastAsia="Times New Roman" w:hAnsi="Arial" w:cs="Arial"/>
+          <w:color w:val="000000"/>
+          <w:kern w:val="0"/>
+          <w14:ligatures w14:val="none"/>
+        </w:rPr>
+        <w:t>” e “</w:t>
+      </w:r>
+      <w:r>
+        <w:rPr>
+          <w:rFonts w:ascii="Arial" w:eastAsia="Times New Roman" w:hAnsi="Arial" w:cs="Arial"/>
+          <w:b/>
+          <w:bCs/>
+          <w:color w:val="000000"/>
+          <w:kern w:val="0"/>
+          <w14:ligatures w14:val="none"/>
+        </w:rPr>
+        <w:t>senha</w:t>
+      </w:r>
+      <w:r>
+        <w:rPr>
+          <w:rFonts w:ascii="Arial" w:eastAsia="Times New Roman" w:hAnsi="Arial" w:cs="Arial"/>
+          <w:color w:val="000000"/>
+          <w:kern w:val="0"/>
+          <w14:ligatures w14:val="none"/>
+        </w:rPr>
+        <w:t>”, para logar no sistema é preciso colocar o endereço de e-mail de um usuário cadastrado no seu devido campo e sua respectiva senha no outr</w:t>
+      </w:r>
+      <w:r>
+        <w:rPr>
+          <w:rFonts w:ascii="Arial" w:eastAsia="Times New Roman" w:hAnsi="Arial" w:cs="Arial"/>
+          <w:color w:val="000000"/>
+          <w:kern w:val="0"/>
+          <w14:ligatures w14:val="none"/>
+        </w:rPr>
+        <w:t>o</w:t>
+      </w:r>
+      <w:r>
+        <w:rPr>
+          <w:rFonts w:ascii="Arial" w:eastAsia="Times New Roman" w:hAnsi="Arial" w:cs="Arial"/>
+          <w:color w:val="000000"/>
+          <w:kern w:val="0"/>
+          <w14:ligatures w14:val="none"/>
+        </w:rPr>
+        <w:t>. Ao apertar o botão “</w:t>
+      </w:r>
+      <w:r>
+        <w:rPr>
+          <w:rFonts w:ascii="Arial" w:eastAsia="Times New Roman" w:hAnsi="Arial" w:cs="Arial"/>
+          <w:b/>
+          <w:bCs/>
+          <w:color w:val="000000"/>
+          <w:kern w:val="0"/>
+          <w14:ligatures w14:val="none"/>
+        </w:rPr>
+        <w:t>Entrar</w:t>
+      </w:r>
+      <w:r>
+        <w:rPr>
+          <w:rFonts w:ascii="Arial" w:eastAsia="Times New Roman" w:hAnsi="Arial" w:cs="Arial"/>
+          <w:color w:val="000000"/>
+          <w:kern w:val="0"/>
+          <w14:ligatures w14:val="none"/>
+        </w:rPr>
+        <w:t xml:space="preserve">”, se todas as informações estiverem corretas, o usuário </w:t>
+      </w:r>
+      <w:r>
+        <w:rPr>
+          <w:rFonts w:ascii="Arial" w:eastAsia="Times New Roman" w:hAnsi="Arial" w:cs="Arial"/>
+          <w:color w:val="000000"/>
+          <w:kern w:val="0"/>
+          <w14:ligatures w14:val="none"/>
+        </w:rPr>
+        <w:t>será redirecionado para a “Homepage”</w:t>
+      </w:r>
+      <w:r>
+        <w:rPr>
+          <w:rFonts w:ascii="Arial" w:eastAsia="Times New Roman" w:hAnsi="Arial" w:cs="Arial"/>
+          <w:color w:val="000000"/>
+          <w:kern w:val="0"/>
+          <w14:ligatures w14:val="none"/>
+        </w:rPr>
+        <w:t xml:space="preserve">, </w:t>
+      </w:r>
+      <w:r>
+        <w:rPr>
+          <w:rFonts w:ascii="Arial" w:eastAsia="Times New Roman" w:hAnsi="Arial" w:cs="Arial"/>
+          <w:color w:val="000000"/>
+          <w:kern w:val="0"/>
+          <w14:ligatures w14:val="none"/>
+        </w:rPr>
+        <w:t>caso alguma informação esteja errada aparecerá uma notificação informando o erro.</w:t>
+      </w:r>
+    </w:p>
+    <w:p>
+      <w:pPr>
+        <w:spacing w:after="0" w:line="360" w:lineRule="auto"/>
+        <w:ind w:firstLine="709"/>
+        <w:jc w:val="both"/>
+        <w:rPr>
+          <w:rFonts w:ascii="Arial" w:eastAsia="Times New Roman" w:hAnsi="Arial" w:cs="Arial"/>
+          <w:color w:val="000000"/>
+          <w:kern w:val="0"/>
+          <w14:ligatures w14:val="none"/>
+        </w:rPr>
+      </w:pPr>
+      <w:r>
+        <w:rPr>
+          <w:rFonts w:ascii="Arial" w:eastAsia="Times New Roman" w:hAnsi="Arial" w:cs="Arial"/>
+          <w:color w:val="000000"/>
+          <w:kern w:val="0"/>
+          <w14:ligatures w14:val="none"/>
+        </w:rPr>
+        <w:t>Alguns erros comuns que podem acontecer é que a senha ou/e e-mail estejam errados, caso o e-mail esteja errado é necessário que o usuário confira o valor inserido, o mesmo serve para a senha; porém se o usuário não lembrar mais de sua senha é necessário que ele clique em “</w:t>
+      </w:r>
+      <w:r>
+        <w:rPr>
+          <w:rFonts w:ascii="Arial" w:eastAsia="Times New Roman" w:hAnsi="Arial" w:cs="Arial"/>
+          <w:b/>
+          <w:bCs/>
+          <w:color w:val="000000"/>
+          <w:kern w:val="0"/>
+          <w14:ligatures w14:val="none"/>
+        </w:rPr>
+        <w:t>Recuperar senha</w:t>
+      </w:r>
+      <w:r>
+        <w:rPr>
+          <w:rFonts w:ascii="Arial" w:eastAsia="Times New Roman" w:hAnsi="Arial" w:cs="Arial"/>
+          <w:color w:val="000000"/>
+          <w:kern w:val="0"/>
+          <w14:ligatures w14:val="none"/>
+        </w:rPr>
+        <w:t>” e troque a senha cadastrada.</w:t>
+      </w:r>
+    </w:p>
+    <w:p>
+      <w:pPr>
+        <w:rPr>
+          <w:rFonts w:ascii="Arial" w:eastAsia="Times New Roman" w:hAnsi="Arial" w:cs="Arial"/>
+          <w:color w:val="000000"/>
+          <w:kern w:val="0"/>
+          <w14:ligatures w14:val="none"/>
+        </w:rPr>
+      </w:pPr>
+      <w:r>
+        <w:rPr>
+          <w:rFonts w:ascii="Arial" w:eastAsia="Times New Roman" w:hAnsi="Arial" w:cs="Arial"/>
+          <w:color w:val="000000"/>
+          <w:kern w:val="0"/>
+          <w14:ligatures w14:val="none"/>
+        </w:rPr>
+        <w:br w:type="page"/>
+      </w:r>
+    </w:p>
+    <w:p>
+      <w:pPr>
+        <w:spacing w:after="0" w:line="360" w:lineRule="auto"/>
+        <w:jc w:val="both"/>
+        <w:rPr>
+          <w:rFonts w:ascii="Arial" w:eastAsia="Times New Roman" w:hAnsi="Arial" w:cs="Arial"/>
+          <w:color w:val="000000"/>
+          <w:kern w:val="0"/>
+          <w14:ligatures w14:val="none"/>
+        </w:rPr>
+      </w:pPr>
+      <w:r>
+        <w:rPr>
+          <w:rFonts w:ascii="Arial" w:eastAsia="Times New Roman" w:hAnsi="Arial" w:cs="Arial"/>
+          <w:color w:val="000000"/>
+          <w:kern w:val="0"/>
+          <w14:ligatures w14:val="none"/>
+        </w:rPr>
+        <w:lastRenderedPageBreak/>
+        <w:tab/>
+        <w:t>5.2 Recuperar senha</w:t>
+      </w:r>
+    </w:p>
+    <w:p>
+      <w:pPr>
+        <w:spacing w:after="0" w:line="360" w:lineRule="auto"/>
+        <w:jc w:val="both"/>
+        <w:rPr>
+          <w:rFonts w:ascii="Arial" w:eastAsia="Times New Roman" w:hAnsi="Arial" w:cs="Arial"/>
+          <w:color w:val="000000"/>
+          <w:kern w:val="0"/>
+          <w14:ligatures w14:val="none"/>
+        </w:rPr>
+      </w:pPr>
+    </w:p>
+    <w:p>
+      <w:pPr>
+        <w:spacing w:after="0" w:line="360" w:lineRule="auto"/>
+        <w:jc w:val="center"/>
+        <w:rPr>
+          <w:rFonts w:ascii="Arial" w:eastAsia="Times New Roman" w:hAnsi="Arial" w:cs="Arial"/>
+          <w:color w:val="000000"/>
+          <w:kern w:val="0"/>
+          <w14:ligatures w14:val="none"/>
+        </w:rPr>
+      </w:pPr>
+      <w:r>
+        <w:drawing>
+          <wp:inline distT="0" distB="0" distL="0" distR="0" wp14:anchorId="34D511F8" wp14:editId="49032BF1">
+            <wp:extent cx="5438775" cy="3408045"/>
+            <wp:effectExtent l="0" t="0" r="9525" b="1905"/>
+            <wp:docPr id="277948798" name="Imagem 3"/>
+            <wp:cNvGraphicFramePr>
+              <a:graphicFrameLocks xmlns:a="http://schemas.openxmlformats.org/drawingml/2006/main" noChangeAspect="1"/>
+            </wp:cNvGraphicFramePr>
+            <a:graphic xmlns:a="http://schemas.openxmlformats.org/drawingml/2006/main">
+              <a:graphicData uri="http://schemas.openxmlformats.org/drawingml/2006/picture">
+                <pic:pic xmlns:pic="http://schemas.openxmlformats.org/drawingml/2006/picture">
+                  <pic:nvPicPr>
+                    <pic:cNvPr id="0" name="Picture 3"/>
+                    <pic:cNvPicPr>
+                      <a:picLocks noChangeAspect="1" noChangeArrowheads="1"/>
+                    </pic:cNvPicPr>
+                  </pic:nvPicPr>
+                  <pic:blipFill>
+                    <a:blip r:embed="rId10">
+                      <a:extLst>
+                        <a:ext uri="{28A0092B-C50C-407E-A947-70E740481C1C}">
+                          <a14:useLocalDpi xmlns:a14="http://schemas.microsoft.com/office/drawing/2010/main" val="0"/>
+                        </a:ext>
+                      </a:extLst>
+                    </a:blip>
+                    <a:srcRect/>
+                    <a:stretch>
+                      <a:fillRect/>
+                    </a:stretch>
+                  </pic:blipFill>
+                  <pic:spPr bwMode="auto">
+                    <a:xfrm>
+                      <a:off x="0" y="0"/>
+                      <a:ext cx="5438775" cy="3408045"/>
+                    </a:xfrm>
+                    <a:prstGeom prst="rect">
+                      <a:avLst/>
+                    </a:prstGeom>
+                    <a:noFill/>
+                    <a:ln>
+                      <a:noFill/>
+                    </a:ln>
+                  </pic:spPr>
+                </pic:pic>
+              </a:graphicData>
+            </a:graphic>
+          </wp:inline>
+        </w:drawing>
+      </w:r>
+    </w:p>
+    <w:p>
+      <w:pPr>
+        <w:spacing w:after="0" w:line="360" w:lineRule="auto"/>
+        <w:rPr>
+          <w:rFonts w:ascii="Arial" w:eastAsia="Times New Roman" w:hAnsi="Arial" w:cs="Arial"/>
+          <w:color w:val="000000"/>
+          <w:kern w:val="0"/>
+          <w14:ligatures w14:val="none"/>
+        </w:rPr>
+      </w:pPr>
+    </w:p>
+    <w:p>
+      <w:pPr>
+        <w:spacing w:after="0" w:line="360" w:lineRule="auto"/>
+        <w:ind w:firstLine="709"/>
+        <w:jc w:val="both"/>
+        <w:rPr>
+          <w:rFonts w:ascii="Arial" w:eastAsia="Times New Roman" w:hAnsi="Arial" w:cs="Arial"/>
+          <w:color w:val="000000"/>
+          <w:kern w:val="0"/>
+          <w14:ligatures w14:val="none"/>
+        </w:rPr>
+      </w:pPr>
+      <w:r>
+        <w:rPr>
+          <w:rFonts w:ascii="Arial" w:eastAsia="Times New Roman" w:hAnsi="Arial" w:cs="Arial"/>
+          <w:color w:val="000000"/>
+          <w:kern w:val="0"/>
+          <w14:ligatures w14:val="none"/>
+        </w:rPr>
+        <w:t>Na página de login existe a opção “</w:t>
+      </w:r>
+      <w:r>
+        <w:rPr>
+          <w:rFonts w:ascii="Arial" w:eastAsia="Times New Roman" w:hAnsi="Arial" w:cs="Arial"/>
+          <w:b/>
+          <w:bCs/>
+          <w:color w:val="000000"/>
+          <w:kern w:val="0"/>
+          <w14:ligatures w14:val="none"/>
+        </w:rPr>
+        <w:t>Recuperar senha</w:t>
+      </w:r>
+      <w:r>
+        <w:rPr>
+          <w:rFonts w:ascii="Arial" w:eastAsia="Times New Roman" w:hAnsi="Arial" w:cs="Arial"/>
+          <w:color w:val="000000"/>
+          <w:kern w:val="0"/>
+          <w14:ligatures w14:val="none"/>
+        </w:rPr>
+        <w:t>”, ao clicar nela o usuário será redirecionado para a página de recuperação da senha. Nela existem três campos, um de e-mail, um para a nova senha e outro para confirmar a nova senha cadastrada. O usuário precisa inserir seu e-mail, digitar uma nova senha e confirmar ela. Se todas as informações inseridas estiverem corretas o sistema atualizará a senha do usuário e o redirecionará para a tela de login.</w:t>
+      </w:r>
+    </w:p>
+    <w:p>
+      <w:pPr>
+        <w:spacing w:after="0" w:line="360" w:lineRule="auto"/>
+        <w:ind w:firstLine="709"/>
+        <w:jc w:val="both"/>
+        <w:rPr>
+          <w:rFonts w:ascii="Arial" w:eastAsia="Times New Roman" w:hAnsi="Arial" w:cs="Arial"/>
+          <w:color w:val="000000"/>
+          <w:kern w:val="0"/>
+          <w14:ligatures w14:val="none"/>
+        </w:rPr>
+      </w:pPr>
+      <w:r>
+        <w:rPr>
+          <w:rFonts w:ascii="Arial" w:eastAsia="Times New Roman" w:hAnsi="Arial" w:cs="Arial"/>
+          <w:color w:val="000000"/>
+          <w:kern w:val="0"/>
+          <w14:ligatures w14:val="none"/>
+        </w:rPr>
+        <w:t>Os principais erros que podem ocorrer é o usuário digitar uma senha diferente no campo “</w:t>
+      </w:r>
+      <w:r>
+        <w:rPr>
+          <w:rFonts w:ascii="Arial" w:eastAsia="Times New Roman" w:hAnsi="Arial" w:cs="Arial"/>
+          <w:b/>
+          <w:bCs/>
+          <w:color w:val="000000"/>
+          <w:kern w:val="0"/>
+          <w14:ligatures w14:val="none"/>
+        </w:rPr>
+        <w:t>confirmar senha</w:t>
+      </w:r>
+      <w:r>
+        <w:rPr>
+          <w:rFonts w:ascii="Arial" w:eastAsia="Times New Roman" w:hAnsi="Arial" w:cs="Arial"/>
+          <w:color w:val="000000"/>
+          <w:kern w:val="0"/>
+          <w14:ligatures w14:val="none"/>
+        </w:rPr>
+        <w:t>” e do que a que foi inserida em “</w:t>
+      </w:r>
+      <w:r>
+        <w:rPr>
+          <w:rFonts w:ascii="Arial" w:eastAsia="Times New Roman" w:hAnsi="Arial" w:cs="Arial"/>
+          <w:b/>
+          <w:bCs/>
+          <w:color w:val="000000"/>
+          <w:kern w:val="0"/>
+          <w14:ligatures w14:val="none"/>
+        </w:rPr>
+        <w:t>senha</w:t>
+      </w:r>
+      <w:r>
+        <w:rPr>
+          <w:rFonts w:ascii="Arial" w:eastAsia="Times New Roman" w:hAnsi="Arial" w:cs="Arial"/>
+          <w:color w:val="000000"/>
+          <w:kern w:val="0"/>
+          <w14:ligatures w14:val="none"/>
+        </w:rPr>
+        <w:t>”, caso isso aconteça aparecerá um aviso informando que as senhas diferem; também é possível que o usuário digite o seu e-mail incorretamente, nesse caso é necessário que ele revise o que o valor inserido</w:t>
+      </w:r>
+      <w:r>
+        <w:rPr>
+          <w:rFonts w:ascii="Arial" w:eastAsia="Times New Roman" w:hAnsi="Arial" w:cs="Arial"/>
+          <w:color w:val="000000"/>
+          <w:kern w:val="0"/>
+          <w14:ligatures w14:val="none"/>
+        </w:rPr>
+        <w:t>.</w:t>
+      </w:r>
+    </w:p>
+    <w:p>
+      <w:pPr>
+        <w:rPr>
+          <w:rFonts w:ascii="Arial" w:eastAsia="Times New Roman" w:hAnsi="Arial" w:cs="Arial"/>
+          <w:color w:val="000000"/>
+          <w:kern w:val="0"/>
+          <w14:ligatures w14:val="none"/>
+        </w:rPr>
+      </w:pPr>
+      <w:r>
+        <w:rPr>
+          <w:rFonts w:ascii="Arial" w:eastAsia="Times New Roman" w:hAnsi="Arial" w:cs="Arial"/>
+          <w:color w:val="000000"/>
+          <w:kern w:val="0"/>
+          <w14:ligatures w14:val="none"/>
+        </w:rPr>
+        <w:br w:type="page"/>
+      </w:r>
+    </w:p>
+    <w:p>
+      <w:pPr>
+        <w:tabs>
+          <w:tab w:val="center" w:pos="4890"/>
+        </w:tabs>
+        <w:spacing w:after="0" w:line="360" w:lineRule="auto"/>
+        <w:ind w:firstLine="709"/>
+        <w:jc w:val="both"/>
+        <w:rPr>
+          <w:rFonts w:ascii="Arial" w:eastAsia="Times New Roman" w:hAnsi="Arial" w:cs="Arial"/>
+          <w:color w:val="000000"/>
+          <w:kern w:val="0"/>
+          <w14:ligatures w14:val="none"/>
+        </w:rPr>
+      </w:pPr>
+      <w:r>
+        <w:rPr>
+          <w:rFonts w:ascii="Arial" w:eastAsia="Times New Roman" w:hAnsi="Arial" w:cs="Arial"/>
+          <w:color w:val="000000"/>
+          <w:kern w:val="0"/>
+          <w14:ligatures w14:val="none"/>
+        </w:rPr>
+        <w:lastRenderedPageBreak/>
+        <w:t>5.3 Cadastrar novos usuários</w:t>
+      </w:r>
+      <w:r>
+        <w:rPr>
+          <w:rFonts w:ascii="Arial" w:eastAsia="Times New Roman" w:hAnsi="Arial" w:cs="Arial"/>
+          <w:color w:val="000000"/>
+          <w:kern w:val="0"/>
+          <w14:ligatures w14:val="none"/>
+        </w:rPr>
+        <w:tab/>
+      </w:r>
+    </w:p>
+    <w:p>
+      <w:pPr>
+        <w:tabs>
+          <w:tab w:val="center" w:pos="4890"/>
+        </w:tabs>
+        <w:spacing w:after="0" w:line="360" w:lineRule="auto"/>
+        <w:ind w:firstLine="709"/>
+        <w:jc w:val="both"/>
+        <w:rPr>
+          <w:rFonts w:ascii="Arial" w:eastAsia="Times New Roman" w:hAnsi="Arial" w:cs="Arial"/>
+          <w:color w:val="000000"/>
+          <w:kern w:val="0"/>
+          <w14:ligatures w14:val="none"/>
+        </w:rPr>
+      </w:pPr>
+    </w:p>
+    <w:p>
+      <w:pPr>
+        <w:tabs>
+          <w:tab w:val="center" w:pos="4890"/>
+        </w:tabs>
+        <w:spacing w:after="0" w:line="360" w:lineRule="auto"/>
+        <w:ind w:right="-285"/>
+        <w:jc w:val="center"/>
+        <w:rPr>
+          <w:rFonts w:ascii="Arial" w:eastAsia="Times New Roman" w:hAnsi="Arial" w:cs="Arial"/>
+          <w:color w:val="000000"/>
+          <w:kern w:val="0"/>
+          <w14:ligatures w14:val="none"/>
+        </w:rPr>
+      </w:pPr>
+      <w:r>
+        <w:drawing>
+          <wp:inline distT="0" distB="0" distL="0" distR="0" wp14:anchorId="5B62293E" wp14:editId="4B1CC510">
+            <wp:extent cx="5445760" cy="3411855"/>
+            <wp:effectExtent l="0" t="0" r="2540" b="0"/>
+            <wp:docPr id="86661121" name="Imagem 4"/>
+            <wp:cNvGraphicFramePr>
+              <a:graphicFrameLocks xmlns:a="http://schemas.openxmlformats.org/drawingml/2006/main" noChangeAspect="1"/>
+            </wp:cNvGraphicFramePr>
+            <a:graphic xmlns:a="http://schemas.openxmlformats.org/drawingml/2006/main">
+              <a:graphicData uri="http://schemas.openxmlformats.org/drawingml/2006/picture">
+                <pic:pic xmlns:pic="http://schemas.openxmlformats.org/drawingml/2006/picture">
+                  <pic:nvPicPr>
+                    <pic:cNvPr id="0" name="Picture 4"/>
+                    <pic:cNvPicPr>
+                      <a:picLocks noChangeAspect="1" noChangeArrowheads="1"/>
+                    </pic:cNvPicPr>
+                  </pic:nvPicPr>
+                  <pic:blipFill>
+                    <a:blip r:embed="rId11">
+                      <a:extLst>
+                        <a:ext uri="{28A0092B-C50C-407E-A947-70E740481C1C}">
+                          <a14:useLocalDpi xmlns:a14="http://schemas.microsoft.com/office/drawing/2010/main" val="0"/>
+                        </a:ext>
+                      </a:extLst>
+                    </a:blip>
+                    <a:srcRect/>
+                    <a:stretch>
+                      <a:fillRect/>
+                    </a:stretch>
+                  </pic:blipFill>
+                  <pic:spPr bwMode="auto">
+                    <a:xfrm>
+                      <a:off x="0" y="0"/>
+                      <a:ext cx="5445760" cy="3411855"/>
+                    </a:xfrm>
+                    <a:prstGeom prst="rect">
+                      <a:avLst/>
+                    </a:prstGeom>
+                    <a:noFill/>
+                    <a:ln>
+                      <a:noFill/>
+                    </a:ln>
+                  </pic:spPr>
+                </pic:pic>
+              </a:graphicData>
+            </a:graphic>
+          </wp:inline>
+        </w:drawing>
+      </w:r>
+    </w:p>
+    <w:p>
+      <w:pPr>
+        <w:tabs>
+          <w:tab w:val="center" w:pos="4890"/>
+        </w:tabs>
+        <w:spacing w:after="0" w:line="360" w:lineRule="auto"/>
+        <w:ind w:firstLine="709"/>
+        <w:jc w:val="both"/>
+        <w:rPr>
+          <w:rFonts w:ascii="Arial" w:eastAsia="Times New Roman" w:hAnsi="Arial" w:cs="Arial"/>
+          <w:color w:val="000000"/>
+          <w:kern w:val="0"/>
+          <w14:ligatures w14:val="none"/>
+        </w:rPr>
+      </w:pPr>
+    </w:p>
+    <w:p>
+      <w:pPr>
+        <w:tabs>
+          <w:tab w:val="center" w:pos="4890"/>
+        </w:tabs>
+        <w:spacing w:after="0" w:line="360" w:lineRule="auto"/>
+        <w:ind w:firstLine="709"/>
+        <w:jc w:val="both"/>
+        <w:rPr>
+          <w:rFonts w:ascii="Arial" w:eastAsia="Times New Roman" w:hAnsi="Arial" w:cs="Arial"/>
+          <w:color w:val="000000"/>
+          <w:kern w:val="0"/>
+          <w14:ligatures w14:val="none"/>
+        </w:rPr>
+      </w:pPr>
+      <w:r>
+        <w:rPr>
+          <w:rFonts w:ascii="Arial" w:eastAsia="Times New Roman" w:hAnsi="Arial" w:cs="Arial"/>
+          <w:color w:val="000000"/>
+          <w:kern w:val="0"/>
+          <w14:ligatures w14:val="none"/>
+        </w:rPr>
+        <w:t>Na página de login existe a opção “</w:t>
+      </w:r>
+      <w:r>
+        <w:rPr>
+          <w:rFonts w:ascii="Arial" w:eastAsia="Times New Roman" w:hAnsi="Arial" w:cs="Arial"/>
+          <w:b/>
+          <w:bCs/>
+          <w:color w:val="000000"/>
+          <w:kern w:val="0"/>
+          <w14:ligatures w14:val="none"/>
+        </w:rPr>
+        <w:t>Criar uma conta</w:t>
+      </w:r>
+      <w:r>
+        <w:rPr>
+          <w:rFonts w:ascii="Arial" w:eastAsia="Times New Roman" w:hAnsi="Arial" w:cs="Arial"/>
+          <w:color w:val="000000"/>
+          <w:kern w:val="0"/>
+          <w14:ligatures w14:val="none"/>
+        </w:rPr>
+        <w:t>”</w:t>
+      </w:r>
+      <w:r>
+        <w:rPr>
+          <w:rFonts w:ascii="Arial" w:eastAsia="Times New Roman" w:hAnsi="Arial" w:cs="Arial"/>
+          <w:color w:val="000000"/>
+          <w:kern w:val="0"/>
+          <w14:ligatures w14:val="none"/>
+        </w:rPr>
+        <w:t>, ao clicar nela o usuário será redirecionado para a página de cadastro. Nela existem os campos de nome, função, unidade, e-mail e senha. O “</w:t>
+      </w:r>
+      <w:r>
+        <w:rPr>
+          <w:rFonts w:ascii="Arial" w:eastAsia="Times New Roman" w:hAnsi="Arial" w:cs="Arial"/>
+          <w:b/>
+          <w:bCs/>
+          <w:color w:val="000000"/>
+          <w:kern w:val="0"/>
+          <w14:ligatures w14:val="none"/>
+        </w:rPr>
+        <w:t>nome</w:t>
+      </w:r>
+      <w:r>
+        <w:rPr>
+          <w:rFonts w:ascii="Arial" w:eastAsia="Times New Roman" w:hAnsi="Arial" w:cs="Arial"/>
+          <w:color w:val="000000"/>
+          <w:kern w:val="0"/>
+          <w14:ligatures w14:val="none"/>
+        </w:rPr>
+        <w:t>” será o nome do usuário, “</w:t>
+      </w:r>
+      <w:r>
+        <w:rPr>
+          <w:rFonts w:ascii="Arial" w:eastAsia="Times New Roman" w:hAnsi="Arial" w:cs="Arial"/>
+          <w:b/>
+          <w:bCs/>
+          <w:color w:val="000000"/>
+          <w:kern w:val="0"/>
+          <w14:ligatures w14:val="none"/>
+        </w:rPr>
+        <w:t>função</w:t>
+      </w:r>
+      <w:r>
+        <w:rPr>
+          <w:rFonts w:ascii="Arial" w:eastAsia="Times New Roman" w:hAnsi="Arial" w:cs="Arial"/>
+          <w:b/>
+          <w:bCs/>
+          <w:color w:val="000000"/>
+          <w:kern w:val="0"/>
+          <w14:ligatures w14:val="none"/>
+        </w:rPr>
+        <w:t xml:space="preserve">” </w:t>
+      </w:r>
+      <w:r>
+        <w:rPr>
+          <w:rFonts w:ascii="Arial" w:eastAsia="Times New Roman" w:hAnsi="Arial" w:cs="Arial"/>
+          <w:color w:val="000000"/>
+          <w:kern w:val="0"/>
+          <w14:ligatures w14:val="none"/>
+        </w:rPr>
+        <w:t>serve para designar se o novo cadastro será um “</w:t>
+      </w:r>
+      <w:r>
+        <w:rPr>
+          <w:rFonts w:ascii="Arial" w:eastAsia="Times New Roman" w:hAnsi="Arial" w:cs="Arial"/>
+          <w:b/>
+          <w:bCs/>
+          <w:color w:val="000000"/>
+          <w:kern w:val="0"/>
+          <w14:ligatures w14:val="none"/>
+        </w:rPr>
+        <w:t>administrador</w:t>
+      </w:r>
+      <w:r>
+        <w:rPr>
+          <w:rFonts w:ascii="Arial" w:eastAsia="Times New Roman" w:hAnsi="Arial" w:cs="Arial"/>
+          <w:color w:val="000000"/>
+          <w:kern w:val="0"/>
+          <w14:ligatures w14:val="none"/>
+        </w:rPr>
+        <w:t>” ou “</w:t>
+      </w:r>
+      <w:r>
+        <w:rPr>
+          <w:rFonts w:ascii="Arial" w:eastAsia="Times New Roman" w:hAnsi="Arial" w:cs="Arial"/>
+          <w:b/>
+          <w:bCs/>
+          <w:color w:val="000000"/>
+          <w:kern w:val="0"/>
+          <w14:ligatures w14:val="none"/>
+        </w:rPr>
+        <w:t>visitante</w:t>
+      </w:r>
+      <w:r>
+        <w:rPr>
+          <w:rFonts w:ascii="Arial" w:eastAsia="Times New Roman" w:hAnsi="Arial" w:cs="Arial"/>
+          <w:color w:val="000000"/>
+          <w:kern w:val="0"/>
+          <w14:ligatures w14:val="none"/>
+        </w:rPr>
+        <w:t>”, “</w:t>
+      </w:r>
+      <w:r>
+        <w:rPr>
+          <w:rFonts w:ascii="Arial" w:eastAsia="Times New Roman" w:hAnsi="Arial" w:cs="Arial"/>
+          <w:b/>
+          <w:bCs/>
+          <w:color w:val="000000"/>
+          <w:kern w:val="0"/>
+          <w14:ligatures w14:val="none"/>
+        </w:rPr>
+        <w:t>unidade</w:t>
+      </w:r>
+      <w:r>
+        <w:rPr>
+          <w:rFonts w:ascii="Arial" w:eastAsia="Times New Roman" w:hAnsi="Arial" w:cs="Arial"/>
+          <w:color w:val="000000"/>
+          <w:kern w:val="0"/>
+          <w14:ligatures w14:val="none"/>
+        </w:rPr>
+        <w:t>” é responsável por designar a “</w:t>
+      </w:r>
+      <w:r>
+        <w:rPr>
+          <w:rFonts w:ascii="Arial" w:eastAsia="Times New Roman" w:hAnsi="Arial" w:cs="Arial"/>
+          <w:b/>
+          <w:bCs/>
+          <w:color w:val="000000"/>
+          <w:kern w:val="0"/>
+          <w14:ligatures w14:val="none"/>
+        </w:rPr>
+        <w:t>H</w:t>
+      </w:r>
+      <w:r>
+        <w:rPr>
+          <w:rFonts w:ascii="Arial" w:eastAsia="Times New Roman" w:hAnsi="Arial" w:cs="Arial"/>
+          <w:b/>
+          <w:bCs/>
+          <w:color w:val="000000"/>
+          <w:kern w:val="0"/>
+          <w14:ligatures w14:val="none"/>
+        </w:rPr>
+        <w:t>omepage</w:t>
+      </w:r>
+      <w:r>
+        <w:rPr>
+          <w:rFonts w:ascii="Arial" w:eastAsia="Times New Roman" w:hAnsi="Arial" w:cs="Arial"/>
+          <w:color w:val="000000"/>
+          <w:kern w:val="0"/>
+          <w14:ligatures w14:val="none"/>
+        </w:rPr>
+        <w:t>” de qual escola a conta será redirecionada quando fizer o login no sistema, o “</w:t>
+      </w:r>
+      <w:r>
+        <w:rPr>
+          <w:rFonts w:ascii="Arial" w:eastAsia="Times New Roman" w:hAnsi="Arial" w:cs="Arial"/>
+          <w:b/>
+          <w:bCs/>
+          <w:color w:val="000000"/>
+          <w:kern w:val="0"/>
+          <w14:ligatures w14:val="none"/>
+        </w:rPr>
+        <w:t>e-mail</w:t>
+      </w:r>
+      <w:r>
+        <w:rPr>
+          <w:rFonts w:ascii="Arial" w:eastAsia="Times New Roman" w:hAnsi="Arial" w:cs="Arial"/>
+          <w:color w:val="000000"/>
+          <w:kern w:val="0"/>
+          <w14:ligatures w14:val="none"/>
+        </w:rPr>
+        <w:t>” e “</w:t>
+      </w:r>
+      <w:r>
+        <w:rPr>
+          <w:rFonts w:ascii="Arial" w:eastAsia="Times New Roman" w:hAnsi="Arial" w:cs="Arial"/>
+          <w:b/>
+          <w:bCs/>
+          <w:color w:val="000000"/>
+          <w:kern w:val="0"/>
+          <w14:ligatures w14:val="none"/>
+        </w:rPr>
+        <w:t>senha</w:t>
+      </w:r>
+      <w:r>
+        <w:rPr>
+          <w:rFonts w:ascii="Arial" w:eastAsia="Times New Roman" w:hAnsi="Arial" w:cs="Arial"/>
+          <w:color w:val="000000"/>
+          <w:kern w:val="0"/>
+          <w14:ligatures w14:val="none"/>
+        </w:rPr>
+        <w:t>” são os principais dados para o login da plataforma.</w:t>
+      </w:r>
+    </w:p>
+    <w:p>
+      <w:pPr>
+        <w:tabs>
+          <w:tab w:val="center" w:pos="4890"/>
+        </w:tabs>
+        <w:spacing w:after="0" w:line="360" w:lineRule="auto"/>
+        <w:ind w:firstLine="709"/>
+        <w:jc w:val="both"/>
+        <w:rPr>
+          <w:rFonts w:ascii="Arial" w:eastAsia="Times New Roman" w:hAnsi="Arial" w:cs="Arial"/>
+          <w:color w:val="000000"/>
+          <w:kern w:val="0"/>
+          <w14:ligatures w14:val="none"/>
+        </w:rPr>
+      </w:pPr>
+      <w:r>
+        <w:rPr>
+          <w:rFonts w:ascii="Arial" w:eastAsia="Times New Roman" w:hAnsi="Arial" w:cs="Arial"/>
+          <w:color w:val="000000"/>
+          <w:kern w:val="0"/>
+          <w14:ligatures w14:val="none"/>
+        </w:rPr>
+        <w:t>Se o usuário colocar dados válidos em cada campo</w:t>
+      </w:r>
+      <w:r>
+        <w:rPr>
+          <w:rFonts w:ascii="Arial" w:eastAsia="Times New Roman" w:hAnsi="Arial" w:cs="Arial"/>
+          <w:color w:val="000000"/>
+          <w:kern w:val="0"/>
+          <w14:ligatures w14:val="none"/>
+        </w:rPr>
+        <w:t xml:space="preserve"> e apertar em “</w:t>
+      </w:r>
+      <w:r>
+        <w:rPr>
+          <w:rFonts w:ascii="Arial" w:eastAsia="Times New Roman" w:hAnsi="Arial" w:cs="Arial"/>
+          <w:b/>
+          <w:bCs/>
+          <w:color w:val="000000"/>
+          <w:kern w:val="0"/>
+          <w14:ligatures w14:val="none"/>
+        </w:rPr>
+        <w:t>Cadastrar usuário</w:t>
+      </w:r>
+      <w:r>
+        <w:rPr>
+          <w:rFonts w:ascii="Arial" w:eastAsia="Times New Roman" w:hAnsi="Arial" w:cs="Arial"/>
+          <w:color w:val="000000"/>
+          <w:kern w:val="0"/>
+          <w14:ligatures w14:val="none"/>
+        </w:rPr>
+        <w:t>” uma nova conta será criada no sistema e o usuário será redirecionado para a tela de login. Caso contrário, o próprio sistema acusará a invalidez dos dados através de avisos na tela como “</w:t>
+      </w:r>
+      <w:r>
+        <w:rPr>
+          <w:rFonts w:ascii="Arial" w:eastAsia="Times New Roman" w:hAnsi="Arial" w:cs="Arial"/>
+          <w:b/>
+          <w:bCs/>
+          <w:color w:val="000000"/>
+          <w:kern w:val="0"/>
+          <w14:ligatures w14:val="none"/>
+        </w:rPr>
+        <w:t>Email inválido</w:t>
+      </w:r>
+      <w:r>
+        <w:rPr>
+          <w:rFonts w:ascii="Arial" w:eastAsia="Times New Roman" w:hAnsi="Arial" w:cs="Arial"/>
+          <w:color w:val="000000"/>
+          <w:kern w:val="0"/>
+          <w14:ligatures w14:val="none"/>
+        </w:rPr>
+        <w:t>” e “</w:t>
+      </w:r>
+      <w:r>
+        <w:rPr>
+          <w:rFonts w:ascii="Arial" w:eastAsia="Times New Roman" w:hAnsi="Arial" w:cs="Arial"/>
+          <w:b/>
+          <w:bCs/>
+          <w:color w:val="000000"/>
+          <w:kern w:val="0"/>
+          <w14:ligatures w14:val="none"/>
+        </w:rPr>
+        <w:t>Senha com menos de 8 caracteres</w:t>
+      </w:r>
+      <w:r>
+        <w:rPr>
+          <w:rFonts w:ascii="Arial" w:eastAsia="Times New Roman" w:hAnsi="Arial" w:cs="Arial"/>
+          <w:color w:val="000000"/>
+          <w:kern w:val="0"/>
+          <w14:ligatures w14:val="none"/>
+        </w:rPr>
+        <w:t>”, cabendo ao usuário consertar as informações erradas.</w:t>
+      </w:r>
+    </w:p>
+    <w:p>
+      <w:pPr>
+        <w:tabs>
+          <w:tab w:val="center" w:pos="4890"/>
+        </w:tabs>
+        <w:spacing w:after="0" w:line="360" w:lineRule="auto"/>
+        <w:ind w:firstLine="709"/>
+        <w:jc w:val="both"/>
+        <w:rPr>
+          <w:rFonts w:ascii="Arial" w:eastAsia="Times New Roman" w:hAnsi="Arial" w:cs="Arial"/>
+          <w:color w:val="000000"/>
+          <w:kern w:val="0"/>
+          <w14:ligatures w14:val="none"/>
+        </w:rPr>
+      </w:pPr>
+      <w:r>
+        <w:rPr>
+          <w:rFonts w:ascii="Arial" w:eastAsia="Times New Roman" w:hAnsi="Arial" w:cs="Arial"/>
+          <w:color w:val="000000"/>
+          <w:kern w:val="0"/>
+          <w14:ligatures w14:val="none"/>
+        </w:rPr>
+        <w:t>Os principais erros que podem ocorrer durante a operação é a inserção de dados inválidos e como já foi dito o sistema notificará o usuário sobre a invalidez desses dados e o usuário deverá consertar eles; além disso é possível que tentem cadastrar um usuário que já esteja no sistema, nesse caso basta verificar como administrador a página “</w:t>
+      </w:r>
+      <w:r>
+        <w:rPr>
+          <w:rFonts w:ascii="Arial" w:eastAsia="Times New Roman" w:hAnsi="Arial" w:cs="Arial"/>
+          <w:b/>
+          <w:bCs/>
+          <w:color w:val="000000"/>
+          <w:kern w:val="0"/>
+          <w14:ligatures w14:val="none"/>
+        </w:rPr>
+        <w:t>Usuários</w:t>
+      </w:r>
+      <w:r>
+        <w:rPr>
+          <w:rFonts w:ascii="Arial" w:eastAsia="Times New Roman" w:hAnsi="Arial" w:cs="Arial"/>
+          <w:color w:val="000000"/>
+          <w:kern w:val="0"/>
+          <w14:ligatures w14:val="none"/>
+        </w:rPr>
+        <w:t>” para visualizar tal informação.</w:t>
+      </w:r>
+      <w:r>
+        <w:rPr>
+          <w:rFonts w:ascii="Arial" w:eastAsia="Times New Roman" w:hAnsi="Arial" w:cs="Arial"/>
+          <w:color w:val="000000"/>
+          <w:kern w:val="0"/>
+          <w14:ligatures w14:val="none"/>
+        </w:rPr>
+        <w:br w:type="page"/>
+      </w:r>
+    </w:p>
+    <w:p>
+      <w:pPr>
+        <w:tabs>
+          <w:tab w:val="center" w:pos="4890"/>
+        </w:tabs>
+        <w:spacing w:after="0" w:line="360" w:lineRule="auto"/>
+        <w:ind w:firstLine="709"/>
+        <w:jc w:val="both"/>
+        <w:rPr>
+          <w:rFonts w:ascii="Arial" w:eastAsia="Times New Roman" w:hAnsi="Arial" w:cs="Arial"/>
+          <w:color w:val="000000"/>
+          <w:kern w:val="0"/>
+          <w14:ligatures w14:val="none"/>
+        </w:rPr>
+      </w:pPr>
+      <w:r>
+        <w:rPr>
+          <w:rFonts w:ascii="Arial" w:eastAsia="Times New Roman" w:hAnsi="Arial" w:cs="Arial"/>
+          <w:color w:val="000000"/>
+          <w:kern w:val="0"/>
+          <w14:ligatures w14:val="none"/>
+        </w:rPr>
+        <w:lastRenderedPageBreak/>
+        <w:t>5.4 Editar página</w:t>
+      </w:r>
+    </w:p>
+    <w:p>
+      <w:pPr>
+        <w:tabs>
+          <w:tab w:val="center" w:pos="4890"/>
+        </w:tabs>
+        <w:spacing w:after="0" w:line="360" w:lineRule="auto"/>
+        <w:ind w:firstLine="709"/>
+        <w:jc w:val="both"/>
+        <w:rPr>
+          <w:rFonts w:ascii="Arial" w:eastAsia="Times New Roman" w:hAnsi="Arial" w:cs="Arial"/>
+          <w:color w:val="000000"/>
+          <w:kern w:val="0"/>
+          <w14:ligatures w14:val="none"/>
+        </w:rPr>
+      </w:pPr>
+    </w:p>
+    <w:p>
+      <w:pPr>
+        <w:tabs>
+          <w:tab w:val="center" w:pos="4890"/>
+        </w:tabs>
+        <w:spacing w:after="0" w:line="360" w:lineRule="auto"/>
+        <w:ind w:firstLine="709"/>
+        <w:jc w:val="both"/>
+        <w:rPr>
+          <w:rFonts w:ascii="Arial" w:eastAsia="Times New Roman" w:hAnsi="Arial" w:cs="Arial"/>
+          <w:color w:val="000000"/>
+          <w:kern w:val="0"/>
+          <w14:ligatures w14:val="none"/>
+        </w:rPr>
+      </w:pPr>
+    </w:p>
+    <w:p>
+      <w:pPr>
+        <w:spacing w:after="0" w:line="360" w:lineRule="auto"/>
+        <w:ind w:firstLine="709"/>
+        <w:jc w:val="both"/>
+        <w:rPr>
+          <w:rFonts w:ascii="Arial" w:eastAsia="Times New Roman" w:hAnsi="Arial" w:cs="Arial"/>
+          <w:color w:val="000000"/>
+          <w:kern w:val="0"/>
+          <w14:ligatures w14:val="none"/>
+        </w:rPr>
+      </w:pPr>
+    </w:p>
+    <w:p>
+      <w:pPr>
+        <w:spacing w:after="0" w:line="360" w:lineRule="auto"/>
+        <w:jc w:val="both"/>
+        <w:rPr>
+          <w:rFonts w:ascii="Arial" w:eastAsia="Times New Roman" w:hAnsi="Arial" w:cs="Arial"/>
+          <w:color w:val="000000"/>
+          <w:kern w:val="0"/>
+          <w14:ligatures w14:val="none"/>
+        </w:rPr>
+      </w:pPr>
     </w:p>
     <w:p>
       <w:pPr>

</xml_diff>